<commit_message>
add CYK algorithm for check in CFG_2_SAT algorithm. add Dimacs format saving of the algorithm solutions. add benchmark  file for SAT solver types.
</commit_message>
<xml_diff>
--- a/Jozef_Nyitrai_DP.docx
+++ b/Jozef_Nyitrai_DP.docx
@@ -647,7 +647,7 @@
         </w:rPr>
         <w:lastRenderedPageBreak/>
         <w:drawing>
-          <wp:anchor distT="0" distB="0" distL="114300" distR="114300" simplePos="0" relativeHeight="251660288" behindDoc="1" locked="0" layoutInCell="1" allowOverlap="1" wp14:anchorId="07172C93" wp14:editId="79C9D590">
+          <wp:anchor distT="0" distB="0" distL="114300" distR="114300" simplePos="0" relativeHeight="251660288" behindDoc="1" locked="0" layoutInCell="1" allowOverlap="1" wp14:anchorId="07172C93" wp14:editId="1C0EED85">
             <wp:simplePos x="0" y="0"/>
             <wp:positionH relativeFrom="page">
               <wp:posOffset>0</wp:posOffset>
@@ -732,7 +732,7 @@
         </w:rPr>
         <w:lastRenderedPageBreak/>
         <w:drawing>
-          <wp:anchor distT="0" distB="0" distL="114300" distR="114300" simplePos="0" relativeHeight="251661312" behindDoc="1" locked="0" layoutInCell="1" allowOverlap="1" wp14:anchorId="710A51C6" wp14:editId="3AA8D395">
+          <wp:anchor distT="0" distB="0" distL="114300" distR="114300" simplePos="0" relativeHeight="251661312" behindDoc="1" locked="0" layoutInCell="1" allowOverlap="1" wp14:anchorId="710A51C6" wp14:editId="524E2C86">
             <wp:simplePos x="0" y="0"/>
             <wp:positionH relativeFrom="page">
               <wp:posOffset>0</wp:posOffset>
@@ -9509,25 +9509,51 @@
       <w:r>
         <w:t xml:space="preserve">Obrázok </w:t>
       </w:r>
-      <w:fldSimple w:instr=" STYLEREF 1 \s ">
-        <w:r>
-          <w:rPr>
-            <w:noProof/>
-          </w:rPr>
-          <w:t>1</w:t>
-        </w:r>
-      </w:fldSimple>
+      <w:r>
+        <w:fldChar w:fldCharType="begin"/>
+      </w:r>
+      <w:r>
+        <w:instrText xml:space="preserve"> STYLEREF 1 \s </w:instrText>
+      </w:r>
+      <w:r>
+        <w:fldChar w:fldCharType="separate"/>
+      </w:r>
+      <w:r>
+        <w:rPr>
+          <w:noProof/>
+        </w:rPr>
+        <w:t>1</w:t>
+      </w:r>
+      <w:r>
+        <w:rPr>
+          <w:noProof/>
+        </w:rPr>
+        <w:fldChar w:fldCharType="end"/>
+      </w:r>
       <w:r>
         <w:noBreakHyphen/>
       </w:r>
-      <w:fldSimple w:instr=" SEQ Obrázok \* ARABIC \s 1 ">
-        <w:r>
-          <w:rPr>
-            <w:noProof/>
-          </w:rPr>
-          <w:t>1</w:t>
-        </w:r>
-      </w:fldSimple>
+      <w:r>
+        <w:fldChar w:fldCharType="begin"/>
+      </w:r>
+      <w:r>
+        <w:instrText xml:space="preserve"> SEQ Obrázok \* ARABIC \s 1 </w:instrText>
+      </w:r>
+      <w:r>
+        <w:fldChar w:fldCharType="separate"/>
+      </w:r>
+      <w:r>
+        <w:rPr>
+          <w:noProof/>
+        </w:rPr>
+        <w:t>1</w:t>
+      </w:r>
+      <w:r>
+        <w:rPr>
+          <w:noProof/>
+        </w:rPr>
+        <w:fldChar w:fldCharType="end"/>
+      </w:r>
       <w:r>
         <w:t xml:space="preserve"> </w:t>
       </w:r>
@@ -13728,6 +13754,8 @@
       <w:r>
         <w:rPr>
           <w:rStyle w:val="Vrazn"/>
+          <w:b w:val="0"/>
+          <w:bCs w:val="0"/>
         </w:rPr>
         <w:t>umelej inteligencie</w:t>
       </w:r>
@@ -13738,7 +13766,7 @@
         <w:fldChar w:fldCharType="begin" w:fldLock="1"/>
       </w:r>
       <w:r>
-        <w:instrText>ADDIN CSL_CITATION {"citationItems":[{"id":"ITEM-1","itemData":{"ISBN":"160750376X","abstract":"A collection of papers on various theoretical and practical aspects of SAT solving. It is suitable for students and researchers. Title page; Contents; Part I. Theory and Algorithms; Chapter 1. A History of Satisfiability; Chapter 2. CNF Encodings; Chapter 3. Complete Algorithms; Chapter 4. CDCL Solvers; Chapter 5. Look-Ahead Based SAT Solvers; Chapter 6. Incomplete Algorithms; Chapter 7. Fundaments of Branching Heuristics; Chapter 8. Random Satisfiability; Chapter 9. Exploiting Runtime Variation in Complete Solvers; Chapter 10. Symmetry and Satisfiability; Chapter 11. Minimal Unsatisfiability and Autarkies; Chapter 12. Worst-Case Upper Bounds; Chapter 13. Fixed-Parameter Tractability.","author":[{"dropping-particle":"","family":"Biere","given":"Armin.","non-dropping-particle":"","parse-names":false,"suffix":""},{"dropping-particle":"","family":"Walsh","given":"Toby","non-dropping-particle":"","parse-names":false,"suffix":""},{"dropping-particle":"","family":"Maaren","given":"Hans","non-dropping-particle":"van","parse-names":false,"suffix":""}],"id":"ITEM-1","issued":{"date-parts":[["2009"]]},"number-of-pages":"966","publisher":"IOS Press","title":"Handbook of satisfiability","type":"book"},"uris":["http://www.mendeley.com/documents/?uuid=c082b2f8-2d01-35fb-85b1-38c183ddeafc"]}],"mendeley":{"formattedCitation":"&lt;span style=\"baseline\"&gt;[8]&lt;/span&gt;","plainTextFormattedCitation":"[8]"},"properties":{"noteIndex":0},"schema":"https://github.com/citation-style-language/schema/raw/master/csl-citation.json"}</w:instrText>
+        <w:instrText>ADDIN CSL_CITATION {"citationItems":[{"id":"ITEM-1","itemData":{"ISBN":"160750376X","abstract":"A collection of papers on various theoretical and practical aspects of SAT solving. It is suitable for students and researchers. Title page; Contents; Part I. Theory and Algorithms; Chapter 1. A History of Satisfiability; Chapter 2. CNF Encodings; Chapter 3. Complete Algorithms; Chapter 4. CDCL Solvers; Chapter 5. Look-Ahead Based SAT Solvers; Chapter 6. Incomplete Algorithms; Chapter 7. Fundaments of Branching Heuristics; Chapter 8. Random Satisfiability; Chapter 9. Exploiting Runtime Variation in Complete Solvers; Chapter 10. Symmetry and Satisfiability; Chapter 11. Minimal Unsatisfiability and Autarkies; Chapter 12. Worst-Case Upper Bounds; Chapter 13. Fixed-Parameter Tractability.","author":[{"dropping-particle":"","family":"Biere","given":"Armin.","non-dropping-particle":"","parse-names":false,"suffix":""},{"dropping-particle":"","family":"Walsh","given":"Toby","non-dropping-particle":"","parse-names":false,"suffix":""},{"dropping-particle":"","family":"Maaren","given":"Hans","non-dropping-particle":"van","parse-names":false,"suffix":""}],"id":"ITEM-1","issued":{"date-parts":[["2009"]]},"number-of-pages":"966","publisher":"IOS Press","title":"Handbook of satisfiability","type":"book"},"uris":["http://www.mendeley.com/documents/?uuid=c082b2f8-2d01-35fb-85b1-38c183ddeafc"]}],"mendeley":{"formattedCitation":"&lt;span style=\"baseline\"&gt;[8]&lt;/span&gt;","plainTextFormattedCitation":"[8]","previouslyFormattedCitation":"&lt;span style=\"baseline\"&gt;[8]&lt;/span&gt;"},"properties":{"noteIndex":0},"schema":"https://github.com/citation-style-language/schema/raw/master/csl-citation.json"}</w:instrText>
       </w:r>
       <w:r>
         <w:fldChar w:fldCharType="separate"/>
@@ -13765,7 +13793,6 @@
           <w:lang w:eastAsia="sk-SK"/>
         </w:rPr>
       </w:pPr>
-      <w:bookmarkStart w:id="47" w:name="_Toc224126536"/>
       <w:r>
         <w:rPr>
           <w:rFonts w:eastAsia="Times New Roman"/>
@@ -13774,12 +13801,2023 @@
         <w:lastRenderedPageBreak/>
         <w:t>Pojem redukcie a jej význam</w:t>
       </w:r>
-      <w:bookmarkEnd w:id="47"/>
-    </w:p>
-    <w:p>
-      <w:pPr>
-        <w:spacing w:before="100" w:beforeAutospacing="1" w:after="100" w:afterAutospacing="1" w:line="240" w:lineRule="auto"/>
-        <w:ind w:firstLine="0"/>
+    </w:p>
+    <w:p>
+      <w:pPr>
+        <w:rPr>
+          <w:rFonts w:eastAsia="Times New Roman"/>
+          <w:lang w:eastAsia="sk-SK"/>
+        </w:rPr>
+      </w:pPr>
+      <w:r>
+        <w:rPr>
+          <w:rFonts w:eastAsia="Times New Roman"/>
+          <w:lang w:eastAsia="sk-SK"/>
+        </w:rPr>
+        <w:t>Redukcia problémov predstavuje základný nástroj teoretickej informatiky, ktorý umožňuje porovnávať zložitosť rôznych výpočtových problémov a prenášať riešenia medzi nimi. V tejto kapitole definujeme pojem redukcie, vysvetľujeme jej význam a poukazujeme na dôvody, prečo je redukcia na SAT-problém prakticky aj teoreticky výhodná.</w:t>
+      </w:r>
+    </w:p>
+    <w:p>
+      <w:pPr>
+        <w:pStyle w:val="Nadpis2"/>
+        <w:spacing w:before="480" w:after="240"/>
+        <w:rPr>
+          <w:rFonts w:eastAsia="Times New Roman"/>
+          <w:lang w:eastAsia="sk-SK"/>
+        </w:rPr>
+      </w:pPr>
+      <w:r>
+        <w:rPr>
+          <w:rFonts w:eastAsia="Times New Roman"/>
+          <w:lang w:eastAsia="sk-SK"/>
+        </w:rPr>
+        <w:t>Definícia redukcie problémov</w:t>
+      </w:r>
+    </w:p>
+    <w:p>
+      <w:pPr>
+        <w:rPr>
+          <w:rFonts w:eastAsia="Times New Roman"/>
+          <w:lang w:eastAsia="sk-SK"/>
+        </w:rPr>
+      </w:pPr>
+      <w:r>
+        <w:rPr>
+          <w:rFonts w:eastAsia="Times New Roman"/>
+          <w:lang w:eastAsia="sk-SK"/>
+        </w:rPr>
+        <w:t xml:space="preserve">Redukciu problémov chápeme ako transformáciu jedného problému na iný problém takým spôsobom, že riešenie druhého problému umožňuje vyriešiť pôvodný problém. Formálne hovoríme, že problém </w:t>
+      </w:r>
+      <w:r>
+        <w:rPr>
+          <w:rFonts w:eastAsia="Times New Roman"/>
+          <w:i/>
+          <w:iCs/>
+          <w:lang w:eastAsia="sk-SK"/>
+        </w:rPr>
+        <w:t>A</w:t>
+      </w:r>
+      <w:r>
+        <w:rPr>
+          <w:rFonts w:eastAsia="Times New Roman"/>
+          <w:lang w:eastAsia="sk-SK"/>
+        </w:rPr>
+        <w:t xml:space="preserve"> je redukovateľný na problém </w:t>
+      </w:r>
+      <w:r>
+        <w:rPr>
+          <w:rFonts w:eastAsia="Times New Roman"/>
+          <w:i/>
+          <w:iCs/>
+          <w:lang w:eastAsia="sk-SK"/>
+        </w:rPr>
+        <w:t>B</w:t>
+      </w:r>
+      <w:r>
+        <w:rPr>
+          <w:rFonts w:eastAsia="Times New Roman"/>
+          <w:lang w:eastAsia="sk-SK"/>
+        </w:rPr>
+        <w:t xml:space="preserve">, ak existuje efektívny (typicky </w:t>
+      </w:r>
+      <w:proofErr w:type="spellStart"/>
+      <w:r>
+        <w:rPr>
+          <w:rFonts w:eastAsia="Times New Roman"/>
+          <w:lang w:eastAsia="sk-SK"/>
+        </w:rPr>
+        <w:t>polynomiálny</w:t>
+      </w:r>
+      <w:proofErr w:type="spellEnd"/>
+      <w:r>
+        <w:rPr>
+          <w:rFonts w:eastAsia="Times New Roman"/>
+          <w:lang w:eastAsia="sk-SK"/>
+        </w:rPr>
+        <w:t xml:space="preserve">) algoritmus, ktorý každú inštanciu problému </w:t>
+      </w:r>
+      <w:r>
+        <w:rPr>
+          <w:rFonts w:eastAsia="Times New Roman"/>
+          <w:i/>
+          <w:iCs/>
+          <w:lang w:eastAsia="sk-SK"/>
+        </w:rPr>
+        <w:t>A</w:t>
+      </w:r>
+      <w:r>
+        <w:rPr>
+          <w:rFonts w:eastAsia="Times New Roman"/>
+          <w:lang w:eastAsia="sk-SK"/>
+        </w:rPr>
+        <w:t xml:space="preserve"> prevedie na inštanciu problému </w:t>
+      </w:r>
+      <w:r>
+        <w:rPr>
+          <w:rFonts w:eastAsia="Times New Roman"/>
+          <w:i/>
+          <w:iCs/>
+          <w:lang w:eastAsia="sk-SK"/>
+        </w:rPr>
+        <w:t>B</w:t>
+      </w:r>
+      <w:r>
+        <w:rPr>
+          <w:rFonts w:eastAsia="Times New Roman"/>
+          <w:lang w:eastAsia="sk-SK"/>
+        </w:rPr>
+        <w:t xml:space="preserve"> tak, že odpoveď na problém </w:t>
+      </w:r>
+      <w:r>
+        <w:rPr>
+          <w:rFonts w:eastAsia="Times New Roman"/>
+          <w:i/>
+          <w:iCs/>
+          <w:lang w:eastAsia="sk-SK"/>
+        </w:rPr>
+        <w:t>B</w:t>
+      </w:r>
+      <w:r>
+        <w:rPr>
+          <w:rFonts w:eastAsia="Times New Roman"/>
+          <w:lang w:eastAsia="sk-SK"/>
+        </w:rPr>
+        <w:t xml:space="preserve"> zodpovedá odpovedi na problém </w:t>
+      </w:r>
+      <w:r>
+        <w:rPr>
+          <w:rFonts w:eastAsia="Times New Roman"/>
+          <w:i/>
+          <w:iCs/>
+          <w:lang w:eastAsia="sk-SK"/>
+        </w:rPr>
+        <w:t>A</w:t>
+      </w:r>
+      <w:r>
+        <w:rPr>
+          <w:rFonts w:eastAsia="Times New Roman"/>
+          <w:lang w:eastAsia="sk-SK"/>
+        </w:rPr>
+        <w:t xml:space="preserve"> </w:t>
+      </w:r>
+      <w:r>
+        <w:rPr>
+          <w:rFonts w:eastAsia="Times New Roman"/>
+          <w:lang w:eastAsia="sk-SK"/>
+        </w:rPr>
+        <w:fldChar w:fldCharType="begin" w:fldLock="1"/>
+      </w:r>
+      <w:r>
+        <w:rPr>
+          <w:rFonts w:eastAsia="Times New Roman"/>
+          <w:lang w:eastAsia="sk-SK"/>
+        </w:rPr>
+        <w:instrText>ADDIN CSL_CITATION {"citationItems":[{"id":"ITEM-1","itemData":{"ISBN":"113318779X","abstract":"Third edition. \"Gain a solid understanding of the fundamental mathematical properties of computer hardware, software, and applications with a blend of practical and philosophical coverage and mathematical treatments, including advanced theorems and proofs. This books comprehensive coverage makes it a valuable reference for studies in theoretical computing.\"-- Provided by publisher. Part 1: Automata and languages. 1. Regular languages ; 2. Context-free languages -- Part 2: Computability theory. 3. The Church-Turing thesis ; 4. Decidability ; 5. Reducibility ; 6. Advanced topics in computability theory -- Part 3: Complexity theory. 7. Time complexity ; 8. Space complexity ; 9. Intractability ; 10. Advanced topics in complexity theory.","author":[{"dropping-particle":"","family":"Sipser","given":"Michael.","non-dropping-particle":"","parse-names":false,"suffix":""}],"id":"ITEM-1","issued":{"date-parts":[["2013"]]},"number-of-pages":"458","publisher":"Cengage Learning","title":"Introduction to the theory of computation","type":"book"},"uris":["http://www.mendeley.com/documents/?uuid=cacb2ad3-5576-3199-81ae-daf9e8aa1644"]}],"mendeley":{"formattedCitation":"&lt;span style=\"baseline\"&gt;[2]&lt;/span&gt;","plainTextFormattedCitation":"[2]","previouslyFormattedCitation":"&lt;span style=\"baseline\"&gt;[2]&lt;/span&gt;"},"properties":{"noteIndex":0},"schema":"https://github.com/citation-style-language/schema/raw/master/csl-citation.json"}</w:instrText>
+      </w:r>
+      <w:r>
+        <w:rPr>
+          <w:rFonts w:eastAsia="Times New Roman"/>
+          <w:lang w:eastAsia="sk-SK"/>
+        </w:rPr>
+        <w:fldChar w:fldCharType="separate"/>
+      </w:r>
+      <w:r>
+        <w:rPr>
+          <w:rFonts w:eastAsia="Times New Roman"/>
+          <w:noProof/>
+          <w:lang w:eastAsia="sk-SK"/>
+        </w:rPr>
+        <w:t>[2]</w:t>
+      </w:r>
+      <w:r>
+        <w:rPr>
+          <w:rFonts w:eastAsia="Times New Roman"/>
+          <w:lang w:eastAsia="sk-SK"/>
+        </w:rPr>
+        <w:fldChar w:fldCharType="end"/>
+      </w:r>
+      <w:r>
+        <w:rPr>
+          <w:rFonts w:eastAsia="Times New Roman"/>
+          <w:lang w:eastAsia="sk-SK"/>
+        </w:rPr>
+        <w:t>.</w:t>
+      </w:r>
+    </w:p>
+    <w:p>
+      <w:pPr>
+        <w:rPr>
+          <w:rFonts w:eastAsia="Times New Roman"/>
+          <w:lang w:eastAsia="sk-SK"/>
+        </w:rPr>
+      </w:pPr>
+      <w:r>
+        <w:rPr>
+          <w:rFonts w:eastAsia="Times New Roman"/>
+          <w:lang w:eastAsia="sk-SK"/>
+        </w:rPr>
+        <w:t xml:space="preserve">Redukcie zohrávajú kľúčovú úlohu najmä v teórii výpočtovej zložitosti. Ako ukazuje Cookova veta, každý problém z triedy NP je možné v </w:t>
+      </w:r>
+      <w:proofErr w:type="spellStart"/>
+      <w:r>
+        <w:rPr>
+          <w:rFonts w:eastAsia="Times New Roman"/>
+          <w:lang w:eastAsia="sk-SK"/>
+        </w:rPr>
+        <w:t>polynomiálnom</w:t>
+      </w:r>
+      <w:proofErr w:type="spellEnd"/>
+      <w:r>
+        <w:rPr>
+          <w:rFonts w:eastAsia="Times New Roman"/>
+          <w:lang w:eastAsia="sk-SK"/>
+        </w:rPr>
+        <w:t xml:space="preserve"> čase redukovať na SAT-problém, čím sa SAT stáva centrálnym problémom tejto triedy </w:t>
+      </w:r>
+      <w:r>
+        <w:rPr>
+          <w:rFonts w:eastAsia="Times New Roman"/>
+          <w:lang w:eastAsia="sk-SK"/>
+        </w:rPr>
+        <w:fldChar w:fldCharType="begin" w:fldLock="1"/>
+      </w:r>
+      <w:r>
+        <w:rPr>
+          <w:rFonts w:eastAsia="Times New Roman"/>
+          <w:lang w:eastAsia="sk-SK"/>
+        </w:rPr>
+        <w:instrText>ADDIN CSL_CITATION {"citationItems":[{"id":"ITEM-1","itemData":{"author":[{"dropping-particle":"","family":"Cook","given":"Stephen A","non-dropping-particle":"","parse-names":false,"suffix":""}],"container-title":"Logic, automata, and computational complexity: The works of Stephen A. Cook","id":"ITEM-1","issued":{"date-parts":[["2023"]]},"page":"143-152","title":"The complexity of theorem-proving procedures","type":"chapter"},"uris":["http://www.mendeley.com/documents/?uuid=210ccae6-aaf3-3309-97f2-48466a578707"]}],"mendeley":{"formattedCitation":"&lt;span style=\"baseline\"&gt;[9]&lt;/span&gt;","plainTextFormattedCitation":"[9]","previouslyFormattedCitation":"&lt;span style=\"baseline\"&gt;[9]&lt;/span&gt;"},"properties":{"noteIndex":0},"schema":"https://github.com/citation-style-language/schema/raw/master/csl-citation.json"}</w:instrText>
+      </w:r>
+      <w:r>
+        <w:rPr>
+          <w:rFonts w:eastAsia="Times New Roman"/>
+          <w:lang w:eastAsia="sk-SK"/>
+        </w:rPr>
+        <w:fldChar w:fldCharType="separate"/>
+      </w:r>
+      <w:r>
+        <w:rPr>
+          <w:rFonts w:eastAsia="Times New Roman"/>
+          <w:noProof/>
+          <w:lang w:eastAsia="sk-SK"/>
+        </w:rPr>
+        <w:t>[9]</w:t>
+      </w:r>
+      <w:r>
+        <w:rPr>
+          <w:rFonts w:eastAsia="Times New Roman"/>
+          <w:lang w:eastAsia="sk-SK"/>
+        </w:rPr>
+        <w:fldChar w:fldCharType="end"/>
+      </w:r>
+      <w:r>
+        <w:rPr>
+          <w:rFonts w:eastAsia="Times New Roman"/>
+          <w:lang w:eastAsia="sk-SK"/>
+        </w:rPr>
+        <w:t>. Redukcie teda umožňujú klasifikovať problémy podľa ich náročnosti a identifikovať tzv. NP-úplné problémy.</w:t>
+      </w:r>
+    </w:p>
+    <w:p>
+      <w:pPr>
+        <w:pStyle w:val="Nadpis2"/>
+        <w:spacing w:before="480" w:after="240"/>
+        <w:rPr>
+          <w:rFonts w:eastAsia="Times New Roman"/>
+          <w:lang w:eastAsia="sk-SK"/>
+        </w:rPr>
+      </w:pPr>
+      <w:r>
+        <w:rPr>
+          <w:rFonts w:eastAsia="Times New Roman"/>
+          <w:lang w:eastAsia="sk-SK"/>
+        </w:rPr>
+        <w:t>Redukcie medzi rozhodovacími problémami</w:t>
+      </w:r>
+    </w:p>
+    <w:p>
+      <w:pPr>
+        <w:rPr>
+          <w:rFonts w:eastAsia="Times New Roman"/>
+          <w:lang w:eastAsia="sk-SK"/>
+        </w:rPr>
+      </w:pPr>
+      <w:r>
+        <w:rPr>
+          <w:rFonts w:eastAsia="Times New Roman"/>
+          <w:lang w:eastAsia="sk-SK"/>
+        </w:rPr>
+        <w:t xml:space="preserve">V kontexte tejto práce nás zaujímajú najmä redukcie medzi rozhodovacími problémami. Rozhodovací problém je taký problém, ktorého výstupom je odpoveď „áno“ alebo „nie“. </w:t>
+      </w:r>
+      <w:proofErr w:type="spellStart"/>
+      <w:r>
+        <w:rPr>
+          <w:rFonts w:eastAsia="Times New Roman"/>
+          <w:lang w:eastAsia="sk-SK"/>
+        </w:rPr>
+        <w:t>Parsovací</w:t>
+      </w:r>
+      <w:proofErr w:type="spellEnd"/>
+      <w:r>
+        <w:rPr>
+          <w:rFonts w:eastAsia="Times New Roman"/>
+          <w:lang w:eastAsia="sk-SK"/>
+        </w:rPr>
+        <w:t xml:space="preserve"> problém vo svojej základnej forme patrí práve do tejto kategórie, keďže sa pýtame, či daný reťazec patrí do jazyka generovaného gramatikou.</w:t>
+      </w:r>
+    </w:p>
+    <w:p>
+      <w:pPr>
+        <w:rPr>
+          <w:rFonts w:eastAsia="Times New Roman"/>
+          <w:lang w:eastAsia="sk-SK"/>
+        </w:rPr>
+      </w:pPr>
+      <w:r>
+        <w:rPr>
+          <w:rFonts w:eastAsia="Times New Roman"/>
+          <w:lang w:eastAsia="sk-SK"/>
+        </w:rPr>
+        <w:t xml:space="preserve">Redukcia medzi rozhodovacími problémami zachováva pravdivostnú hodnotu odpovede. To znamená, že ak je pôvodná inštancia problému riešiteľná, potom aj transformovaná inštancia musí byť riešiteľná a naopak </w:t>
+      </w:r>
+      <w:r>
+        <w:rPr>
+          <w:rFonts w:eastAsia="Times New Roman"/>
+          <w:lang w:eastAsia="sk-SK"/>
+        </w:rPr>
+        <w:fldChar w:fldCharType="begin" w:fldLock="1"/>
+      </w:r>
+      <w:r>
+        <w:rPr>
+          <w:rFonts w:eastAsia="Times New Roman"/>
+          <w:lang w:eastAsia="sk-SK"/>
+        </w:rPr>
+        <w:instrText>ADDIN CSL_CITATION {"citationItems":[{"id":"ITEM-1","itemData":{"ISBN":"113318779X","abstract":"Third edition. \"Gain a solid understanding of the fundamental mathematical properties of computer hardware, software, and applications with a blend of practical and philosophical coverage and mathematical treatments, including advanced theorems and proofs. This books comprehensive coverage makes it a valuable reference for studies in theoretical computing.\"-- Provided by publisher. Part 1: Automata and languages. 1. Regular languages ; 2. Context-free languages -- Part 2: Computability theory. 3. The Church-Turing thesis ; 4. Decidability ; 5. Reducibility ; 6. Advanced topics in computability theory -- Part 3: Complexity theory. 7. Time complexity ; 8. Space complexity ; 9. Intractability ; 10. Advanced topics in complexity theory.","author":[{"dropping-particle":"","family":"Sipser","given":"Michael.","non-dropping-particle":"","parse-names":false,"suffix":""}],"id":"ITEM-1","issued":{"date-parts":[["2013"]]},"number-of-pages":"458","publisher":"Cengage Learning","title":"Introduction to the theory of computation","type":"book"},"uris":["http://www.mendeley.com/documents/?uuid=cacb2ad3-5576-3199-81ae-daf9e8aa1644"]}],"mendeley":{"formattedCitation":"&lt;span style=\"baseline\"&gt;[2]&lt;/span&gt;","plainTextFormattedCitation":"[2]","previouslyFormattedCitation":"&lt;span style=\"baseline\"&gt;[2]&lt;/span&gt;"},"properties":{"noteIndex":0},"schema":"https://github.com/citation-style-language/schema/raw/master/csl-citation.json"}</w:instrText>
+      </w:r>
+      <w:r>
+        <w:rPr>
+          <w:rFonts w:eastAsia="Times New Roman"/>
+          <w:lang w:eastAsia="sk-SK"/>
+        </w:rPr>
+        <w:fldChar w:fldCharType="separate"/>
+      </w:r>
+      <w:r>
+        <w:rPr>
+          <w:rFonts w:eastAsia="Times New Roman"/>
+          <w:noProof/>
+          <w:lang w:eastAsia="sk-SK"/>
+        </w:rPr>
+        <w:t>[2]</w:t>
+      </w:r>
+      <w:r>
+        <w:rPr>
+          <w:rFonts w:eastAsia="Times New Roman"/>
+          <w:lang w:eastAsia="sk-SK"/>
+        </w:rPr>
+        <w:fldChar w:fldCharType="end"/>
+      </w:r>
+      <w:r>
+        <w:rPr>
+          <w:rFonts w:eastAsia="Times New Roman"/>
+          <w:lang w:eastAsia="sk-SK"/>
+        </w:rPr>
+        <w:t>. Táto vlastnosť je kľúčová pri návrhu korektných redukčných postupov.</w:t>
+      </w:r>
+    </w:p>
+    <w:p>
+      <w:pPr>
+        <w:pStyle w:val="Nadpis2"/>
+        <w:spacing w:before="480" w:after="240"/>
+        <w:rPr>
+          <w:rFonts w:eastAsia="Times New Roman"/>
+          <w:lang w:eastAsia="sk-SK"/>
+        </w:rPr>
+      </w:pPr>
+      <w:r>
+        <w:rPr>
+          <w:rFonts w:eastAsia="Times New Roman"/>
+          <w:lang w:eastAsia="sk-SK"/>
+        </w:rPr>
+        <w:t>Dôvody redukcie na SAT</w:t>
+      </w:r>
+    </w:p>
+    <w:p>
+      <w:pPr>
+        <w:rPr>
+          <w:rFonts w:eastAsia="Times New Roman"/>
+          <w:lang w:eastAsia="sk-SK"/>
+        </w:rPr>
+      </w:pPr>
+      <w:r>
+        <w:rPr>
+          <w:rFonts w:eastAsia="Times New Roman"/>
+          <w:lang w:eastAsia="sk-SK"/>
+        </w:rPr>
+        <w:t xml:space="preserve">Jedným z hlavných dôvodov, prečo sa v súčasnosti často využíva redukcia problémov na SAT, je existencia vysoko optimalizovaných SAT </w:t>
+      </w:r>
+      <w:proofErr w:type="spellStart"/>
+      <w:r>
+        <w:rPr>
+          <w:rFonts w:eastAsia="Times New Roman"/>
+          <w:lang w:eastAsia="sk-SK"/>
+        </w:rPr>
+        <w:t>riešičov</w:t>
+      </w:r>
+      <w:proofErr w:type="spellEnd"/>
+      <w:r>
+        <w:rPr>
+          <w:rFonts w:eastAsia="Times New Roman"/>
+          <w:lang w:eastAsia="sk-SK"/>
+        </w:rPr>
+        <w:t xml:space="preserve">. Moderné SAT </w:t>
+      </w:r>
+      <w:proofErr w:type="spellStart"/>
+      <w:r>
+        <w:rPr>
+          <w:rFonts w:eastAsia="Times New Roman"/>
+          <w:lang w:eastAsia="sk-SK"/>
+        </w:rPr>
+        <w:t>riešiče</w:t>
+      </w:r>
+      <w:proofErr w:type="spellEnd"/>
+      <w:r>
+        <w:rPr>
+          <w:rFonts w:eastAsia="Times New Roman"/>
+          <w:lang w:eastAsia="sk-SK"/>
+        </w:rPr>
+        <w:t xml:space="preserve">, založené </w:t>
+      </w:r>
+      <w:r>
+        <w:rPr>
+          <w:rFonts w:eastAsia="Times New Roman"/>
+          <w:lang w:eastAsia="sk-SK"/>
+        </w:rPr>
+        <w:lastRenderedPageBreak/>
+        <w:t xml:space="preserve">napríklad na algoritmoch typu CDCL, dokážu efektívne spracovať veľmi veľké logické formuly a sú výsledkom dlhoročného výskumu a optimalizácie </w:t>
+      </w:r>
+      <w:r>
+        <w:rPr>
+          <w:rFonts w:eastAsia="Times New Roman"/>
+          <w:lang w:eastAsia="sk-SK"/>
+        </w:rPr>
+        <w:fldChar w:fldCharType="begin" w:fldLock="1"/>
+      </w:r>
+      <w:r>
+        <w:rPr>
+          <w:rFonts w:eastAsia="Times New Roman"/>
+          <w:lang w:eastAsia="sk-SK"/>
+        </w:rPr>
+        <w:instrText>ADDIN CSL_CITATION {"citationItems":[{"id":"ITEM-1","itemData":{"ISBN":"160750376X","abstract":"A collection of papers on various theoretical and practical aspects of SAT solving. It is suitable for students and researchers. Title page; Contents; Part I. Theory and Algorithms; Chapter 1. A History of Satisfiability; Chapter 2. CNF Encodings; Chapter 3. Complete Algorithms; Chapter 4. CDCL Solvers; Chapter 5. Look-Ahead Based SAT Solvers; Chapter 6. Incomplete Algorithms; Chapter 7. Fundaments of Branching Heuristics; Chapter 8. Random Satisfiability; Chapter 9. Exploiting Runtime Variation in Complete Solvers; Chapter 10. Symmetry and Satisfiability; Chapter 11. Minimal Unsatisfiability and Autarkies; Chapter 12. Worst-Case Upper Bounds; Chapter 13. Fixed-Parameter Tractability.","author":[{"dropping-particle":"","family":"Biere","given":"Armin.","non-dropping-particle":"","parse-names":false,"suffix":""},{"dropping-particle":"","family":"Walsh","given":"Toby","non-dropping-particle":"","parse-names":false,"suffix":""},{"dropping-particle":"","family":"Maaren","given":"Hans","non-dropping-particle":"van","parse-names":false,"suffix":""}],"id":"ITEM-1","issued":{"date-parts":[["2009"]]},"number-of-pages":"966","publisher":"IOS Press","title":"Handbook of satisfiability","type":"book"},"uris":["http://www.mendeley.com/documents/?uuid=c082b2f8-2d01-35fb-85b1-38c183ddeafc"]}],"mendeley":{"formattedCitation":"&lt;span style=\"baseline\"&gt;[8]&lt;/span&gt;","plainTextFormattedCitation":"[8]","previouslyFormattedCitation":"&lt;span style=\"baseline\"&gt;[8]&lt;/span&gt;"},"properties":{"noteIndex":0},"schema":"https://github.com/citation-style-language/schema/raw/master/csl-citation.json"}</w:instrText>
+      </w:r>
+      <w:r>
+        <w:rPr>
+          <w:rFonts w:eastAsia="Times New Roman"/>
+          <w:lang w:eastAsia="sk-SK"/>
+        </w:rPr>
+        <w:fldChar w:fldCharType="separate"/>
+      </w:r>
+      <w:r>
+        <w:rPr>
+          <w:rFonts w:eastAsia="Times New Roman"/>
+          <w:noProof/>
+          <w:lang w:eastAsia="sk-SK"/>
+        </w:rPr>
+        <w:t>[8]</w:t>
+      </w:r>
+      <w:r>
+        <w:rPr>
+          <w:rFonts w:eastAsia="Times New Roman"/>
+          <w:lang w:eastAsia="sk-SK"/>
+        </w:rPr>
+        <w:fldChar w:fldCharType="end"/>
+      </w:r>
+      <w:r>
+        <w:rPr>
+          <w:rFonts w:eastAsia="Times New Roman"/>
+          <w:lang w:eastAsia="sk-SK"/>
+        </w:rPr>
+        <w:t>.</w:t>
+      </w:r>
+    </w:p>
+    <w:p>
+      <w:pPr>
+        <w:rPr>
+          <w:rFonts w:eastAsia="Times New Roman"/>
+          <w:lang w:eastAsia="sk-SK"/>
+        </w:rPr>
+      </w:pPr>
+      <w:r>
+        <w:rPr>
+          <w:rFonts w:eastAsia="Times New Roman"/>
+          <w:lang w:eastAsia="sk-SK"/>
+        </w:rPr>
+        <w:t xml:space="preserve">Redukcia na SAT umožňuje využiť tieto existujúce nástroje bez potreby navrhovať nový špecializovaný algoritmus pre každý konkrétny problém. Namiesto toho sa problém transformuje do jednotného formátu (CNF formula), ktorý je možné riešiť univerzálnym spôsobom </w:t>
+      </w:r>
+      <w:r>
+        <w:rPr>
+          <w:rFonts w:eastAsia="Times New Roman"/>
+          <w:lang w:eastAsia="sk-SK"/>
+        </w:rPr>
+        <w:fldChar w:fldCharType="begin" w:fldLock="1"/>
+      </w:r>
+      <w:r>
+        <w:rPr>
+          <w:rFonts w:eastAsia="Times New Roman"/>
+          <w:lang w:eastAsia="sk-SK"/>
+        </w:rPr>
+        <w:instrText>ADDIN CSL_CITATION {"citationItems":[{"id":"ITEM-1","itemData":{"ISBN":"160750376X","abstract":"A collection of papers on various theoretical and practical aspects of SAT solving. It is suitable for students and researchers. Title page; Contents; Part I. Theory and Algorithms; Chapter 1. A History of Satisfiability; Chapter 2. CNF Encodings; Chapter 3. Complete Algorithms; Chapter 4. CDCL Solvers; Chapter 5. Look-Ahead Based SAT Solvers; Chapter 6. Incomplete Algorithms; Chapter 7. Fundaments of Branching Heuristics; Chapter 8. Random Satisfiability; Chapter 9. Exploiting Runtime Variation in Complete Solvers; Chapter 10. Symmetry and Satisfiability; Chapter 11. Minimal Unsatisfiability and Autarkies; Chapter 12. Worst-Case Upper Bounds; Chapter 13. Fixed-Parameter Tractability.","author":[{"dropping-particle":"","family":"Biere","given":"Armin.","non-dropping-particle":"","parse-names":false,"suffix":""},{"dropping-particle":"","family":"Walsh","given":"Toby","non-dropping-particle":"","parse-names":false,"suffix":""},{"dropping-particle":"","family":"Maaren","given":"Hans","non-dropping-particle":"van","parse-names":false,"suffix":""}],"id":"ITEM-1","issued":{"date-parts":[["2009"]]},"number-of-pages":"966","publisher":"IOS Press","title":"Handbook of satisfiability","type":"book"},"uris":["http://www.mendeley.com/documents/?uuid=c082b2f8-2d01-35fb-85b1-38c183ddeafc"]}],"mendeley":{"formattedCitation":"&lt;span style=\"baseline\"&gt;[8]&lt;/span&gt;","plainTextFormattedCitation":"[8]","previouslyFormattedCitation":"&lt;span style=\"baseline\"&gt;[8]&lt;/span&gt;"},"properties":{"noteIndex":0},"schema":"https://github.com/citation-style-language/schema/raw/master/csl-citation.json"}</w:instrText>
+      </w:r>
+      <w:r>
+        <w:rPr>
+          <w:rFonts w:eastAsia="Times New Roman"/>
+          <w:lang w:eastAsia="sk-SK"/>
+        </w:rPr>
+        <w:fldChar w:fldCharType="separate"/>
+      </w:r>
+      <w:r>
+        <w:rPr>
+          <w:rFonts w:eastAsia="Times New Roman"/>
+          <w:noProof/>
+          <w:lang w:eastAsia="sk-SK"/>
+        </w:rPr>
+        <w:t>[8]</w:t>
+      </w:r>
+      <w:r>
+        <w:rPr>
+          <w:rFonts w:eastAsia="Times New Roman"/>
+          <w:lang w:eastAsia="sk-SK"/>
+        </w:rPr>
+        <w:fldChar w:fldCharType="end"/>
+      </w:r>
+      <w:r>
+        <w:rPr>
+          <w:rFonts w:eastAsia="Times New Roman"/>
+          <w:lang w:eastAsia="sk-SK"/>
+        </w:rPr>
+        <w:t>.</w:t>
+      </w:r>
+    </w:p>
+    <w:p>
+      <w:pPr>
+        <w:rPr>
+          <w:rFonts w:eastAsia="Times New Roman"/>
+          <w:lang w:eastAsia="sk-SK"/>
+        </w:rPr>
+      </w:pPr>
+      <w:r>
+        <w:rPr>
+          <w:rFonts w:eastAsia="Times New Roman"/>
+          <w:lang w:eastAsia="sk-SK"/>
+        </w:rPr>
+        <w:t>Ďalším dôvodom je flexibilita tohto prístupu. SAT formulácie umožňujú jednoducho pridávať nové obmedzenia, čím sa rozširuje riešený problém bez zásadnej zmeny algoritmu. Tento aspekt je obzvlášť dôležitý pri komplexných problémoch, kde sa požiadavky môžu meniť.</w:t>
+      </w:r>
+    </w:p>
+    <w:p>
+      <w:pPr>
+        <w:rPr>
+          <w:rFonts w:eastAsia="Times New Roman"/>
+          <w:lang w:eastAsia="sk-SK"/>
+        </w:rPr>
+      </w:pPr>
+      <w:r>
+        <w:rPr>
+          <w:rFonts w:eastAsia="Times New Roman"/>
+          <w:lang w:eastAsia="sk-SK"/>
+        </w:rPr>
+        <w:t xml:space="preserve">Z teoretického hľadiska redukcie umožňujú lepšie pochopiť vzťahy medzi problémami a ich výpočtovú náročnosť. Umožňujú prenášať známe výsledky z jednej oblasti do druhej a identifikovať všeobecné riešiteľné a neriešiteľné triedy problémov </w:t>
+      </w:r>
+      <w:r>
+        <w:rPr>
+          <w:rFonts w:eastAsia="Times New Roman"/>
+          <w:lang w:eastAsia="sk-SK"/>
+        </w:rPr>
+        <w:fldChar w:fldCharType="begin" w:fldLock="1"/>
+      </w:r>
+      <w:r>
+        <w:rPr>
+          <w:rFonts w:eastAsia="Times New Roman"/>
+          <w:lang w:eastAsia="sk-SK"/>
+        </w:rPr>
+        <w:instrText>ADDIN CSL_CITATION {"citationItems":[{"id":"ITEM-1","itemData":{"ISBN":"113318779X","abstract":"Third edition. \"Gain a solid understanding of the fundamental mathematical properties of computer hardware, software, and applications with a blend of practical and philosophical coverage and mathematical treatments, including advanced theorems and proofs. This books comprehensive coverage makes it a valuable reference for studies in theoretical computing.\"-- Provided by publisher. Part 1: Automata and languages. 1. Regular languages ; 2. Context-free languages -- Part 2: Computability theory. 3. The Church-Turing thesis ; 4. Decidability ; 5. Reducibility ; 6. Advanced topics in computability theory -- Part 3: Complexity theory. 7. Time complexity ; 8. Space complexity ; 9. Intractability ; 10. Advanced topics in complexity theory.","author":[{"dropping-particle":"","family":"Sipser","given":"Michael.","non-dropping-particle":"","parse-names":false,"suffix":""}],"id":"ITEM-1","issued":{"date-parts":[["2013"]]},"number-of-pages":"458","publisher":"Cengage Learning","title":"Introduction to the theory of computation","type":"book"},"uris":["http://www.mendeley.com/documents/?uuid=cacb2ad3-5576-3199-81ae-daf9e8aa1644"]}],"mendeley":{"formattedCitation":"&lt;span style=\"baseline\"&gt;[2]&lt;/span&gt;","plainTextFormattedCitation":"[2]","previouslyFormattedCitation":"&lt;span style=\"baseline\"&gt;[2]&lt;/span&gt;"},"properties":{"noteIndex":0},"schema":"https://github.com/citation-style-language/schema/raw/master/csl-citation.json"}</w:instrText>
+      </w:r>
+      <w:r>
+        <w:rPr>
+          <w:rFonts w:eastAsia="Times New Roman"/>
+          <w:lang w:eastAsia="sk-SK"/>
+        </w:rPr>
+        <w:fldChar w:fldCharType="separate"/>
+      </w:r>
+      <w:r>
+        <w:rPr>
+          <w:rFonts w:eastAsia="Times New Roman"/>
+          <w:noProof/>
+          <w:lang w:eastAsia="sk-SK"/>
+        </w:rPr>
+        <w:t>[2]</w:t>
+      </w:r>
+      <w:r>
+        <w:rPr>
+          <w:rFonts w:eastAsia="Times New Roman"/>
+          <w:lang w:eastAsia="sk-SK"/>
+        </w:rPr>
+        <w:fldChar w:fldCharType="end"/>
+      </w:r>
+      <w:r>
+        <w:rPr>
+          <w:rFonts w:eastAsia="Times New Roman"/>
+          <w:lang w:eastAsia="sk-SK"/>
+        </w:rPr>
+        <w:t>.</w:t>
+      </w:r>
+    </w:p>
+    <w:p>
+      <w:pPr>
+        <w:rPr>
+          <w:rFonts w:eastAsia="Times New Roman"/>
+          <w:lang w:eastAsia="sk-SK"/>
+        </w:rPr>
+      </w:pPr>
+      <w:r>
+        <w:rPr>
+          <w:rFonts w:eastAsia="Times New Roman"/>
+          <w:lang w:eastAsia="sk-SK"/>
+        </w:rPr>
+        <w:t xml:space="preserve">Z praktického hľadiska redukcie prinášajú možnosť využiť existujúce optimalizované riešenia. V prípade SAT to znamená využitie moderných </w:t>
+      </w:r>
+      <w:proofErr w:type="spellStart"/>
+      <w:r>
+        <w:rPr>
+          <w:rFonts w:eastAsia="Times New Roman"/>
+          <w:lang w:eastAsia="sk-SK"/>
+        </w:rPr>
+        <w:t>solverov</w:t>
+      </w:r>
+      <w:proofErr w:type="spellEnd"/>
+      <w:r>
+        <w:rPr>
+          <w:rFonts w:eastAsia="Times New Roman"/>
+          <w:lang w:eastAsia="sk-SK"/>
+        </w:rPr>
+        <w:t xml:space="preserve">, ktoré sú schopné efektívne riešiť problémy veľkého rozsahu. Tento prístup je dnes štandardom v oblastiach ako formálna verifikácia alebo plánovanie </w:t>
+      </w:r>
+      <w:r>
+        <w:rPr>
+          <w:rFonts w:eastAsia="Times New Roman"/>
+          <w:lang w:eastAsia="sk-SK"/>
+        </w:rPr>
+        <w:fldChar w:fldCharType="begin" w:fldLock="1"/>
+      </w:r>
+      <w:r>
+        <w:rPr>
+          <w:rFonts w:eastAsia="Times New Roman"/>
+          <w:lang w:eastAsia="sk-SK"/>
+        </w:rPr>
+        <w:instrText>ADDIN CSL_CITATION {"citationItems":[{"id":"ITEM-1","itemData":{"ISBN":"160750376X","abstract":"A collection of papers on various theoretical and practical aspects of SAT solving. It is suitable for students and researchers. Title page; Contents; Part I. Theory and Algorithms; Chapter 1. A History of Satisfiability; Chapter 2. CNF Encodings; Chapter 3. Complete Algorithms; Chapter 4. CDCL Solvers; Chapter 5. Look-Ahead Based SAT Solvers; Chapter 6. Incomplete Algorithms; Chapter 7. Fundaments of Branching Heuristics; Chapter 8. Random Satisfiability; Chapter 9. Exploiting Runtime Variation in Complete Solvers; Chapter 10. Symmetry and Satisfiability; Chapter 11. Minimal Unsatisfiability and Autarkies; Chapter 12. Worst-Case Upper Bounds; Chapter 13. Fixed-Parameter Tractability.","author":[{"dropping-particle":"","family":"Biere","given":"Armin.","non-dropping-particle":"","parse-names":false,"suffix":""},{"dropping-particle":"","family":"Walsh","given":"Toby","non-dropping-particle":"","parse-names":false,"suffix":""},{"dropping-particle":"","family":"Maaren","given":"Hans","non-dropping-particle":"van","parse-names":false,"suffix":""}],"id":"ITEM-1","issued":{"date-parts":[["2009"]]},"number-of-pages":"966","publisher":"IOS Press","title":"Handbook of satisfiability","type":"book"},"uris":["http://www.mendeley.com/documents/?uuid=c082b2f8-2d01-35fb-85b1-38c183ddeafc"]}],"mendeley":{"formattedCitation":"&lt;span style=\"baseline\"&gt;[8]&lt;/span&gt;","plainTextFormattedCitation":"[8]","previouslyFormattedCitation":"&lt;span style=\"baseline\"&gt;[8]&lt;/span&gt;"},"properties":{"noteIndex":0},"schema":"https://github.com/citation-style-language/schema/raw/master/csl-citation.json"}</w:instrText>
+      </w:r>
+      <w:r>
+        <w:rPr>
+          <w:rFonts w:eastAsia="Times New Roman"/>
+          <w:lang w:eastAsia="sk-SK"/>
+        </w:rPr>
+        <w:fldChar w:fldCharType="separate"/>
+      </w:r>
+      <w:r>
+        <w:rPr>
+          <w:rFonts w:eastAsia="Times New Roman"/>
+          <w:noProof/>
+          <w:lang w:eastAsia="sk-SK"/>
+        </w:rPr>
+        <w:t>[8]</w:t>
+      </w:r>
+      <w:r>
+        <w:rPr>
+          <w:rFonts w:eastAsia="Times New Roman"/>
+          <w:lang w:eastAsia="sk-SK"/>
+        </w:rPr>
+        <w:fldChar w:fldCharType="end"/>
+      </w:r>
+      <w:r>
+        <w:rPr>
+          <w:rFonts w:eastAsia="Times New Roman"/>
+          <w:lang w:eastAsia="sk-SK"/>
+        </w:rPr>
+        <w:t>.</w:t>
+      </w:r>
+    </w:p>
+    <w:p>
+      <w:pPr>
+        <w:pStyle w:val="Nadpis2"/>
+        <w:spacing w:before="480" w:after="240"/>
+        <w:rPr>
+          <w:rFonts w:eastAsia="Times New Roman"/>
+          <w:lang w:eastAsia="sk-SK"/>
+        </w:rPr>
+      </w:pPr>
+      <w:proofErr w:type="spellStart"/>
+      <w:r>
+        <w:rPr>
+          <w:rFonts w:eastAsia="Times New Roman"/>
+          <w:lang w:eastAsia="sk-SK"/>
+        </w:rPr>
+        <w:t>P</w:t>
+      </w:r>
+      <w:r>
+        <w:rPr>
+          <w:rFonts w:eastAsia="Times New Roman"/>
+          <w:lang w:eastAsia="sk-SK"/>
+        </w:rPr>
+        <w:t>arsovací</w:t>
+      </w:r>
+      <w:proofErr w:type="spellEnd"/>
+      <w:r>
+        <w:rPr>
+          <w:rFonts w:eastAsia="Times New Roman"/>
+          <w:lang w:eastAsia="sk-SK"/>
+        </w:rPr>
+        <w:t xml:space="preserve"> problém pomocou SAT</w:t>
+      </w:r>
+    </w:p>
+    <w:p>
+      <w:pPr>
+        <w:rPr>
+          <w:rFonts w:eastAsia="Times New Roman"/>
+          <w:lang w:eastAsia="sk-SK"/>
+        </w:rPr>
+      </w:pPr>
+      <w:proofErr w:type="spellStart"/>
+      <w:r>
+        <w:rPr>
+          <w:rFonts w:eastAsia="Times New Roman"/>
+          <w:lang w:eastAsia="sk-SK"/>
+        </w:rPr>
+        <w:t>Parsovací</w:t>
+      </w:r>
+      <w:proofErr w:type="spellEnd"/>
+      <w:r>
+        <w:rPr>
+          <w:rFonts w:eastAsia="Times New Roman"/>
+          <w:lang w:eastAsia="sk-SK"/>
+        </w:rPr>
+        <w:t xml:space="preserve"> problém pre </w:t>
+      </w:r>
+      <w:proofErr w:type="spellStart"/>
+      <w:r>
+        <w:rPr>
+          <w:rFonts w:eastAsia="Times New Roman"/>
+          <w:lang w:eastAsia="sk-SK"/>
+        </w:rPr>
+        <w:t>bezkontextové</w:t>
+      </w:r>
+      <w:proofErr w:type="spellEnd"/>
+      <w:r>
+        <w:rPr>
+          <w:rFonts w:eastAsia="Times New Roman"/>
+          <w:lang w:eastAsia="sk-SK"/>
+        </w:rPr>
+        <w:t xml:space="preserve"> gramatiky môžeme interpretovať ako problém určovania vzťahov medzi symbolmi a pozíciami v reťazci. Tento pohľad umožňuje formulovať </w:t>
+      </w:r>
+      <w:proofErr w:type="spellStart"/>
+      <w:r>
+        <w:rPr>
+          <w:rFonts w:eastAsia="Times New Roman"/>
+          <w:lang w:eastAsia="sk-SK"/>
+        </w:rPr>
+        <w:t>parsovanie</w:t>
+      </w:r>
+      <w:proofErr w:type="spellEnd"/>
+      <w:r>
+        <w:rPr>
+          <w:rFonts w:eastAsia="Times New Roman"/>
+          <w:lang w:eastAsia="sk-SK"/>
+        </w:rPr>
+        <w:t xml:space="preserve"> ako kombináciu logických obmedzení, čo prirodzene vedie k jeho reprezentácii pomocou SAT-problému.</w:t>
+      </w:r>
+    </w:p>
+    <w:p>
+      <w:pPr>
+        <w:pStyle w:val="Nadpis3"/>
+        <w:rPr>
+          <w:rFonts w:eastAsia="Times New Roman"/>
+          <w:lang w:eastAsia="sk-SK"/>
+        </w:rPr>
+      </w:pPr>
+      <w:proofErr w:type="spellStart"/>
+      <w:r>
+        <w:rPr>
+          <w:rFonts w:eastAsia="Times New Roman"/>
+          <w:lang w:eastAsia="sk-SK"/>
+        </w:rPr>
+        <w:t>Parsovanie</w:t>
+      </w:r>
+      <w:proofErr w:type="spellEnd"/>
+      <w:r>
+        <w:rPr>
+          <w:rFonts w:eastAsia="Times New Roman"/>
+          <w:lang w:eastAsia="sk-SK"/>
+        </w:rPr>
+        <w:t xml:space="preserve"> ako množina vzťahov</w:t>
+      </w:r>
+    </w:p>
+    <w:p>
+      <w:pPr>
+        <w:rPr>
+          <w:rFonts w:eastAsia="Times New Roman"/>
+          <w:lang w:eastAsia="sk-SK"/>
+        </w:rPr>
+      </w:pPr>
+      <w:r>
+        <w:rPr>
+          <w:rFonts w:eastAsia="Times New Roman"/>
+          <w:lang w:eastAsia="sk-SK"/>
+        </w:rPr>
+        <w:t xml:space="preserve">Pri </w:t>
+      </w:r>
+      <w:proofErr w:type="spellStart"/>
+      <w:r>
+        <w:rPr>
+          <w:rFonts w:eastAsia="Times New Roman"/>
+          <w:lang w:eastAsia="sk-SK"/>
+        </w:rPr>
+        <w:t>parsovaní</w:t>
+      </w:r>
+      <w:proofErr w:type="spellEnd"/>
+      <w:r>
+        <w:rPr>
+          <w:rFonts w:eastAsia="Times New Roman"/>
+          <w:lang w:eastAsia="sk-SK"/>
+        </w:rPr>
+        <w:t xml:space="preserve"> analyzujeme, aké produkčné pravidlá boli použité a akým spôsobom súvisia jednotlivé časti vstupného reťazca. Každý derivačný strom môžeme chápať ako množinu vzťahov medzi neterminálnymi symbolmi a podreťazcami vstupu.</w:t>
+      </w:r>
+    </w:p>
+    <w:p>
+      <w:pPr>
+        <w:rPr>
+          <w:rFonts w:eastAsia="Times New Roman"/>
+          <w:lang w:eastAsia="sk-SK"/>
+        </w:rPr>
+      </w:pPr>
+      <w:r>
+        <w:rPr>
+          <w:rFonts w:eastAsia="Times New Roman"/>
+          <w:lang w:eastAsia="sk-SK"/>
+        </w:rPr>
+        <w:t>Tieto vzťahy zahŕňajú najmä:</w:t>
+      </w:r>
+    </w:p>
+    <w:p>
+      <w:pPr>
+        <w:pStyle w:val="Odsekzoznamu"/>
+        <w:numPr>
+          <w:ilvl w:val="0"/>
+          <w:numId w:val="49"/>
+        </w:numPr>
+        <w:rPr>
+          <w:rFonts w:eastAsia="Times New Roman"/>
+          <w:lang w:eastAsia="sk-SK"/>
+        </w:rPr>
+      </w:pPr>
+      <w:r>
+        <w:rPr>
+          <w:rFonts w:eastAsia="Times New Roman"/>
+          <w:lang w:eastAsia="sk-SK"/>
+        </w:rPr>
+        <w:t xml:space="preserve">priradenie neterminálnych symbolov k intervalom v reťazci, </w:t>
+      </w:r>
+    </w:p>
+    <w:p>
+      <w:pPr>
+        <w:pStyle w:val="Odsekzoznamu"/>
+        <w:numPr>
+          <w:ilvl w:val="0"/>
+          <w:numId w:val="49"/>
+        </w:numPr>
+        <w:rPr>
+          <w:rFonts w:eastAsia="Times New Roman"/>
+          <w:lang w:eastAsia="sk-SK"/>
+        </w:rPr>
+      </w:pPr>
+      <w:r>
+        <w:rPr>
+          <w:rFonts w:eastAsia="Times New Roman"/>
+          <w:lang w:eastAsia="sk-SK"/>
+        </w:rPr>
+        <w:t xml:space="preserve">aplikácie produkčných pravidiel typu </w:t>
+      </w:r>
+      <w:r>
+        <w:rPr>
+          <w:rFonts w:eastAsia="Times New Roman"/>
+          <w:i/>
+          <w:iCs/>
+          <w:lang w:eastAsia="sk-SK"/>
+        </w:rPr>
+        <w:t>A → BC</w:t>
+      </w:r>
+      <w:r>
+        <w:rPr>
+          <w:rFonts w:eastAsia="Times New Roman"/>
+          <w:lang w:eastAsia="sk-SK"/>
+        </w:rPr>
+        <w:t xml:space="preserve"> alebo </w:t>
+      </w:r>
+      <w:r>
+        <w:rPr>
+          <w:rFonts w:eastAsia="Times New Roman"/>
+          <w:i/>
+          <w:iCs/>
+          <w:lang w:eastAsia="sk-SK"/>
+        </w:rPr>
+        <w:t>A → a</w:t>
+      </w:r>
+      <w:r>
+        <w:rPr>
+          <w:rFonts w:eastAsia="Times New Roman"/>
+          <w:lang w:eastAsia="sk-SK"/>
+        </w:rPr>
+        <w:t xml:space="preserve">, </w:t>
+      </w:r>
+    </w:p>
+    <w:p>
+      <w:pPr>
+        <w:pStyle w:val="Odsekzoznamu"/>
+        <w:numPr>
+          <w:ilvl w:val="0"/>
+          <w:numId w:val="49"/>
+        </w:numPr>
+        <w:rPr>
+          <w:rFonts w:eastAsia="Times New Roman"/>
+          <w:lang w:eastAsia="sk-SK"/>
+        </w:rPr>
+      </w:pPr>
+      <w:r>
+        <w:rPr>
+          <w:rFonts w:eastAsia="Times New Roman"/>
+          <w:lang w:eastAsia="sk-SK"/>
+        </w:rPr>
+        <w:t xml:space="preserve">hierarchické vzťahy medzi uzlami derivačného stromu. </w:t>
+      </w:r>
+    </w:p>
+    <w:p>
+      <w:pPr>
+        <w:rPr>
+          <w:rFonts w:eastAsia="Times New Roman"/>
+          <w:lang w:eastAsia="sk-SK"/>
+        </w:rPr>
+      </w:pPr>
+      <w:r>
+        <w:rPr>
+          <w:rFonts w:eastAsia="Times New Roman"/>
+          <w:lang w:eastAsia="sk-SK"/>
+        </w:rPr>
+        <w:t xml:space="preserve">Takýto pohľad umožňuje interpretovať </w:t>
+      </w:r>
+      <w:proofErr w:type="spellStart"/>
+      <w:r>
+        <w:rPr>
+          <w:rFonts w:eastAsia="Times New Roman"/>
+          <w:lang w:eastAsia="sk-SK"/>
+        </w:rPr>
+        <w:t>parsovanie</w:t>
+      </w:r>
+      <w:proofErr w:type="spellEnd"/>
+      <w:r>
+        <w:rPr>
+          <w:rFonts w:eastAsia="Times New Roman"/>
+          <w:lang w:eastAsia="sk-SK"/>
+        </w:rPr>
+        <w:t xml:space="preserve"> ako problém splnenia množiny podmienok, ktoré musia byť súčasne splnené.</w:t>
+      </w:r>
+    </w:p>
+    <w:p>
+      <w:pPr>
+        <w:pStyle w:val="Nadpis3"/>
+        <w:rPr>
+          <w:rFonts w:eastAsia="Times New Roman"/>
+          <w:lang w:eastAsia="sk-SK"/>
+        </w:rPr>
+      </w:pPr>
+      <w:r>
+        <w:rPr>
+          <w:rFonts w:eastAsia="Times New Roman"/>
+          <w:lang w:eastAsia="sk-SK"/>
+        </w:rPr>
+        <w:lastRenderedPageBreak/>
+        <w:t>Vyjadrenie pomocou logických obmedzení</w:t>
+      </w:r>
+    </w:p>
+    <w:p>
+      <w:pPr>
+        <w:rPr>
+          <w:rFonts w:eastAsia="Times New Roman"/>
+          <w:lang w:eastAsia="sk-SK"/>
+        </w:rPr>
+      </w:pPr>
+      <w:r>
+        <w:rPr>
+          <w:rFonts w:eastAsia="Times New Roman"/>
+          <w:lang w:eastAsia="sk-SK"/>
+        </w:rPr>
+        <w:t xml:space="preserve">Vzťahy vznikajúce pri </w:t>
+      </w:r>
+      <w:proofErr w:type="spellStart"/>
+      <w:r>
+        <w:rPr>
+          <w:rFonts w:eastAsia="Times New Roman"/>
+          <w:lang w:eastAsia="sk-SK"/>
+        </w:rPr>
+        <w:t>parsovaní</w:t>
+      </w:r>
+      <w:proofErr w:type="spellEnd"/>
+      <w:r>
+        <w:rPr>
+          <w:rFonts w:eastAsia="Times New Roman"/>
+          <w:lang w:eastAsia="sk-SK"/>
+        </w:rPr>
+        <w:t xml:space="preserve"> môžeme prirodzene reprezentovať pomocou binárnych premenných. Napríklad premenná môže reprezentovať, či určitý </w:t>
+      </w:r>
+      <w:proofErr w:type="spellStart"/>
+      <w:r>
+        <w:rPr>
+          <w:rFonts w:eastAsia="Times New Roman"/>
+          <w:lang w:eastAsia="sk-SK"/>
+        </w:rPr>
+        <w:t>neterminál</w:t>
+      </w:r>
+      <w:proofErr w:type="spellEnd"/>
+      <w:r>
+        <w:rPr>
+          <w:rFonts w:eastAsia="Times New Roman"/>
+          <w:lang w:eastAsia="sk-SK"/>
+        </w:rPr>
+        <w:t xml:space="preserve"> generuje konkrétny podreťazec vstupu.</w:t>
+      </w:r>
+    </w:p>
+    <w:p>
+      <w:pPr>
+        <w:rPr>
+          <w:rFonts w:eastAsia="Times New Roman"/>
+          <w:lang w:eastAsia="sk-SK"/>
+        </w:rPr>
+      </w:pPr>
+      <w:r>
+        <w:rPr>
+          <w:rFonts w:eastAsia="Times New Roman"/>
+          <w:lang w:eastAsia="sk-SK"/>
+        </w:rPr>
+        <w:t xml:space="preserve">Tieto premenné následne viažeme logickými obmedzeniami, ktoré vyplývajú z produkčných pravidiel gramatiky. Napríklad pravidlo </w:t>
+      </w:r>
+      <w:r>
+        <w:rPr>
+          <w:rFonts w:eastAsia="Times New Roman"/>
+          <w:i/>
+          <w:iCs/>
+          <w:lang w:eastAsia="sk-SK"/>
+        </w:rPr>
+        <w:t>A → BC</w:t>
+      </w:r>
+      <w:r>
+        <w:rPr>
+          <w:rFonts w:eastAsia="Times New Roman"/>
+          <w:lang w:eastAsia="sk-SK"/>
+        </w:rPr>
+        <w:t xml:space="preserve"> môžeme interpretovať ako podmienku, že </w:t>
+      </w:r>
+      <w:proofErr w:type="spellStart"/>
+      <w:r>
+        <w:rPr>
+          <w:rFonts w:eastAsia="Times New Roman"/>
+          <w:lang w:eastAsia="sk-SK"/>
+        </w:rPr>
+        <w:t>neterminál</w:t>
+      </w:r>
+      <w:proofErr w:type="spellEnd"/>
+      <w:r>
+        <w:rPr>
+          <w:rFonts w:eastAsia="Times New Roman"/>
+          <w:lang w:eastAsia="sk-SK"/>
+        </w:rPr>
+        <w:t xml:space="preserve"> </w:t>
+      </w:r>
+      <w:r>
+        <w:rPr>
+          <w:rFonts w:eastAsia="Times New Roman"/>
+          <w:i/>
+          <w:iCs/>
+          <w:lang w:eastAsia="sk-SK"/>
+        </w:rPr>
+        <w:t>A</w:t>
+      </w:r>
+      <w:r>
+        <w:rPr>
+          <w:rFonts w:eastAsia="Times New Roman"/>
+          <w:lang w:eastAsia="sk-SK"/>
+        </w:rPr>
+        <w:t xml:space="preserve"> generuje podreťazec iba vtedy, ak existuje rozdelenie reťazca na dve časti generované </w:t>
+      </w:r>
+      <w:proofErr w:type="spellStart"/>
+      <w:r>
+        <w:rPr>
+          <w:rFonts w:eastAsia="Times New Roman"/>
+          <w:lang w:eastAsia="sk-SK"/>
+        </w:rPr>
+        <w:t>neterminálmi</w:t>
+      </w:r>
+      <w:proofErr w:type="spellEnd"/>
+      <w:r>
+        <w:rPr>
+          <w:rFonts w:eastAsia="Times New Roman"/>
+          <w:lang w:eastAsia="sk-SK"/>
+        </w:rPr>
+        <w:t xml:space="preserve"> </w:t>
+      </w:r>
+      <w:r>
+        <w:rPr>
+          <w:rFonts w:eastAsia="Times New Roman"/>
+          <w:i/>
+          <w:iCs/>
+          <w:lang w:eastAsia="sk-SK"/>
+        </w:rPr>
+        <w:t>B</w:t>
+      </w:r>
+      <w:r>
+        <w:rPr>
+          <w:rFonts w:eastAsia="Times New Roman"/>
+          <w:lang w:eastAsia="sk-SK"/>
+        </w:rPr>
+        <w:t xml:space="preserve"> a </w:t>
+      </w:r>
+      <w:r>
+        <w:rPr>
+          <w:rFonts w:eastAsia="Times New Roman"/>
+          <w:i/>
+          <w:iCs/>
+          <w:lang w:eastAsia="sk-SK"/>
+        </w:rPr>
+        <w:t>C</w:t>
+      </w:r>
+      <w:r>
+        <w:rPr>
+          <w:rFonts w:eastAsia="Times New Roman"/>
+          <w:lang w:eastAsia="sk-SK"/>
+        </w:rPr>
+        <w:t>.</w:t>
+      </w:r>
+    </w:p>
+    <w:p>
+      <w:pPr>
+        <w:rPr>
+          <w:rFonts w:eastAsia="Times New Roman"/>
+          <w:lang w:eastAsia="sk-SK"/>
+        </w:rPr>
+      </w:pPr>
+      <w:r>
+        <w:rPr>
+          <w:rFonts w:eastAsia="Times New Roman"/>
+          <w:lang w:eastAsia="sk-SK"/>
+        </w:rPr>
+        <w:t>Takto vzniká booleovská formula, ktorej splniteľnosť zodpovedá existencii derivačného stromu pre daný reťazec.</w:t>
+      </w:r>
+    </w:p>
+    <w:p>
+      <w:pPr>
+        <w:pStyle w:val="Nadpis3"/>
+        <w:rPr>
+          <w:rFonts w:eastAsia="Times New Roman"/>
+          <w:lang w:eastAsia="sk-SK"/>
+        </w:rPr>
+      </w:pPr>
+      <w:r>
+        <w:rPr>
+          <w:rFonts w:eastAsia="Times New Roman"/>
+          <w:lang w:eastAsia="sk-SK"/>
+        </w:rPr>
+        <w:t>Výhody SAT prístupu</w:t>
+      </w:r>
+    </w:p>
+    <w:p>
+      <w:pPr>
+        <w:rPr>
+          <w:rFonts w:eastAsia="Times New Roman"/>
+          <w:lang w:eastAsia="sk-SK"/>
+        </w:rPr>
+      </w:pPr>
+      <w:r>
+        <w:rPr>
+          <w:rFonts w:eastAsia="Times New Roman"/>
+          <w:lang w:eastAsia="sk-SK"/>
+        </w:rPr>
+        <w:t xml:space="preserve">Použitie SAT pri riešení </w:t>
+      </w:r>
+      <w:proofErr w:type="spellStart"/>
+      <w:r>
+        <w:rPr>
+          <w:rFonts w:eastAsia="Times New Roman"/>
+          <w:lang w:eastAsia="sk-SK"/>
+        </w:rPr>
+        <w:t>parsovacieho</w:t>
+      </w:r>
+      <w:proofErr w:type="spellEnd"/>
+      <w:r>
+        <w:rPr>
+          <w:rFonts w:eastAsia="Times New Roman"/>
+          <w:lang w:eastAsia="sk-SK"/>
+        </w:rPr>
+        <w:t xml:space="preserve"> problému prináša viacero výhod. Jednou z nich je alternatívna riešiaca stratégia, ktorá sa líši od klasických dynamických alebo deterministických </w:t>
+      </w:r>
+      <w:proofErr w:type="spellStart"/>
+      <w:r>
+        <w:rPr>
+          <w:rFonts w:eastAsia="Times New Roman"/>
+          <w:lang w:eastAsia="sk-SK"/>
+        </w:rPr>
+        <w:t>parsovacích</w:t>
+      </w:r>
+      <w:proofErr w:type="spellEnd"/>
+      <w:r>
+        <w:rPr>
+          <w:rFonts w:eastAsia="Times New Roman"/>
+          <w:lang w:eastAsia="sk-SK"/>
+        </w:rPr>
+        <w:t xml:space="preserve"> algoritmov.</w:t>
+      </w:r>
+    </w:p>
+    <w:p>
+      <w:pPr>
+        <w:rPr>
+          <w:rFonts w:eastAsia="Times New Roman"/>
+          <w:lang w:eastAsia="sk-SK"/>
+        </w:rPr>
+      </w:pPr>
+      <w:r>
+        <w:rPr>
+          <w:rFonts w:eastAsia="Times New Roman"/>
+          <w:lang w:eastAsia="sk-SK"/>
+        </w:rPr>
+        <w:t xml:space="preserve">Ďalšou výhodou je dobrá </w:t>
+      </w:r>
+      <w:proofErr w:type="spellStart"/>
+      <w:r>
+        <w:rPr>
+          <w:rFonts w:eastAsia="Times New Roman"/>
+          <w:lang w:eastAsia="sk-SK"/>
+        </w:rPr>
+        <w:t>paralelizovateľnosť</w:t>
+      </w:r>
+      <w:proofErr w:type="spellEnd"/>
+      <w:r>
+        <w:rPr>
+          <w:rFonts w:eastAsia="Times New Roman"/>
+          <w:lang w:eastAsia="sk-SK"/>
+        </w:rPr>
+        <w:t xml:space="preserve">. Moderné SAT </w:t>
+      </w:r>
+      <w:proofErr w:type="spellStart"/>
+      <w:r>
+        <w:rPr>
+          <w:rFonts w:eastAsia="Times New Roman"/>
+          <w:lang w:eastAsia="sk-SK"/>
+        </w:rPr>
+        <w:t>riešiče</w:t>
+      </w:r>
+      <w:proofErr w:type="spellEnd"/>
+      <w:r>
+        <w:rPr>
+          <w:rFonts w:eastAsia="Times New Roman"/>
+          <w:lang w:eastAsia="sk-SK"/>
+        </w:rPr>
+        <w:t xml:space="preserve"> sú navrhnuté tak, aby efektívne využívali viacjadrové procesory, čo umožňuje zrýchliť riešenie veľkých problémov </w:t>
+      </w:r>
+      <w:r>
+        <w:rPr>
+          <w:rFonts w:eastAsia="Times New Roman"/>
+          <w:lang w:eastAsia="sk-SK"/>
+        </w:rPr>
+        <w:fldChar w:fldCharType="begin" w:fldLock="1"/>
+      </w:r>
+      <w:r>
+        <w:rPr>
+          <w:rFonts w:eastAsia="Times New Roman"/>
+          <w:lang w:eastAsia="sk-SK"/>
+        </w:rPr>
+        <w:instrText>ADDIN CSL_CITATION {"citationItems":[{"id":"ITEM-1","itemData":{"ISBN":"160750376X","abstract":"A collection of papers on various theoretical and practical aspects of SAT solving. It is suitable for students and researchers. Title page; Contents; Part I. Theory and Algorithms; Chapter 1. A History of Satisfiability; Chapter 2. CNF Encodings; Chapter 3. Complete Algorithms; Chapter 4. CDCL Solvers; Chapter 5. Look-Ahead Based SAT Solvers; Chapter 6. Incomplete Algorithms; Chapter 7. Fundaments of Branching Heuristics; Chapter 8. Random Satisfiability; Chapter 9. Exploiting Runtime Variation in Complete Solvers; Chapter 10. Symmetry and Satisfiability; Chapter 11. Minimal Unsatisfiability and Autarkies; Chapter 12. Worst-Case Upper Bounds; Chapter 13. Fixed-Parameter Tractability.","author":[{"dropping-particle":"","family":"Biere","given":"Armin.","non-dropping-particle":"","parse-names":false,"suffix":""},{"dropping-particle":"","family":"Walsh","given":"Toby","non-dropping-particle":"","parse-names":false,"suffix":""},{"dropping-particle":"","family":"Maaren","given":"Hans","non-dropping-particle":"van","parse-names":false,"suffix":""}],"id":"ITEM-1","issued":{"date-parts":[["2009"]]},"number-of-pages":"966","publisher":"IOS Press","title":"Handbook of satisfiability","type":"book"},"uris":["http://www.mendeley.com/documents/?uuid=c082b2f8-2d01-35fb-85b1-38c183ddeafc"]}],"mendeley":{"formattedCitation":"&lt;span style=\"baseline\"&gt;[8]&lt;/span&gt;","plainTextFormattedCitation":"[8]","previouslyFormattedCitation":"&lt;span style=\"baseline\"&gt;[8]&lt;/span&gt;"},"properties":{"noteIndex":0},"schema":"https://github.com/citation-style-language/schema/raw/master/csl-citation.json"}</w:instrText>
+      </w:r>
+      <w:r>
+        <w:rPr>
+          <w:rFonts w:eastAsia="Times New Roman"/>
+          <w:lang w:eastAsia="sk-SK"/>
+        </w:rPr>
+        <w:fldChar w:fldCharType="separate"/>
+      </w:r>
+      <w:r>
+        <w:rPr>
+          <w:rFonts w:eastAsia="Times New Roman"/>
+          <w:noProof/>
+          <w:lang w:eastAsia="sk-SK"/>
+        </w:rPr>
+        <w:t>[8]</w:t>
+      </w:r>
+      <w:r>
+        <w:rPr>
+          <w:rFonts w:eastAsia="Times New Roman"/>
+          <w:lang w:eastAsia="sk-SK"/>
+        </w:rPr>
+        <w:fldChar w:fldCharType="end"/>
+      </w:r>
+      <w:r>
+        <w:rPr>
+          <w:rFonts w:eastAsia="Times New Roman"/>
+          <w:lang w:eastAsia="sk-SK"/>
+        </w:rPr>
+        <w:t>.</w:t>
+      </w:r>
+    </w:p>
+    <w:p>
+      <w:pPr>
+        <w:rPr>
+          <w:rFonts w:eastAsia="Times New Roman"/>
+          <w:lang w:eastAsia="sk-SK"/>
+        </w:rPr>
+      </w:pPr>
+      <w:r>
+        <w:rPr>
+          <w:rFonts w:eastAsia="Times New Roman"/>
+          <w:lang w:eastAsia="sk-SK"/>
+        </w:rPr>
+        <w:t xml:space="preserve">SAT prístup tiež umožňuje jednoduché rozšírenia problému. Napríklad je možné pridať obmedzenia na počet derivácií, preferovať určité pravidlá alebo kombinovať </w:t>
+      </w:r>
+      <w:proofErr w:type="spellStart"/>
+      <w:r>
+        <w:rPr>
+          <w:rFonts w:eastAsia="Times New Roman"/>
+          <w:lang w:eastAsia="sk-SK"/>
+        </w:rPr>
+        <w:t>parsovanie</w:t>
+      </w:r>
+      <w:proofErr w:type="spellEnd"/>
+      <w:r>
+        <w:rPr>
+          <w:rFonts w:eastAsia="Times New Roman"/>
+          <w:lang w:eastAsia="sk-SK"/>
+        </w:rPr>
+        <w:t xml:space="preserve"> s inými typmi obmedzení bez zásadnej zmeny algoritmu.</w:t>
+      </w:r>
+    </w:p>
+    <w:p>
+      <w:pPr>
+        <w:pStyle w:val="Nadpis3"/>
+        <w:rPr>
+          <w:rFonts w:eastAsia="Times New Roman"/>
+          <w:lang w:eastAsia="sk-SK"/>
+        </w:rPr>
+      </w:pPr>
+      <w:r>
+        <w:rPr>
+          <w:rFonts w:eastAsia="Times New Roman"/>
+          <w:lang w:eastAsia="sk-SK"/>
+        </w:rPr>
+        <w:t>Obmedzenia SAT prístupu</w:t>
+      </w:r>
+    </w:p>
+    <w:p>
+      <w:pPr>
+        <w:rPr>
+          <w:rFonts w:eastAsia="Times New Roman"/>
+          <w:lang w:eastAsia="sk-SK"/>
+        </w:rPr>
+      </w:pPr>
+      <w:r>
+        <w:rPr>
+          <w:rFonts w:eastAsia="Times New Roman"/>
+          <w:lang w:eastAsia="sk-SK"/>
+        </w:rPr>
+        <w:t>Napriek svojim výhodám má SAT prístup aj určité obmedzenia. Jedným z hlavných problémov je veľkosť výslednej booleovskej formule, ktorá môže rásť veľmi rýchlo s dĺžkou vstupného reťazca a počtom produkčných pravidiel.</w:t>
+      </w:r>
+    </w:p>
+    <w:p>
+      <w:pPr>
+        <w:rPr>
+          <w:rFonts w:eastAsia="Times New Roman"/>
+          <w:lang w:eastAsia="sk-SK"/>
+        </w:rPr>
+      </w:pPr>
+      <w:r>
+        <w:rPr>
+          <w:rFonts w:eastAsia="Times New Roman"/>
+          <w:lang w:eastAsia="sk-SK"/>
+        </w:rPr>
+        <w:t xml:space="preserve">Ďalším faktorom sú režijné náklady SAT </w:t>
+      </w:r>
+      <w:proofErr w:type="spellStart"/>
+      <w:r>
+        <w:rPr>
+          <w:rFonts w:eastAsia="Times New Roman"/>
+          <w:lang w:eastAsia="sk-SK"/>
+        </w:rPr>
+        <w:t>riešiča</w:t>
+      </w:r>
+      <w:proofErr w:type="spellEnd"/>
+      <w:r>
+        <w:rPr>
+          <w:rFonts w:eastAsia="Times New Roman"/>
+          <w:lang w:eastAsia="sk-SK"/>
+        </w:rPr>
+        <w:t xml:space="preserve">. Hoci moderné </w:t>
+      </w:r>
+      <w:proofErr w:type="spellStart"/>
+      <w:r>
+        <w:rPr>
+          <w:rFonts w:eastAsia="Times New Roman"/>
+          <w:lang w:eastAsia="sk-SK"/>
+        </w:rPr>
+        <w:t>solveri</w:t>
+      </w:r>
+      <w:proofErr w:type="spellEnd"/>
+      <w:r>
+        <w:rPr>
+          <w:rFonts w:eastAsia="Times New Roman"/>
+          <w:lang w:eastAsia="sk-SK"/>
+        </w:rPr>
+        <w:t xml:space="preserve"> sú veľmi efektívne, ich inicializácia a spracovanie veľkých formúl môže byť časovo náročné.</w:t>
+      </w:r>
+    </w:p>
+    <w:p>
+      <w:pPr>
+        <w:rPr>
+          <w:rFonts w:eastAsia="Times New Roman"/>
+          <w:lang w:eastAsia="sk-SK"/>
+        </w:rPr>
+      </w:pPr>
+      <w:r>
+        <w:rPr>
+          <w:rFonts w:eastAsia="Times New Roman"/>
+          <w:lang w:eastAsia="sk-SK"/>
+        </w:rPr>
+        <w:t xml:space="preserve">Napokon, SAT prístup nie je vždy rýchlejší než klasické </w:t>
+      </w:r>
+      <w:proofErr w:type="spellStart"/>
+      <w:r>
+        <w:rPr>
+          <w:rFonts w:eastAsia="Times New Roman"/>
+          <w:lang w:eastAsia="sk-SK"/>
+        </w:rPr>
+        <w:t>parsovacie</w:t>
+      </w:r>
+      <w:proofErr w:type="spellEnd"/>
+      <w:r>
+        <w:rPr>
+          <w:rFonts w:eastAsia="Times New Roman"/>
+          <w:lang w:eastAsia="sk-SK"/>
+        </w:rPr>
+        <w:t xml:space="preserve"> algoritmy. Pre špeciálne triedy gramatík, ako sú LL alebo LR gramatiky, môžu byť deterministické </w:t>
+      </w:r>
+      <w:proofErr w:type="spellStart"/>
+      <w:r>
+        <w:rPr>
+          <w:rFonts w:eastAsia="Times New Roman"/>
+          <w:lang w:eastAsia="sk-SK"/>
+        </w:rPr>
+        <w:t>parsery</w:t>
+      </w:r>
+      <w:proofErr w:type="spellEnd"/>
+      <w:r>
+        <w:rPr>
+          <w:rFonts w:eastAsia="Times New Roman"/>
+          <w:lang w:eastAsia="sk-SK"/>
+        </w:rPr>
+        <w:t xml:space="preserve"> výrazne efektívnejšie.</w:t>
+      </w:r>
+    </w:p>
+    <w:p>
+      <w:pPr>
+        <w:pStyle w:val="Nadpis1"/>
+        <w:spacing w:after="480"/>
+      </w:pPr>
+      <w:r>
+        <w:lastRenderedPageBreak/>
+        <w:t>Prehľad súvisiacich prác</w:t>
+      </w:r>
+    </w:p>
+    <w:p>
+      <w:r>
+        <w:t xml:space="preserve">V tejto kapitole predstavujeme prehľad vybraných vedeckých prác, ktoré sa zaoberajú využitím SAT </w:t>
+      </w:r>
+      <w:proofErr w:type="spellStart"/>
+      <w:r>
+        <w:t>riešičov</w:t>
+      </w:r>
+      <w:proofErr w:type="spellEnd"/>
+      <w:r>
+        <w:t xml:space="preserve"> pri práci s </w:t>
+      </w:r>
+      <w:proofErr w:type="spellStart"/>
+      <w:r>
+        <w:t>bezkontextovými</w:t>
+      </w:r>
+      <w:proofErr w:type="spellEnd"/>
+      <w:r>
+        <w:t xml:space="preserve"> gramatikami. Cieľom tejto kapitoly je identifikovať základné prístupy k redukcii problémov súvisiacich s </w:t>
+      </w:r>
+      <w:proofErr w:type="spellStart"/>
+      <w:r>
+        <w:t>bezkontextovými</w:t>
+      </w:r>
+      <w:proofErr w:type="spellEnd"/>
+      <w:r>
+        <w:t xml:space="preserve"> gramatikami na SAT-problém a poukázať na ich spoločné znaky a rozdiely.</w:t>
+      </w:r>
+    </w:p>
+    <w:p>
+      <w:pPr>
+        <w:pStyle w:val="Nadpis2"/>
+        <w:spacing w:before="480" w:after="240"/>
+      </w:pPr>
+      <w:proofErr w:type="spellStart"/>
+      <w:r>
+        <w:t>Analyzing</w:t>
+      </w:r>
+      <w:proofErr w:type="spellEnd"/>
+      <w:r>
+        <w:t xml:space="preserve"> </w:t>
+      </w:r>
+      <w:proofErr w:type="spellStart"/>
+      <w:r>
+        <w:t>Context-Free</w:t>
+      </w:r>
+      <w:proofErr w:type="spellEnd"/>
+      <w:r>
+        <w:t xml:space="preserve"> </w:t>
+      </w:r>
+      <w:proofErr w:type="spellStart"/>
+      <w:r>
+        <w:t>Grammars</w:t>
+      </w:r>
+      <w:proofErr w:type="spellEnd"/>
+      <w:r>
+        <w:t xml:space="preserve"> </w:t>
+      </w:r>
+      <w:proofErr w:type="spellStart"/>
+      <w:r>
+        <w:t>Using</w:t>
+      </w:r>
+      <w:proofErr w:type="spellEnd"/>
+      <w:r>
+        <w:t xml:space="preserve"> </w:t>
+      </w:r>
+      <w:proofErr w:type="spellStart"/>
+      <w:r>
+        <w:t>an</w:t>
+      </w:r>
+      <w:proofErr w:type="spellEnd"/>
+      <w:r>
+        <w:t xml:space="preserve"> </w:t>
+      </w:r>
+      <w:proofErr w:type="spellStart"/>
+      <w:r>
+        <w:t>Incremental</w:t>
+      </w:r>
+      <w:proofErr w:type="spellEnd"/>
+      <w:r>
+        <w:t xml:space="preserve"> SAT </w:t>
+      </w:r>
+      <w:proofErr w:type="spellStart"/>
+      <w:r>
+        <w:t>Solver</w:t>
+      </w:r>
+      <w:proofErr w:type="spellEnd"/>
+    </w:p>
+    <w:p>
+      <w:r>
+        <w:t xml:space="preserve">Práca </w:t>
+      </w:r>
+      <w:proofErr w:type="spellStart"/>
+      <w:r>
+        <w:t>Axelssona</w:t>
+      </w:r>
+      <w:proofErr w:type="spellEnd"/>
+      <w:r>
+        <w:t xml:space="preserve">, </w:t>
+      </w:r>
+      <w:proofErr w:type="spellStart"/>
+      <w:r>
+        <w:t>Heljanka</w:t>
+      </w:r>
+      <w:proofErr w:type="spellEnd"/>
+      <w:r>
+        <w:t xml:space="preserve"> a </w:t>
+      </w:r>
+      <w:proofErr w:type="spellStart"/>
+      <w:r>
+        <w:t>Langeho</w:t>
+      </w:r>
+      <w:proofErr w:type="spellEnd"/>
+      <w:r>
+        <w:t xml:space="preserve"> </w:t>
+      </w:r>
+      <w:r>
+        <w:fldChar w:fldCharType="begin" w:fldLock="1"/>
+      </w:r>
+      <w:r>
+        <w:instrText>ADDIN CSL_CITATION {"citationItems":[{"id":"ITEM-1","itemData":{"DOI":"10.1007/978-3-540-70583-3_34","author":[{"dropping-particle":"","family":"Axelsson","given":"Roland","non-dropping-particle":"","parse-names":false,"suffix":""},{"dropping-particle":"","family":"Heljanko","given":"Keijo","non-dropping-particle":"","parse-names":false,"suffix":""},{"dropping-particle":"","family":"Lange","given":"Martin","non-dropping-particle":"","parse-names":false,"suffix":""}],"container-title":"Automata, Languages and Programming","id":"ITEM-1","issued":{"date-parts":[["0"]]},"page":"410-422","publisher":"Springer Berlin Heidelberg","publisher-place":"Berlin, Heidelberg","title":"Analyzing Context-Free Grammars Using an Incremental SAT Solver","type":"chapter"},"uris":["http://www.mendeley.com/documents/?uuid=f5b434fd-e4ef-3d66-98b4-8e25c64776d9"]}],"mendeley":{"formattedCitation":"&lt;span style=\"baseline\"&gt;[12]&lt;/span&gt;","plainTextFormattedCitation":"[12]","previouslyFormattedCitation":"&lt;span style=\"baseline\"&gt;[12]&lt;/span&gt;"},"properties":{"noteIndex":0},"schema":"https://github.com/citation-style-language/schema/raw/master/csl-citation.json"}</w:instrText>
+      </w:r>
+      <w:r>
+        <w:fldChar w:fldCharType="separate"/>
+      </w:r>
+      <w:r>
+        <w:rPr>
+          <w:noProof/>
+        </w:rPr>
+        <w:t>[12]</w:t>
+      </w:r>
+      <w:r>
+        <w:fldChar w:fldCharType="end"/>
+      </w:r>
+      <w:r>
+        <w:t xml:space="preserve"> sa zameriava na analýzu vlastností </w:t>
+      </w:r>
+      <w:proofErr w:type="spellStart"/>
+      <w:r>
+        <w:t>bezkontextových</w:t>
+      </w:r>
+      <w:proofErr w:type="spellEnd"/>
+      <w:r>
+        <w:t xml:space="preserve"> gramatík pomocou inkrementálneho SAT </w:t>
+      </w:r>
+      <w:proofErr w:type="spellStart"/>
+      <w:r>
+        <w:t>riešiča</w:t>
+      </w:r>
+      <w:proofErr w:type="spellEnd"/>
+      <w:r>
+        <w:t>. Hlavným cieľom autorov je ukázať, že rôzne vlastnosti gramatík, ako napríklad generovanie konkrétnych reťazcov alebo existencia určitých derivácií, je možné formulovať ako SAT-problém.</w:t>
+      </w:r>
+      <w:r>
+        <w:t xml:space="preserve"> </w:t>
+      </w:r>
+      <w:r>
+        <w:t xml:space="preserve">Autori navrhujú model, v ktorom sa derivácie </w:t>
+      </w:r>
+      <w:proofErr w:type="spellStart"/>
+      <w:r>
+        <w:t>bezkontextovej</w:t>
+      </w:r>
+      <w:proofErr w:type="spellEnd"/>
+      <w:r>
+        <w:t xml:space="preserve"> gramatiky reprezentujú pomocou booleovských premenných. Každá premenná reprezentuje určitý aspekt derivácie, napríklad priradenie </w:t>
+      </w:r>
+      <w:proofErr w:type="spellStart"/>
+      <w:r>
+        <w:t>neterminálu</w:t>
+      </w:r>
+      <w:proofErr w:type="spellEnd"/>
+      <w:r>
+        <w:t xml:space="preserve"> k podreťazcu vstupu. Produkčné pravidlá gramatiky sú následne transformované na logické obmedzenia, ktoré zabezpečujú konzistentnosť derivácie.</w:t>
+      </w:r>
+    </w:p>
+    <w:p>
+      <w:r>
+        <w:t xml:space="preserve">Kľúčovým prvkom tejto práce je využitie </w:t>
+      </w:r>
+      <w:r>
+        <w:rPr>
+          <w:rStyle w:val="Vrazn"/>
+          <w:b w:val="0"/>
+          <w:bCs w:val="0"/>
+        </w:rPr>
+        <w:t>inkrementálneho SAT riešenia</w:t>
+      </w:r>
+      <w:r>
+        <w:t>. Namiesto opakovaného vytvárania a riešenia nezávislých SAT formulácií autori postupne rozširujú existujúcu formulu o nové obmedzenia. Tento prístup umožňuje efektívnejšie riešiť sekvenciu súvisiacich problémov, napríklad pri postupnom zvyšovaní dĺžky analyzovaného reťazca.</w:t>
+      </w:r>
+      <w:r>
+        <w:t xml:space="preserve"> </w:t>
+      </w:r>
+      <w:r>
+        <w:t xml:space="preserve">Výsledky ukazujú, že SAT prístup môže byť efektívny pri analýze určitých vlastností gramatík, najmä ak sa využíva inkrementálne riešenie a moderné SAT </w:t>
+      </w:r>
+      <w:proofErr w:type="spellStart"/>
+      <w:r>
+        <w:t>riešiče</w:t>
+      </w:r>
+      <w:proofErr w:type="spellEnd"/>
+      <w:r>
+        <w:t>.</w:t>
+      </w:r>
+    </w:p>
+    <w:p>
+      <w:pPr>
+        <w:pStyle w:val="Nadpis2"/>
+        <w:spacing w:before="480" w:after="240"/>
+      </w:pPr>
+      <w:proofErr w:type="spellStart"/>
+      <w:r>
+        <w:t>Learning</w:t>
+      </w:r>
+      <w:proofErr w:type="spellEnd"/>
+      <w:r>
+        <w:t xml:space="preserve"> </w:t>
+      </w:r>
+      <w:proofErr w:type="spellStart"/>
+      <w:r>
+        <w:t>Context-Free</w:t>
+      </w:r>
+      <w:proofErr w:type="spellEnd"/>
+      <w:r>
+        <w:t xml:space="preserve"> </w:t>
+      </w:r>
+      <w:proofErr w:type="spellStart"/>
+      <w:r>
+        <w:t>Grammars</w:t>
+      </w:r>
+      <w:proofErr w:type="spellEnd"/>
+      <w:r>
+        <w:t xml:space="preserve"> by </w:t>
+      </w:r>
+      <w:proofErr w:type="spellStart"/>
+      <w:r>
+        <w:t>Using</w:t>
+      </w:r>
+      <w:proofErr w:type="spellEnd"/>
+      <w:r>
+        <w:t xml:space="preserve"> SAT </w:t>
+      </w:r>
+      <w:proofErr w:type="spellStart"/>
+      <w:r>
+        <w:t>Solvers</w:t>
+      </w:r>
+      <w:proofErr w:type="spellEnd"/>
+    </w:p>
+    <w:p>
+      <w:r>
+        <w:t xml:space="preserve">Práca </w:t>
+      </w:r>
+      <w:proofErr w:type="spellStart"/>
+      <w:r>
+        <w:t>Imadu</w:t>
+      </w:r>
+      <w:proofErr w:type="spellEnd"/>
+      <w:r>
+        <w:t xml:space="preserve"> a </w:t>
+      </w:r>
+      <w:proofErr w:type="spellStart"/>
+      <w:r>
+        <w:t>Nakamuru</w:t>
+      </w:r>
+      <w:proofErr w:type="spellEnd"/>
+      <w:r>
+        <w:t xml:space="preserve"> </w:t>
+      </w:r>
+      <w:r>
+        <w:fldChar w:fldCharType="begin" w:fldLock="1"/>
+      </w:r>
+      <w:r>
+        <w:instrText>ADDIN CSL_CITATION {"citationItems":[{"id":"ITEM-1","itemData":{"DOI":"10.1109/ICMLA.2009.28","ISBN":"978-0-7695-3926-3","author":[{"dropping-particle":"","family":"Imada","given":"Keita","non-dropping-particle":"","parse-names":false,"suffix":""},{"dropping-particle":"","family":"Nakamura","given":"Katsuhiko","non-dropping-particle":"","parse-names":false,"suffix":""}],"container-title":"2009 International Conference on Machine Learning and Applications","id":"ITEM-1","issued":{"date-parts":[["2009","12"]]},"page":"267-272","publisher":"IEEE","title":"Learning Context Free Grammars by Using SAT Solvers","type":"paper-conference"},"uris":["http://www.mendeley.com/documents/?uuid=6d61f8c5-ae14-3e32-852e-a0863d91a18b"]}],"mendeley":{"formattedCitation":"&lt;span style=\"baseline\"&gt;[13]&lt;/span&gt;","plainTextFormattedCitation":"[13]","previouslyFormattedCitation":"&lt;span style=\"baseline\"&gt;[13]&lt;/span&gt;"},"properties":{"noteIndex":0},"schema":"https://github.com/citation-style-language/schema/raw/master/csl-citation.json"}</w:instrText>
+      </w:r>
+      <w:r>
+        <w:fldChar w:fldCharType="separate"/>
+      </w:r>
+      <w:r>
+        <w:rPr>
+          <w:noProof/>
+        </w:rPr>
+        <w:t>[13]</w:t>
+      </w:r>
+      <w:r>
+        <w:fldChar w:fldCharType="end"/>
+      </w:r>
+      <w:r>
+        <w:t xml:space="preserve"> sa zameriava na iný, ale príbuzný problém, konkrétne na učenie </w:t>
+      </w:r>
+      <w:proofErr w:type="spellStart"/>
+      <w:r>
+        <w:t>bezkontextových</w:t>
+      </w:r>
+      <w:proofErr w:type="spellEnd"/>
+      <w:r>
+        <w:t xml:space="preserve"> gramatík pomocou SAT </w:t>
+      </w:r>
+      <w:proofErr w:type="spellStart"/>
+      <w:r>
+        <w:t>riešičov</w:t>
+      </w:r>
+      <w:proofErr w:type="spellEnd"/>
+      <w:r>
+        <w:t>. Cieľom tejto práce je odvodiť gramatiku z daného množstva pozitívnych a negatívnych príkladov reťazcov.</w:t>
+      </w:r>
+      <w:r>
+        <w:t xml:space="preserve"> </w:t>
+      </w:r>
+      <w:r>
+        <w:t>Autori formulujú problém učenia ako SAT-problém tak, že definujú množinu booleovských premenných reprezentujúcich produkčné pravidlá potenciálnej gramatiky. Následne konštruujú logické obmedzenia, ktoré zabezpečujú, že výsledná gramatika generuje všetky pozitívne príklady a zároveň negeneruje negatívne príklady.</w:t>
+      </w:r>
+    </w:p>
+    <w:p>
+      <w:r>
+        <w:lastRenderedPageBreak/>
+        <w:t xml:space="preserve">Základnou myšlienkou prístupu je transformovať problém syntézy gramatiky na problém splniteľnosti logickej formuly. SAT </w:t>
+      </w:r>
+      <w:proofErr w:type="spellStart"/>
+      <w:r>
+        <w:t>riešič</w:t>
+      </w:r>
+      <w:proofErr w:type="spellEnd"/>
+      <w:r>
+        <w:t xml:space="preserve"> potom nájde takú konfiguráciu produkčných pravidiel, ktorá spĺňa všetky zadané podmienky.</w:t>
+      </w:r>
+      <w:r>
+        <w:t xml:space="preserve"> </w:t>
+      </w:r>
+      <w:r>
+        <w:t xml:space="preserve">Tento prístup demonštruje flexibilitu SAT formalizmu, keďže umožňuje riešiť nielen </w:t>
+      </w:r>
+      <w:proofErr w:type="spellStart"/>
+      <w:r>
+        <w:t>parsovací</w:t>
+      </w:r>
+      <w:proofErr w:type="spellEnd"/>
+      <w:r>
+        <w:t xml:space="preserve"> problém, ale aj problém učenia gramatík, ktorý je výrazne komplexnejší.</w:t>
+      </w:r>
+    </w:p>
+    <w:p>
+      <w:pPr>
+        <w:pStyle w:val="Nadpis2"/>
+        <w:spacing w:before="480" w:after="240"/>
+      </w:pPr>
+      <w:r>
+        <w:t>Porovnanie prístupov</w:t>
+      </w:r>
+    </w:p>
+    <w:p>
+      <w:r>
+        <w:t xml:space="preserve">Obe analyzované práce využívajú spoločný princíp redukcie problémov súvisiacich s </w:t>
+      </w:r>
+      <w:proofErr w:type="spellStart"/>
+      <w:r>
+        <w:t>bezkontextovými</w:t>
+      </w:r>
+      <w:proofErr w:type="spellEnd"/>
+      <w:r>
+        <w:t xml:space="preserve"> gramatikami na SAT-problém, avšak líšia sa vo svojom cieli a konkrétnom prístupe.</w:t>
+      </w:r>
+    </w:p>
+    <w:p>
+      <w:r>
+        <w:t xml:space="preserve">Práca </w:t>
+      </w:r>
+      <w:proofErr w:type="spellStart"/>
+      <w:r>
+        <w:t>Axelssona</w:t>
+      </w:r>
+      <w:proofErr w:type="spellEnd"/>
+      <w:r>
+        <w:t xml:space="preserve"> et al. </w:t>
+      </w:r>
+      <w:r>
+        <w:fldChar w:fldCharType="begin" w:fldLock="1"/>
+      </w:r>
+      <w:r>
+        <w:instrText>ADDIN CSL_CITATION {"citationItems":[{"id":"ITEM-1","itemData":{"DOI":"10.1007/978-3-540-70583-3_34","author":[{"dropping-particle":"","family":"Axelsson","given":"Roland","non-dropping-particle":"","parse-names":false,"suffix":""},{"dropping-particle":"","family":"Heljanko","given":"Keijo","non-dropping-particle":"","parse-names":false,"suffix":""},{"dropping-particle":"","family":"Lange","given":"Martin","non-dropping-particle":"","parse-names":false,"suffix":""}],"container-title":"Automata, Languages and Programming","id":"ITEM-1","issued":{"date-parts":[["0"]]},"page":"410-422","publisher":"Springer Berlin Heidelberg","publisher-place":"Berlin, Heidelberg","title":"Analyzing Context-Free Grammars Using an Incremental SAT Solver","type":"chapter"},"uris":["http://www.mendeley.com/documents/?uuid=f5b434fd-e4ef-3d66-98b4-8e25c64776d9"]}],"mendeley":{"formattedCitation":"&lt;span style=\"baseline\"&gt;[12]&lt;/span&gt;","plainTextFormattedCitation":"[12]","previouslyFormattedCitation":"&lt;span style=\"baseline\"&gt;[12]&lt;/span&gt;"},"properties":{"noteIndex":0},"schema":"https://github.com/citation-style-language/schema/raw/master/csl-citation.json"}</w:instrText>
+      </w:r>
+      <w:r>
+        <w:fldChar w:fldCharType="separate"/>
+      </w:r>
+      <w:r>
+        <w:rPr>
+          <w:noProof/>
+        </w:rPr>
+        <w:t>[12]</w:t>
+      </w:r>
+      <w:r>
+        <w:fldChar w:fldCharType="end"/>
+      </w:r>
+      <w:r>
+        <w:t xml:space="preserve"> sa zameriava na analýzu existujúcej gramatiky, pričom cieľom je overiť určité vlastnosti alebo existenciu derivácií. Naopak práca </w:t>
+      </w:r>
+      <w:proofErr w:type="spellStart"/>
+      <w:r>
+        <w:t>Imadu</w:t>
+      </w:r>
+      <w:proofErr w:type="spellEnd"/>
+      <w:r>
+        <w:t xml:space="preserve"> a </w:t>
+      </w:r>
+      <w:proofErr w:type="spellStart"/>
+      <w:r>
+        <w:t>Nakamuru</w:t>
+      </w:r>
+      <w:proofErr w:type="spellEnd"/>
+      <w:r>
+        <w:t xml:space="preserve"> </w:t>
+      </w:r>
+      <w:r>
+        <w:fldChar w:fldCharType="begin" w:fldLock="1"/>
+      </w:r>
+      <w:r>
+        <w:instrText>ADDIN CSL_CITATION {"citationItems":[{"id":"ITEM-1","itemData":{"DOI":"10.1109/ICMLA.2009.28","ISBN":"978-0-7695-3926-3","author":[{"dropping-particle":"","family":"Imada","given":"Keita","non-dropping-particle":"","parse-names":false,"suffix":""},{"dropping-particle":"","family":"Nakamura","given":"Katsuhiko","non-dropping-particle":"","parse-names":false,"suffix":""}],"container-title":"2009 International Conference on Machine Learning and Applications","id":"ITEM-1","issued":{"date-parts":[["2009","12"]]},"page":"267-272","publisher":"IEEE","title":"Learning Context Free Grammars by Using SAT Solvers","type":"paper-conference"},"uris":["http://www.mendeley.com/documents/?uuid=6d61f8c5-ae14-3e32-852e-a0863d91a18b"]}],"mendeley":{"formattedCitation":"&lt;span style=\"baseline\"&gt;[13]&lt;/span&gt;","plainTextFormattedCitation":"[13]"},"properties":{"noteIndex":0},"schema":"https://github.com/citation-style-language/schema/raw/master/csl-citation.json"}</w:instrText>
+      </w:r>
+      <w:r>
+        <w:fldChar w:fldCharType="separate"/>
+      </w:r>
+      <w:r>
+        <w:rPr>
+          <w:noProof/>
+        </w:rPr>
+        <w:t>[13]</w:t>
+      </w:r>
+      <w:r>
+        <w:fldChar w:fldCharType="end"/>
+      </w:r>
+      <w:r>
+        <w:t xml:space="preserve"> rieši problém syntézy gramatiky na základe dát, teda ide o konštrukčný problém vyššej úrovne.</w:t>
+      </w:r>
+    </w:p>
+    <w:p>
+      <w:r>
+        <w:t xml:space="preserve">Z hľadiska modelovania obe práce využívajú reprezentáciu pomocou booleovských premenných a logických obmedzení. Rozdiel spočíva najmä v tom, čo tieto premenné reprezentujú. V prvom prípade ide o vzťahy medzi </w:t>
+      </w:r>
+      <w:proofErr w:type="spellStart"/>
+      <w:r>
+        <w:t>neterminálmi</w:t>
+      </w:r>
+      <w:proofErr w:type="spellEnd"/>
+      <w:r>
+        <w:t xml:space="preserve"> a podreťazcami, zatiaľ čo v druhom prípade ide o samotné produkčné pravidlá gramatiky.</w:t>
+      </w:r>
+    </w:p>
+    <w:p>
+      <w:r>
+        <w:t xml:space="preserve">Významným rozdielom je aj použitie inkrementálneho SAT riešenia v práci </w:t>
+      </w:r>
+      <w:proofErr w:type="spellStart"/>
+      <w:r>
+        <w:t>Axelssona</w:t>
+      </w:r>
+      <w:proofErr w:type="spellEnd"/>
+      <w:r>
+        <w:t xml:space="preserve"> et al., čo umožňuje efektívnejšie spracovanie sekvencie súvisiacich problémov. Tento aspekt nie je prítomný v práci </w:t>
+      </w:r>
+      <w:proofErr w:type="spellStart"/>
+      <w:r>
+        <w:t>Imadu</w:t>
+      </w:r>
+      <w:proofErr w:type="spellEnd"/>
+      <w:r>
+        <w:t xml:space="preserve"> a </w:t>
+      </w:r>
+      <w:proofErr w:type="spellStart"/>
+      <w:r>
+        <w:t>Nakamuru</w:t>
+      </w:r>
+      <w:proofErr w:type="spellEnd"/>
+      <w:r>
+        <w:t>, kde sa rieši jednorazová formulácia problému učenia.</w:t>
+      </w:r>
+    </w:p>
+    <w:p>
+      <w:r>
+        <w:t xml:space="preserve">Obe práce však potvrdzujú, že SAT predstavuje silný a flexibilný nástroj na riešenie problémov súvisiacich s </w:t>
+      </w:r>
+      <w:proofErr w:type="spellStart"/>
+      <w:r>
+        <w:t>bezkontextovými</w:t>
+      </w:r>
+      <w:proofErr w:type="spellEnd"/>
+      <w:r>
+        <w:t xml:space="preserve"> gramatikami. Zároveň poukazujú na rôzne možnosti modelovania týchto problémov pomocou logických formúl, čo vytvára priestor pre ďalší výskum a návrh nových prístupov.</w:t>
+      </w:r>
+    </w:p>
+    <w:p>
+      <w:pPr>
+        <w:pStyle w:val="Nadpis1"/>
+        <w:spacing w:after="480"/>
+      </w:pPr>
+      <w:proofErr w:type="spellStart"/>
+      <w:r>
+        <w:lastRenderedPageBreak/>
+        <w:t>Poznamky</w:t>
+      </w:r>
+      <w:proofErr w:type="spellEnd"/>
+    </w:p>
+    <w:p>
+      <w:pPr>
+        <w:pStyle w:val="Bezodsadenia"/>
+        <w:numPr>
+          <w:ilvl w:val="0"/>
+          <w:numId w:val="51"/>
+        </w:numPr>
+      </w:pPr>
+      <w:proofErr w:type="spellStart"/>
+      <w:r>
+        <w:t>Moj</w:t>
+      </w:r>
+      <w:proofErr w:type="spellEnd"/>
+      <w:r>
+        <w:t xml:space="preserve"> algoritmus</w:t>
+      </w:r>
+    </w:p>
+    <w:p>
+      <w:pPr>
+        <w:spacing w:line="240" w:lineRule="auto"/>
+        <w:ind w:left="360" w:firstLine="0"/>
         <w:jc w:val="left"/>
         <w:rPr>
           <w:rFonts w:ascii="Times New Roman" w:eastAsia="Times New Roman" w:hAnsi="Times New Roman" w:cs="Times New Roman"/>
@@ -13788,6 +15826,16 @@
           <w14:ligatures w14:val="none"/>
         </w:rPr>
       </w:pPr>
+      <w:bookmarkStart w:id="47" w:name="_Toc224126539"/>
+      <w:r>
+        <w:rPr>
+          <w:rFonts w:ascii="Times New Roman" w:eastAsia="Times New Roman" w:hAnsi="Symbol" w:cs="Times New Roman"/>
+          <w:kern w:val="0"/>
+          <w:lang w:eastAsia="sk-SK"/>
+          <w14:ligatures w14:val="none"/>
+        </w:rPr>
+        <w:t></w:t>
+      </w:r>
       <w:r>
         <w:rPr>
           <w:rFonts w:ascii="Times New Roman" w:eastAsia="Times New Roman" w:hAnsi="Times New Roman" w:cs="Times New Roman"/>
@@ -13795,13 +15843,21 @@
           <w:lang w:eastAsia="sk-SK"/>
           <w14:ligatures w14:val="none"/>
         </w:rPr>
-        <w:t>Táto kapitola prepája teóriu s praktickým cieľom práce.</w:t>
-      </w:r>
-    </w:p>
-    <w:p>
-      <w:pPr>
+        <w:t xml:space="preserve">  navrhnúť vlastnú redukciu: </w:t>
+      </w:r>
+    </w:p>
+    <w:p>
+      <w:pPr>
+        <w:numPr>
+          <w:ilvl w:val="0"/>
+          <w:numId w:val="52"/>
+        </w:numPr>
+        <w:tabs>
+          <w:tab w:val="clear" w:pos="720"/>
+          <w:tab w:val="num" w:pos="1080"/>
+        </w:tabs>
         <w:spacing w:before="100" w:beforeAutospacing="1" w:after="100" w:afterAutospacing="1" w:line="240" w:lineRule="auto"/>
-        <w:ind w:firstLine="0"/>
+        <w:ind w:left="1080"/>
         <w:jc w:val="left"/>
         <w:rPr>
           <w:rFonts w:ascii="Times New Roman" w:eastAsia="Times New Roman" w:hAnsi="Times New Roman" w:cs="Times New Roman"/>
@@ -13813,22 +15869,76 @@
       <w:r>
         <w:rPr>
           <w:rFonts w:ascii="Times New Roman" w:eastAsia="Times New Roman" w:hAnsi="Times New Roman" w:cs="Times New Roman"/>
-          <w:b/>
-          <w:bCs/>
           <w:kern w:val="0"/>
           <w:lang w:eastAsia="sk-SK"/>
           <w14:ligatures w14:val="none"/>
         </w:rPr>
-        <w:t>Témy:</w:t>
+        <w:t xml:space="preserve">CFG </w:t>
+      </w:r>
+      <w:proofErr w:type="spellStart"/>
+      <w:r>
+        <w:rPr>
+          <w:rFonts w:ascii="Times New Roman" w:eastAsia="Times New Roman" w:hAnsi="Times New Roman" w:cs="Times New Roman"/>
+          <w:kern w:val="0"/>
+          <w:lang w:eastAsia="sk-SK"/>
+          <w14:ligatures w14:val="none"/>
+        </w:rPr>
+        <w:t>parsing</w:t>
+      </w:r>
+      <w:proofErr w:type="spellEnd"/>
+      <w:r>
+        <w:rPr>
+          <w:rFonts w:ascii="Times New Roman" w:eastAsia="Times New Roman" w:hAnsi="Times New Roman" w:cs="Times New Roman"/>
+          <w:kern w:val="0"/>
+          <w:lang w:eastAsia="sk-SK"/>
+          <w14:ligatures w14:val="none"/>
+        </w:rPr>
+        <w:t xml:space="preserve"> → SAT </w:t>
+      </w:r>
+    </w:p>
+    <w:p>
+      <w:pPr>
+        <w:spacing w:line="240" w:lineRule="auto"/>
+        <w:ind w:left="360" w:firstLine="0"/>
+        <w:jc w:val="left"/>
+        <w:rPr>
+          <w:rFonts w:ascii="Times New Roman" w:eastAsia="Times New Roman" w:hAnsi="Times New Roman" w:cs="Times New Roman"/>
+          <w:kern w:val="0"/>
+          <w:lang w:eastAsia="sk-SK"/>
+          <w14:ligatures w14:val="none"/>
+        </w:rPr>
+      </w:pPr>
+      <w:r>
+        <w:rPr>
+          <w:rFonts w:ascii="Times New Roman" w:eastAsia="Times New Roman" w:hAnsi="Symbol" w:cs="Times New Roman"/>
+          <w:kern w:val="0"/>
+          <w:lang w:eastAsia="sk-SK"/>
+          <w14:ligatures w14:val="none"/>
+        </w:rPr>
+        <w:t></w:t>
+      </w:r>
+      <w:r>
+        <w:rPr>
+          <w:rFonts w:ascii="Times New Roman" w:eastAsia="Times New Roman" w:hAnsi="Times New Roman" w:cs="Times New Roman"/>
+          <w:kern w:val="0"/>
+          <w:lang w:eastAsia="sk-SK"/>
+          <w14:ligatures w14:val="none"/>
+        </w:rPr>
+        <w:t xml:space="preserve">  ukázať: </w:t>
       </w:r>
     </w:p>
     <w:p>
       <w:pPr>
         <w:numPr>
           <w:ilvl w:val="0"/>
-          <w:numId w:val="43"/>
+          <w:numId w:val="53"/>
         </w:numPr>
+        <w:tabs>
+          <w:tab w:val="clear" w:pos="720"/>
+          <w:tab w:val="num" w:pos="1080"/>
+        </w:tabs>
         <w:spacing w:before="100" w:beforeAutospacing="1" w:after="100" w:afterAutospacing="1" w:line="240" w:lineRule="auto"/>
+        <w:ind w:left="1080"/>
         <w:jc w:val="left"/>
         <w:rPr>
           <w:rFonts w:ascii="Times New Roman" w:eastAsia="Times New Roman" w:hAnsi="Times New Roman" w:cs="Times New Roman"/>
@@ -13844,16 +15954,21 @@
           <w:lang w:eastAsia="sk-SK"/>
           <w14:ligatures w14:val="none"/>
         </w:rPr>
-        <w:t>definícia redukcie problémov</w:t>
+        <w:t xml:space="preserve">ako modelujeme problém </w:t>
       </w:r>
     </w:p>
     <w:p>
       <w:pPr>
         <w:numPr>
           <w:ilvl w:val="0"/>
-          <w:numId w:val="43"/>
+          <w:numId w:val="53"/>
         </w:numPr>
+        <w:tabs>
+          <w:tab w:val="clear" w:pos="720"/>
+          <w:tab w:val="num" w:pos="1080"/>
+        </w:tabs>
         <w:spacing w:before="100" w:beforeAutospacing="1" w:after="100" w:afterAutospacing="1" w:line="240" w:lineRule="auto"/>
+        <w:ind w:left="1080"/>
         <w:jc w:val="left"/>
         <w:rPr>
           <w:rFonts w:ascii="Times New Roman" w:eastAsia="Times New Roman" w:hAnsi="Times New Roman" w:cs="Times New Roman"/>
@@ -13869,16 +15984,52 @@
           <w:lang w:eastAsia="sk-SK"/>
           <w14:ligatures w14:val="none"/>
         </w:rPr>
-        <w:t>redukcie medzi rozhodovacími problémami</w:t>
+        <w:t xml:space="preserve">ako konštruujeme CNF formulu </w:t>
+      </w:r>
+    </w:p>
+    <w:p>
+      <w:pPr>
+        <w:spacing w:line="240" w:lineRule="auto"/>
+        <w:ind w:left="360" w:firstLine="0"/>
+        <w:jc w:val="left"/>
+        <w:rPr>
+          <w:rFonts w:ascii="Times New Roman" w:eastAsia="Times New Roman" w:hAnsi="Times New Roman" w:cs="Times New Roman"/>
+          <w:kern w:val="0"/>
+          <w:lang w:eastAsia="sk-SK"/>
+          <w14:ligatures w14:val="none"/>
+        </w:rPr>
+      </w:pPr>
+      <w:r>
+        <w:rPr>
+          <w:rFonts w:ascii="Times New Roman" w:eastAsia="Times New Roman" w:hAnsi="Symbol" w:cs="Times New Roman"/>
+          <w:kern w:val="0"/>
+          <w:lang w:eastAsia="sk-SK"/>
+          <w14:ligatures w14:val="none"/>
+        </w:rPr>
+        <w:t></w:t>
+      </w:r>
+      <w:r>
+        <w:rPr>
+          <w:rFonts w:ascii="Times New Roman" w:eastAsia="Times New Roman" w:hAnsi="Times New Roman" w:cs="Times New Roman"/>
+          <w:kern w:val="0"/>
+          <w:lang w:eastAsia="sk-SK"/>
+          <w14:ligatures w14:val="none"/>
+        </w:rPr>
+        <w:t xml:space="preserve">  demonštrovať: </w:t>
       </w:r>
     </w:p>
     <w:p>
       <w:pPr>
         <w:numPr>
           <w:ilvl w:val="0"/>
-          <w:numId w:val="43"/>
+          <w:numId w:val="54"/>
         </w:numPr>
+        <w:tabs>
+          <w:tab w:val="clear" w:pos="720"/>
+          <w:tab w:val="num" w:pos="1080"/>
+        </w:tabs>
         <w:spacing w:before="100" w:beforeAutospacing="1" w:after="100" w:afterAutospacing="1" w:line="240" w:lineRule="auto"/>
+        <w:ind w:left="1080"/>
         <w:jc w:val="left"/>
         <w:rPr>
           <w:rFonts w:ascii="Times New Roman" w:eastAsia="Times New Roman" w:hAnsi="Times New Roman" w:cs="Times New Roman"/>
@@ -13894,24 +16045,19 @@
           <w:lang w:eastAsia="sk-SK"/>
           <w14:ligatures w14:val="none"/>
         </w:rPr>
-        <w:t>dôvody redukcie na SAT:</w:t>
-      </w:r>
-    </w:p>
-    <w:p>
-      <w:pPr>
-        <w:numPr>
-          <w:ilvl w:val="1"/>
-          <w:numId w:val="43"/>
-        </w:numPr>
-        <w:spacing w:before="100" w:beforeAutospacing="1" w:after="100" w:afterAutospacing="1" w:line="240" w:lineRule="auto"/>
-        <w:jc w:val="left"/>
+        <w:t xml:space="preserve">že riešenie SAT = </w:t>
+      </w:r>
+      <w:proofErr w:type="spellStart"/>
+      <w:r>
         <w:rPr>
           <w:rFonts w:ascii="Times New Roman" w:eastAsia="Times New Roman" w:hAnsi="Times New Roman" w:cs="Times New Roman"/>
           <w:kern w:val="0"/>
           <w:lang w:eastAsia="sk-SK"/>
           <w14:ligatures w14:val="none"/>
         </w:rPr>
-      </w:pPr>
+        <w:t>validné</w:t>
+      </w:r>
+      <w:proofErr w:type="spellEnd"/>
       <w:r>
         <w:rPr>
           <w:rFonts w:ascii="Times New Roman" w:eastAsia="Times New Roman" w:hAnsi="Times New Roman" w:cs="Times New Roman"/>
@@ -13919,7 +16065,7 @@
           <w:lang w:eastAsia="sk-SK"/>
           <w14:ligatures w14:val="none"/>
         </w:rPr>
-        <w:t xml:space="preserve">existujúce optimalizované </w:t>
+        <w:t xml:space="preserve"> </w:t>
       </w:r>
       <w:proofErr w:type="spellStart"/>
       <w:r>
@@ -13929,787 +16075,20 @@
           <w:lang w:eastAsia="sk-SK"/>
           <w14:ligatures w14:val="none"/>
         </w:rPr>
-        <w:t>riešiče</w:t>
-      </w:r>
-      <w:proofErr w:type="spellEnd"/>
-    </w:p>
-    <w:p>
-      <w:pPr>
-        <w:numPr>
-          <w:ilvl w:val="1"/>
-          <w:numId w:val="43"/>
-        </w:numPr>
-        <w:spacing w:before="100" w:beforeAutospacing="1" w:after="100" w:afterAutospacing="1" w:line="240" w:lineRule="auto"/>
-        <w:jc w:val="left"/>
-        <w:rPr>
-          <w:rFonts w:ascii="Times New Roman" w:eastAsia="Times New Roman" w:hAnsi="Times New Roman" w:cs="Times New Roman"/>
-          <w:kern w:val="0"/>
-          <w:lang w:eastAsia="sk-SK"/>
-          <w14:ligatures w14:val="none"/>
-        </w:rPr>
-      </w:pPr>
-      <w:r>
-        <w:rPr>
-          <w:rFonts w:ascii="Times New Roman" w:eastAsia="Times New Roman" w:hAnsi="Times New Roman" w:cs="Times New Roman"/>
-          <w:kern w:val="0"/>
-          <w:lang w:eastAsia="sk-SK"/>
-          <w14:ligatures w14:val="none"/>
-        </w:rPr>
-        <w:t>nie je potrebné navrhovať nový algoritmus</w:t>
-      </w:r>
-    </w:p>
-    <w:p>
-      <w:pPr>
-        <w:numPr>
-          <w:ilvl w:val="0"/>
-          <w:numId w:val="43"/>
-        </w:numPr>
-        <w:spacing w:before="100" w:beforeAutospacing="1" w:after="100" w:afterAutospacing="1" w:line="240" w:lineRule="auto"/>
-        <w:jc w:val="left"/>
-        <w:rPr>
-          <w:rFonts w:ascii="Times New Roman" w:eastAsia="Times New Roman" w:hAnsi="Times New Roman" w:cs="Times New Roman"/>
-          <w:kern w:val="0"/>
-          <w:lang w:eastAsia="sk-SK"/>
-          <w14:ligatures w14:val="none"/>
-        </w:rPr>
-      </w:pPr>
-      <w:r>
-        <w:rPr>
-          <w:rFonts w:ascii="Times New Roman" w:eastAsia="Times New Roman" w:hAnsi="Times New Roman" w:cs="Times New Roman"/>
-          <w:kern w:val="0"/>
-          <w:lang w:eastAsia="sk-SK"/>
-          <w14:ligatures w14:val="none"/>
-        </w:rPr>
-        <w:t>teoretické a praktické výhody redukcií</w:t>
-      </w:r>
-    </w:p>
-    <w:p>
-      <w:pPr>
-        <w:spacing w:line="240" w:lineRule="auto"/>
-        <w:ind w:firstLine="0"/>
-        <w:jc w:val="left"/>
-        <w:rPr>
-          <w:rFonts w:ascii="Times New Roman" w:eastAsia="Times New Roman" w:hAnsi="Times New Roman" w:cs="Times New Roman"/>
-          <w:kern w:val="0"/>
-          <w:lang w:eastAsia="sk-SK"/>
-          <w14:ligatures w14:val="none"/>
-        </w:rPr>
-      </w:pPr>
-      <w:r>
-        <w:rPr>
-          <w:rFonts w:ascii="Times New Roman" w:eastAsia="Times New Roman" w:hAnsi="Times New Roman" w:cs="Times New Roman"/>
-          <w:kern w:val="0"/>
-          <w:lang w:eastAsia="sk-SK"/>
-          <w14:ligatures w14:val="none"/>
-        </w:rPr>
-        <w:pict w14:anchorId="54481BC5">
-          <v:rect id="_x0000_i1025" style="width:0;height:1.5pt" o:hralign="center" o:hrstd="t" o:hr="t" fillcolor="#a0a0a0" stroked="f"/>
-        </w:pict>
-      </w:r>
-    </w:p>
-    <w:p>
-      <w:pPr>
-        <w:pStyle w:val="Nadpis2"/>
-        <w:spacing w:before="480" w:after="240"/>
-        <w:rPr>
-          <w:rFonts w:eastAsia="Times New Roman"/>
-          <w:lang w:eastAsia="sk-SK"/>
-        </w:rPr>
-      </w:pPr>
-      <w:bookmarkStart w:id="48" w:name="_Toc224126537"/>
-      <w:r>
-        <w:rPr>
-          <w:rFonts w:eastAsia="Times New Roman"/>
-          <w:lang w:eastAsia="sk-SK"/>
-        </w:rPr>
-        <w:t xml:space="preserve">Prečo riešiť </w:t>
-      </w:r>
-      <w:proofErr w:type="spellStart"/>
-      <w:r>
-        <w:rPr>
-          <w:rFonts w:eastAsia="Times New Roman"/>
-          <w:lang w:eastAsia="sk-SK"/>
-        </w:rPr>
-        <w:t>parsovací</w:t>
-      </w:r>
-      <w:proofErr w:type="spellEnd"/>
-      <w:r>
-        <w:rPr>
-          <w:rFonts w:eastAsia="Times New Roman"/>
-          <w:lang w:eastAsia="sk-SK"/>
-        </w:rPr>
-        <w:t xml:space="preserve"> problém pomocou SAT</w:t>
-      </w:r>
-      <w:bookmarkEnd w:id="48"/>
-    </w:p>
-    <w:p>
-      <w:pPr>
-        <w:spacing w:before="100" w:beforeAutospacing="1" w:after="100" w:afterAutospacing="1" w:line="240" w:lineRule="auto"/>
-        <w:ind w:firstLine="0"/>
-        <w:jc w:val="left"/>
-        <w:rPr>
-          <w:rFonts w:ascii="Times New Roman" w:eastAsia="Times New Roman" w:hAnsi="Times New Roman" w:cs="Times New Roman"/>
-          <w:kern w:val="0"/>
-          <w:lang w:eastAsia="sk-SK"/>
-          <w14:ligatures w14:val="none"/>
-        </w:rPr>
-      </w:pPr>
-      <w:r>
-        <w:rPr>
-          <w:rFonts w:ascii="Times New Roman" w:eastAsia="Times New Roman" w:hAnsi="Times New Roman" w:cs="Times New Roman"/>
-          <w:kern w:val="0"/>
-          <w:lang w:eastAsia="sk-SK"/>
-          <w14:ligatures w14:val="none"/>
-        </w:rPr>
-        <w:t>Motivačná kapitola, ktorá pripravuje pôdu pre vlastný prístup.</w:t>
-      </w:r>
-    </w:p>
-    <w:p>
-      <w:pPr>
-        <w:spacing w:before="100" w:beforeAutospacing="1" w:after="100" w:afterAutospacing="1" w:line="240" w:lineRule="auto"/>
-        <w:ind w:firstLine="0"/>
-        <w:jc w:val="left"/>
-        <w:rPr>
-          <w:rFonts w:ascii="Times New Roman" w:eastAsia="Times New Roman" w:hAnsi="Times New Roman" w:cs="Times New Roman"/>
-          <w:kern w:val="0"/>
-          <w:lang w:eastAsia="sk-SK"/>
-          <w14:ligatures w14:val="none"/>
-        </w:rPr>
-      </w:pPr>
-      <w:r>
-        <w:rPr>
-          <w:rFonts w:ascii="Times New Roman" w:eastAsia="Times New Roman" w:hAnsi="Times New Roman" w:cs="Times New Roman"/>
-          <w:b/>
-          <w:bCs/>
-          <w:kern w:val="0"/>
-          <w:lang w:eastAsia="sk-SK"/>
-          <w14:ligatures w14:val="none"/>
-        </w:rPr>
-        <w:t>Argumenty:</w:t>
-      </w:r>
-    </w:p>
-    <w:p>
-      <w:pPr>
-        <w:numPr>
-          <w:ilvl w:val="0"/>
-          <w:numId w:val="44"/>
-        </w:numPr>
-        <w:spacing w:before="100" w:beforeAutospacing="1" w:after="100" w:afterAutospacing="1" w:line="240" w:lineRule="auto"/>
-        <w:jc w:val="left"/>
-        <w:rPr>
-          <w:rFonts w:ascii="Times New Roman" w:eastAsia="Times New Roman" w:hAnsi="Times New Roman" w:cs="Times New Roman"/>
-          <w:kern w:val="0"/>
-          <w:lang w:eastAsia="sk-SK"/>
-          <w14:ligatures w14:val="none"/>
-        </w:rPr>
-      </w:pPr>
-      <w:proofErr w:type="spellStart"/>
-      <w:r>
-        <w:rPr>
-          <w:rFonts w:ascii="Times New Roman" w:eastAsia="Times New Roman" w:hAnsi="Times New Roman" w:cs="Times New Roman"/>
-          <w:kern w:val="0"/>
-          <w:lang w:eastAsia="sk-SK"/>
-          <w14:ligatures w14:val="none"/>
-        </w:rPr>
         <w:t>parsovanie</w:t>
       </w:r>
       <w:proofErr w:type="spellEnd"/>
-      <w:r>
-        <w:rPr>
-          <w:rFonts w:ascii="Times New Roman" w:eastAsia="Times New Roman" w:hAnsi="Times New Roman" w:cs="Times New Roman"/>
-          <w:kern w:val="0"/>
-          <w:lang w:eastAsia="sk-SK"/>
-          <w14:ligatures w14:val="none"/>
-        </w:rPr>
-        <w:t xml:space="preserve"> ako množina:</w:t>
-      </w:r>
-    </w:p>
-    <w:p>
-      <w:pPr>
-        <w:numPr>
-          <w:ilvl w:val="1"/>
-          <w:numId w:val="44"/>
-        </w:numPr>
-        <w:spacing w:before="100" w:beforeAutospacing="1" w:after="100" w:afterAutospacing="1" w:line="240" w:lineRule="auto"/>
-        <w:jc w:val="left"/>
-        <w:rPr>
-          <w:rFonts w:ascii="Times New Roman" w:eastAsia="Times New Roman" w:hAnsi="Times New Roman" w:cs="Times New Roman"/>
-          <w:kern w:val="0"/>
-          <w:lang w:eastAsia="sk-SK"/>
-          <w14:ligatures w14:val="none"/>
-        </w:rPr>
-      </w:pPr>
-      <w:r>
-        <w:rPr>
-          <w:rFonts w:ascii="Times New Roman" w:eastAsia="Times New Roman" w:hAnsi="Times New Roman" w:cs="Times New Roman"/>
-          <w:kern w:val="0"/>
-          <w:lang w:eastAsia="sk-SK"/>
-          <w14:ligatures w14:val="none"/>
-        </w:rPr>
-        <w:t>vzťahov medzi pozíciami v reťazci</w:t>
-      </w:r>
-    </w:p>
-    <w:p>
-      <w:pPr>
-        <w:numPr>
-          <w:ilvl w:val="1"/>
-          <w:numId w:val="44"/>
-        </w:numPr>
-        <w:spacing w:before="100" w:beforeAutospacing="1" w:after="100" w:afterAutospacing="1" w:line="240" w:lineRule="auto"/>
-        <w:jc w:val="left"/>
-        <w:rPr>
-          <w:rFonts w:ascii="Times New Roman" w:eastAsia="Times New Roman" w:hAnsi="Times New Roman" w:cs="Times New Roman"/>
-          <w:kern w:val="0"/>
-          <w:lang w:eastAsia="sk-SK"/>
-          <w14:ligatures w14:val="none"/>
-        </w:rPr>
-      </w:pPr>
-      <w:r>
-        <w:rPr>
-          <w:rFonts w:ascii="Times New Roman" w:eastAsia="Times New Roman" w:hAnsi="Times New Roman" w:cs="Times New Roman"/>
-          <w:kern w:val="0"/>
-          <w:lang w:eastAsia="sk-SK"/>
-          <w14:ligatures w14:val="none"/>
-        </w:rPr>
-        <w:t>aplikácií produkčných pravidiel</w:t>
-      </w:r>
-    </w:p>
-    <w:p>
-      <w:pPr>
-        <w:numPr>
-          <w:ilvl w:val="0"/>
-          <w:numId w:val="44"/>
-        </w:numPr>
-        <w:spacing w:before="100" w:beforeAutospacing="1" w:after="100" w:afterAutospacing="1" w:line="240" w:lineRule="auto"/>
-        <w:jc w:val="left"/>
-        <w:rPr>
-          <w:rFonts w:ascii="Times New Roman" w:eastAsia="Times New Roman" w:hAnsi="Times New Roman" w:cs="Times New Roman"/>
-          <w:kern w:val="0"/>
-          <w:lang w:eastAsia="sk-SK"/>
-          <w14:ligatures w14:val="none"/>
-        </w:rPr>
-      </w:pPr>
-      <w:r>
-        <w:rPr>
-          <w:rFonts w:ascii="Times New Roman" w:eastAsia="Times New Roman" w:hAnsi="Times New Roman" w:cs="Times New Roman"/>
-          <w:kern w:val="0"/>
-          <w:lang w:eastAsia="sk-SK"/>
-          <w14:ligatures w14:val="none"/>
-        </w:rPr>
-        <w:t>prirodzené vyjadrenie pomocou:</w:t>
-      </w:r>
-    </w:p>
-    <w:p>
-      <w:pPr>
-        <w:numPr>
-          <w:ilvl w:val="1"/>
-          <w:numId w:val="44"/>
-        </w:numPr>
-        <w:spacing w:before="100" w:beforeAutospacing="1" w:after="100" w:afterAutospacing="1" w:line="240" w:lineRule="auto"/>
-        <w:jc w:val="left"/>
-        <w:rPr>
-          <w:rFonts w:ascii="Times New Roman" w:eastAsia="Times New Roman" w:hAnsi="Times New Roman" w:cs="Times New Roman"/>
-          <w:kern w:val="0"/>
-          <w:lang w:eastAsia="sk-SK"/>
-          <w14:ligatures w14:val="none"/>
-        </w:rPr>
-      </w:pPr>
-      <w:r>
-        <w:rPr>
-          <w:rFonts w:ascii="Times New Roman" w:eastAsia="Times New Roman" w:hAnsi="Times New Roman" w:cs="Times New Roman"/>
-          <w:kern w:val="0"/>
-          <w:lang w:eastAsia="sk-SK"/>
-          <w14:ligatures w14:val="none"/>
-        </w:rPr>
-        <w:t>binárnych premenných</w:t>
-      </w:r>
-    </w:p>
-    <w:p>
-      <w:pPr>
-        <w:numPr>
-          <w:ilvl w:val="1"/>
-          <w:numId w:val="44"/>
-        </w:numPr>
-        <w:spacing w:before="100" w:beforeAutospacing="1" w:after="100" w:afterAutospacing="1" w:line="240" w:lineRule="auto"/>
-        <w:jc w:val="left"/>
-        <w:rPr>
-          <w:rFonts w:ascii="Times New Roman" w:eastAsia="Times New Roman" w:hAnsi="Times New Roman" w:cs="Times New Roman"/>
-          <w:kern w:val="0"/>
-          <w:lang w:eastAsia="sk-SK"/>
-          <w14:ligatures w14:val="none"/>
-        </w:rPr>
-      </w:pPr>
-      <w:r>
-        <w:rPr>
-          <w:rFonts w:ascii="Times New Roman" w:eastAsia="Times New Roman" w:hAnsi="Times New Roman" w:cs="Times New Roman"/>
-          <w:kern w:val="0"/>
-          <w:lang w:eastAsia="sk-SK"/>
-          <w14:ligatures w14:val="none"/>
-        </w:rPr>
-        <w:t>logických obmedzení</w:t>
-      </w:r>
-    </w:p>
-    <w:p>
-      <w:pPr>
-        <w:numPr>
-          <w:ilvl w:val="0"/>
-          <w:numId w:val="44"/>
-        </w:numPr>
-        <w:spacing w:before="100" w:beforeAutospacing="1" w:after="100" w:afterAutospacing="1" w:line="240" w:lineRule="auto"/>
-        <w:jc w:val="left"/>
-        <w:rPr>
-          <w:rFonts w:ascii="Times New Roman" w:eastAsia="Times New Roman" w:hAnsi="Times New Roman" w:cs="Times New Roman"/>
-          <w:kern w:val="0"/>
-          <w:lang w:eastAsia="sk-SK"/>
-          <w14:ligatures w14:val="none"/>
-        </w:rPr>
-      </w:pPr>
-      <w:r>
-        <w:rPr>
-          <w:rFonts w:ascii="Times New Roman" w:eastAsia="Times New Roman" w:hAnsi="Times New Roman" w:cs="Times New Roman"/>
-          <w:kern w:val="0"/>
-          <w:lang w:eastAsia="sk-SK"/>
-          <w14:ligatures w14:val="none"/>
-        </w:rPr>
-        <w:t>výhody SAT prístupu:</w:t>
-      </w:r>
-    </w:p>
-    <w:p>
-      <w:pPr>
-        <w:numPr>
-          <w:ilvl w:val="1"/>
-          <w:numId w:val="44"/>
-        </w:numPr>
-        <w:spacing w:before="100" w:beforeAutospacing="1" w:after="100" w:afterAutospacing="1" w:line="240" w:lineRule="auto"/>
-        <w:jc w:val="left"/>
-        <w:rPr>
-          <w:rFonts w:ascii="Times New Roman" w:eastAsia="Times New Roman" w:hAnsi="Times New Roman" w:cs="Times New Roman"/>
-          <w:kern w:val="0"/>
-          <w:lang w:eastAsia="sk-SK"/>
-          <w14:ligatures w14:val="none"/>
-        </w:rPr>
-      </w:pPr>
-      <w:r>
-        <w:rPr>
-          <w:rFonts w:ascii="Times New Roman" w:eastAsia="Times New Roman" w:hAnsi="Times New Roman" w:cs="Times New Roman"/>
-          <w:kern w:val="0"/>
-          <w:lang w:eastAsia="sk-SK"/>
-          <w14:ligatures w14:val="none"/>
-        </w:rPr>
-        <w:t>alternatívna riešiaca stratégia</w:t>
-      </w:r>
-    </w:p>
-    <w:p>
-      <w:pPr>
-        <w:numPr>
-          <w:ilvl w:val="1"/>
-          <w:numId w:val="44"/>
-        </w:numPr>
-        <w:spacing w:before="100" w:beforeAutospacing="1" w:after="100" w:afterAutospacing="1" w:line="240" w:lineRule="auto"/>
-        <w:jc w:val="left"/>
-        <w:rPr>
-          <w:rFonts w:ascii="Times New Roman" w:eastAsia="Times New Roman" w:hAnsi="Times New Roman" w:cs="Times New Roman"/>
-          <w:kern w:val="0"/>
-          <w:lang w:eastAsia="sk-SK"/>
-          <w14:ligatures w14:val="none"/>
-        </w:rPr>
-      </w:pPr>
-      <w:r>
-        <w:rPr>
-          <w:rFonts w:ascii="Times New Roman" w:eastAsia="Times New Roman" w:hAnsi="Times New Roman" w:cs="Times New Roman"/>
-          <w:kern w:val="0"/>
-          <w:lang w:eastAsia="sk-SK"/>
-          <w14:ligatures w14:val="none"/>
-        </w:rPr>
-        <w:t xml:space="preserve">dobrá </w:t>
-      </w:r>
-      <w:proofErr w:type="spellStart"/>
-      <w:r>
-        <w:rPr>
-          <w:rFonts w:ascii="Times New Roman" w:eastAsia="Times New Roman" w:hAnsi="Times New Roman" w:cs="Times New Roman"/>
-          <w:kern w:val="0"/>
-          <w:lang w:eastAsia="sk-SK"/>
-          <w14:ligatures w14:val="none"/>
-        </w:rPr>
-        <w:t>paralelizovateľnosť</w:t>
-      </w:r>
-      <w:proofErr w:type="spellEnd"/>
-    </w:p>
-    <w:p>
-      <w:pPr>
-        <w:numPr>
-          <w:ilvl w:val="1"/>
-          <w:numId w:val="44"/>
-        </w:numPr>
-        <w:spacing w:before="100" w:beforeAutospacing="1" w:after="100" w:afterAutospacing="1" w:line="240" w:lineRule="auto"/>
-        <w:jc w:val="left"/>
-        <w:rPr>
-          <w:rFonts w:ascii="Times New Roman" w:eastAsia="Times New Roman" w:hAnsi="Times New Roman" w:cs="Times New Roman"/>
-          <w:kern w:val="0"/>
-          <w:lang w:eastAsia="sk-SK"/>
-          <w14:ligatures w14:val="none"/>
-        </w:rPr>
-      </w:pPr>
-      <w:r>
-        <w:rPr>
-          <w:rFonts w:ascii="Times New Roman" w:eastAsia="Times New Roman" w:hAnsi="Times New Roman" w:cs="Times New Roman"/>
-          <w:kern w:val="0"/>
-          <w:lang w:eastAsia="sk-SK"/>
-          <w14:ligatures w14:val="none"/>
-        </w:rPr>
-        <w:t xml:space="preserve">jednoduché rozšírenia (napr. obmedzenie počtu </w:t>
-      </w:r>
-      <w:proofErr w:type="spellStart"/>
-      <w:r>
-        <w:rPr>
-          <w:rFonts w:ascii="Times New Roman" w:eastAsia="Times New Roman" w:hAnsi="Times New Roman" w:cs="Times New Roman"/>
-          <w:kern w:val="0"/>
-          <w:lang w:eastAsia="sk-SK"/>
-          <w14:ligatures w14:val="none"/>
-        </w:rPr>
-        <w:t>parsovaní</w:t>
-      </w:r>
-      <w:proofErr w:type="spellEnd"/>
-      <w:r>
-        <w:rPr>
-          <w:rFonts w:ascii="Times New Roman" w:eastAsia="Times New Roman" w:hAnsi="Times New Roman" w:cs="Times New Roman"/>
-          <w:kern w:val="0"/>
-          <w:lang w:eastAsia="sk-SK"/>
-          <w14:ligatures w14:val="none"/>
-        </w:rPr>
-        <w:t>)</w:t>
-      </w:r>
-    </w:p>
-    <w:p>
-      <w:pPr>
-        <w:spacing w:before="100" w:beforeAutospacing="1" w:after="100" w:afterAutospacing="1" w:line="240" w:lineRule="auto"/>
-        <w:ind w:firstLine="0"/>
-        <w:jc w:val="left"/>
-        <w:rPr>
-          <w:rFonts w:ascii="Times New Roman" w:eastAsia="Times New Roman" w:hAnsi="Times New Roman" w:cs="Times New Roman"/>
-          <w:kern w:val="0"/>
-          <w:lang w:eastAsia="sk-SK"/>
-          <w14:ligatures w14:val="none"/>
-        </w:rPr>
-      </w:pPr>
-      <w:r>
-        <w:rPr>
-          <w:rFonts w:ascii="Times New Roman" w:eastAsia="Times New Roman" w:hAnsi="Times New Roman" w:cs="Times New Roman"/>
-          <w:b/>
-          <w:bCs/>
-          <w:kern w:val="0"/>
-          <w:lang w:eastAsia="sk-SK"/>
-          <w14:ligatures w14:val="none"/>
-        </w:rPr>
-        <w:t>Obmedzenia:</w:t>
-      </w:r>
-    </w:p>
-    <w:p>
-      <w:pPr>
-        <w:numPr>
-          <w:ilvl w:val="0"/>
-          <w:numId w:val="45"/>
-        </w:numPr>
-        <w:spacing w:before="100" w:beforeAutospacing="1" w:after="100" w:afterAutospacing="1" w:line="240" w:lineRule="auto"/>
-        <w:jc w:val="left"/>
-        <w:rPr>
-          <w:rFonts w:ascii="Times New Roman" w:eastAsia="Times New Roman" w:hAnsi="Times New Roman" w:cs="Times New Roman"/>
-          <w:kern w:val="0"/>
-          <w:lang w:eastAsia="sk-SK"/>
-          <w14:ligatures w14:val="none"/>
-        </w:rPr>
-      </w:pPr>
-      <w:r>
-        <w:rPr>
-          <w:rFonts w:ascii="Times New Roman" w:eastAsia="Times New Roman" w:hAnsi="Times New Roman" w:cs="Times New Roman"/>
-          <w:kern w:val="0"/>
-          <w:lang w:eastAsia="sk-SK"/>
-          <w14:ligatures w14:val="none"/>
-        </w:rPr>
-        <w:t>veľkosť výslednej formule</w:t>
-      </w:r>
-    </w:p>
-    <w:p>
-      <w:pPr>
-        <w:numPr>
-          <w:ilvl w:val="0"/>
-          <w:numId w:val="45"/>
-        </w:numPr>
-        <w:spacing w:before="100" w:beforeAutospacing="1" w:after="100" w:afterAutospacing="1" w:line="240" w:lineRule="auto"/>
-        <w:jc w:val="left"/>
-        <w:rPr>
-          <w:rFonts w:ascii="Times New Roman" w:eastAsia="Times New Roman" w:hAnsi="Times New Roman" w:cs="Times New Roman"/>
-          <w:kern w:val="0"/>
-          <w:lang w:eastAsia="sk-SK"/>
-          <w14:ligatures w14:val="none"/>
-        </w:rPr>
-      </w:pPr>
-      <w:r>
-        <w:rPr>
-          <w:rFonts w:ascii="Times New Roman" w:eastAsia="Times New Roman" w:hAnsi="Times New Roman" w:cs="Times New Roman"/>
-          <w:kern w:val="0"/>
-          <w:lang w:eastAsia="sk-SK"/>
-          <w14:ligatures w14:val="none"/>
-        </w:rPr>
-        <w:t xml:space="preserve">režijné náklady SAT </w:t>
-      </w:r>
-      <w:proofErr w:type="spellStart"/>
-      <w:r>
-        <w:rPr>
-          <w:rFonts w:ascii="Times New Roman" w:eastAsia="Times New Roman" w:hAnsi="Times New Roman" w:cs="Times New Roman"/>
-          <w:kern w:val="0"/>
-          <w:lang w:eastAsia="sk-SK"/>
-          <w14:ligatures w14:val="none"/>
-        </w:rPr>
-        <w:t>riešiča</w:t>
-      </w:r>
-      <w:proofErr w:type="spellEnd"/>
-    </w:p>
-    <w:p>
-      <w:pPr>
-        <w:numPr>
-          <w:ilvl w:val="0"/>
-          <w:numId w:val="45"/>
-        </w:numPr>
-        <w:spacing w:before="100" w:beforeAutospacing="1" w:after="100" w:afterAutospacing="1" w:line="240" w:lineRule="auto"/>
-        <w:jc w:val="left"/>
-        <w:rPr>
-          <w:rFonts w:ascii="Times New Roman" w:eastAsia="Times New Roman" w:hAnsi="Times New Roman" w:cs="Times New Roman"/>
-          <w:kern w:val="0"/>
-          <w:lang w:eastAsia="sk-SK"/>
-          <w14:ligatures w14:val="none"/>
-        </w:rPr>
-      </w:pPr>
-      <w:r>
-        <w:rPr>
-          <w:rFonts w:ascii="Times New Roman" w:eastAsia="Times New Roman" w:hAnsi="Times New Roman" w:cs="Times New Roman"/>
-          <w:kern w:val="0"/>
-          <w:lang w:eastAsia="sk-SK"/>
-          <w14:ligatures w14:val="none"/>
-        </w:rPr>
-        <w:t xml:space="preserve">nie vždy rýchlejšie než klasické </w:t>
-      </w:r>
-      <w:proofErr w:type="spellStart"/>
-      <w:r>
-        <w:rPr>
-          <w:rFonts w:ascii="Times New Roman" w:eastAsia="Times New Roman" w:hAnsi="Times New Roman" w:cs="Times New Roman"/>
-          <w:kern w:val="0"/>
-          <w:lang w:eastAsia="sk-SK"/>
-          <w14:ligatures w14:val="none"/>
-        </w:rPr>
-        <w:t>parsovanie</w:t>
-      </w:r>
-      <w:proofErr w:type="spellEnd"/>
-    </w:p>
-    <w:p>
-      <w:pPr>
-        <w:spacing w:line="240" w:lineRule="auto"/>
-        <w:ind w:firstLine="0"/>
-        <w:jc w:val="left"/>
-        <w:rPr>
-          <w:rFonts w:ascii="Times New Roman" w:eastAsia="Times New Roman" w:hAnsi="Times New Roman" w:cs="Times New Roman"/>
-          <w:kern w:val="0"/>
-          <w:lang w:eastAsia="sk-SK"/>
-          <w14:ligatures w14:val="none"/>
-        </w:rPr>
-      </w:pPr>
-      <w:r>
-        <w:rPr>
-          <w:rFonts w:ascii="Times New Roman" w:eastAsia="Times New Roman" w:hAnsi="Times New Roman" w:cs="Times New Roman"/>
-          <w:kern w:val="0"/>
-          <w:lang w:eastAsia="sk-SK"/>
-          <w14:ligatures w14:val="none"/>
-        </w:rPr>
-        <w:pict w14:anchorId="6D5E25B6">
-          <v:rect id="_x0000_i1026" style="width:0;height:1.5pt" o:hralign="center" o:hrstd="t" o:hr="t" fillcolor="#a0a0a0" stroked="f"/>
-        </w:pict>
-      </w:r>
-    </w:p>
-    <w:p>
-      <w:pPr>
-        <w:pStyle w:val="Nadpis1"/>
-        <w:spacing w:after="480"/>
-        <w:rPr>
-          <w:rFonts w:eastAsia="Times New Roman"/>
-          <w:lang w:eastAsia="sk-SK"/>
-        </w:rPr>
-      </w:pPr>
-      <w:bookmarkStart w:id="49" w:name="_Toc224126538"/>
-      <w:r>
-        <w:rPr>
-          <w:rFonts w:eastAsia="Times New Roman"/>
-          <w:lang w:eastAsia="sk-SK"/>
-        </w:rPr>
-        <w:lastRenderedPageBreak/>
-        <w:t>Prehľad súvisiacich prác</w:t>
-      </w:r>
-      <w:bookmarkEnd w:id="49"/>
-    </w:p>
-    <w:p>
-      <w:pPr>
-        <w:spacing w:before="100" w:beforeAutospacing="1" w:after="100" w:afterAutospacing="1" w:line="240" w:lineRule="auto"/>
-        <w:ind w:firstLine="0"/>
-        <w:jc w:val="left"/>
-        <w:rPr>
-          <w:rFonts w:ascii="Times New Roman" w:eastAsia="Times New Roman" w:hAnsi="Times New Roman" w:cs="Times New Roman"/>
-          <w:kern w:val="0"/>
-          <w:lang w:eastAsia="sk-SK"/>
-          <w14:ligatures w14:val="none"/>
-        </w:rPr>
-      </w:pPr>
-      <w:r>
-        <w:rPr>
-          <w:rFonts w:ascii="Times New Roman" w:eastAsia="Times New Roman" w:hAnsi="Times New Roman" w:cs="Times New Roman"/>
-          <w:kern w:val="0"/>
-          <w:lang w:eastAsia="sk-SK"/>
-          <w14:ligatures w14:val="none"/>
-        </w:rPr>
-        <w:t>Stručný prehľad existujúcich prístupov založených na SAT.</w:t>
-      </w:r>
-    </w:p>
-    <w:p>
-      <w:pPr>
-        <w:spacing w:before="100" w:beforeAutospacing="1" w:after="100" w:afterAutospacing="1" w:line="240" w:lineRule="auto"/>
-        <w:ind w:firstLine="0"/>
-        <w:jc w:val="left"/>
-        <w:rPr>
-          <w:rFonts w:ascii="Times New Roman" w:eastAsia="Times New Roman" w:hAnsi="Times New Roman" w:cs="Times New Roman"/>
-          <w:kern w:val="0"/>
-          <w:lang w:eastAsia="sk-SK"/>
-          <w14:ligatures w14:val="none"/>
-        </w:rPr>
-      </w:pPr>
-      <w:r>
-        <w:rPr>
-          <w:rFonts w:ascii="Times New Roman" w:eastAsia="Times New Roman" w:hAnsi="Times New Roman" w:cs="Times New Roman"/>
-          <w:b/>
-          <w:bCs/>
-          <w:kern w:val="0"/>
-          <w:lang w:eastAsia="sk-SK"/>
-          <w14:ligatures w14:val="none"/>
-        </w:rPr>
-        <w:t>Obsah:</w:t>
-      </w:r>
-    </w:p>
-    <w:p>
-      <w:pPr>
-        <w:numPr>
-          <w:ilvl w:val="0"/>
-          <w:numId w:val="46"/>
-        </w:numPr>
-        <w:spacing w:before="100" w:beforeAutospacing="1" w:after="100" w:afterAutospacing="1" w:line="240" w:lineRule="auto"/>
-        <w:jc w:val="left"/>
-        <w:rPr>
-          <w:rFonts w:ascii="Times New Roman" w:eastAsia="Times New Roman" w:hAnsi="Times New Roman" w:cs="Times New Roman"/>
-          <w:kern w:val="0"/>
-          <w:lang w:eastAsia="sk-SK"/>
-          <w14:ligatures w14:val="none"/>
-        </w:rPr>
-      </w:pPr>
-      <w:r>
-        <w:rPr>
-          <w:rFonts w:ascii="Times New Roman" w:eastAsia="Times New Roman" w:hAnsi="Times New Roman" w:cs="Times New Roman"/>
-          <w:kern w:val="0"/>
-          <w:lang w:eastAsia="sk-SK"/>
-          <w14:ligatures w14:val="none"/>
-        </w:rPr>
-        <w:t>krátke zhrnutie každej práce</w:t>
-      </w:r>
-    </w:p>
-    <w:p>
-      <w:pPr>
-        <w:numPr>
-          <w:ilvl w:val="0"/>
-          <w:numId w:val="46"/>
-        </w:numPr>
-        <w:spacing w:before="100" w:beforeAutospacing="1" w:after="100" w:afterAutospacing="1" w:line="240" w:lineRule="auto"/>
-        <w:jc w:val="left"/>
-        <w:rPr>
-          <w:rFonts w:ascii="Times New Roman" w:eastAsia="Times New Roman" w:hAnsi="Times New Roman" w:cs="Times New Roman"/>
-          <w:kern w:val="0"/>
-          <w:lang w:eastAsia="sk-SK"/>
-          <w14:ligatures w14:val="none"/>
-        </w:rPr>
-      </w:pPr>
-      <w:r>
-        <w:rPr>
-          <w:rFonts w:ascii="Times New Roman" w:eastAsia="Times New Roman" w:hAnsi="Times New Roman" w:cs="Times New Roman"/>
-          <w:kern w:val="0"/>
-          <w:lang w:eastAsia="sk-SK"/>
-          <w14:ligatures w14:val="none"/>
-        </w:rPr>
-        <w:t>cieľ redukcie na SAT</w:t>
-      </w:r>
-    </w:p>
-    <w:p>
-      <w:pPr>
-        <w:numPr>
-          <w:ilvl w:val="0"/>
-          <w:numId w:val="46"/>
-        </w:numPr>
-        <w:spacing w:before="100" w:beforeAutospacing="1" w:after="100" w:afterAutospacing="1" w:line="240" w:lineRule="auto"/>
-        <w:jc w:val="left"/>
-        <w:rPr>
-          <w:rFonts w:ascii="Times New Roman" w:eastAsia="Times New Roman" w:hAnsi="Times New Roman" w:cs="Times New Roman"/>
-          <w:kern w:val="0"/>
-          <w:lang w:eastAsia="sk-SK"/>
-          <w14:ligatures w14:val="none"/>
-        </w:rPr>
-      </w:pPr>
-      <w:r>
-        <w:rPr>
-          <w:rFonts w:ascii="Times New Roman" w:eastAsia="Times New Roman" w:hAnsi="Times New Roman" w:cs="Times New Roman"/>
-          <w:kern w:val="0"/>
-          <w:lang w:eastAsia="sk-SK"/>
-          <w14:ligatures w14:val="none"/>
-        </w:rPr>
-        <w:t>základná myšlienka riešenia</w:t>
-      </w:r>
-    </w:p>
-    <w:p>
-      <w:pPr>
-        <w:numPr>
-          <w:ilvl w:val="0"/>
-          <w:numId w:val="46"/>
-        </w:numPr>
-        <w:spacing w:before="100" w:beforeAutospacing="1" w:after="100" w:afterAutospacing="1" w:line="240" w:lineRule="auto"/>
-        <w:jc w:val="left"/>
-        <w:rPr>
-          <w:rFonts w:ascii="Times New Roman" w:eastAsia="Times New Roman" w:hAnsi="Times New Roman" w:cs="Times New Roman"/>
-          <w:kern w:val="0"/>
-          <w:lang w:eastAsia="sk-SK"/>
-          <w14:ligatures w14:val="none"/>
-        </w:rPr>
-      </w:pPr>
-      <w:r>
-        <w:rPr>
-          <w:rFonts w:ascii="Times New Roman" w:eastAsia="Times New Roman" w:hAnsi="Times New Roman" w:cs="Times New Roman"/>
-          <w:kern w:val="0"/>
-          <w:lang w:eastAsia="sk-SK"/>
-          <w14:ligatures w14:val="none"/>
-        </w:rPr>
-        <w:t>rozdiely oproti navrhovanému prístupu</w:t>
-      </w:r>
-    </w:p>
-    <w:p>
-      <w:pPr>
-        <w:rPr>
-          <w:rFonts w:asciiTheme="majorHAnsi" w:hAnsiTheme="majorHAnsi" w:cstheme="majorHAnsi"/>
-          <w:color w:val="EE0000"/>
-        </w:rPr>
-      </w:pPr>
     </w:p>
     <w:p>
       <w:pPr>
         <w:pStyle w:val="Nadpis1bezslovania"/>
         <w:spacing w:after="480"/>
       </w:pPr>
-      <w:bookmarkStart w:id="50" w:name="_Toc224126539"/>
       <w:r>
         <w:lastRenderedPageBreak/>
         <w:t>Literatúra</w:t>
       </w:r>
-      <w:bookmarkEnd w:id="50"/>
+      <w:bookmarkEnd w:id="47"/>
     </w:p>
     <w:p>
       <w:pPr>
@@ -15112,6 +16491,7 @@
         <w:rPr>
           <w:rFonts w:ascii="Times New Roman" w:hAnsi="Times New Roman" w:cs="Times New Roman"/>
           <w:noProof/>
+          <w:kern w:val="0"/>
         </w:rPr>
       </w:pPr>
       <w:r>
@@ -15139,6 +16519,85 @@
           <w:kern w:val="0"/>
         </w:rPr>
         <w:t xml:space="preserve"> . 2002. Vol. 48, no. 5, s. 506–521. .</w:t>
+      </w:r>
+    </w:p>
+    <w:p>
+      <w:pPr>
+        <w:widowControl w:val="0"/>
+        <w:autoSpaceDE w:val="0"/>
+        <w:autoSpaceDN w:val="0"/>
+        <w:adjustRightInd w:val="0"/>
+        <w:spacing w:line="240" w:lineRule="auto"/>
+        <w:rPr>
+          <w:rFonts w:ascii="Times New Roman" w:hAnsi="Times New Roman" w:cs="Times New Roman"/>
+          <w:noProof/>
+          <w:kern w:val="0"/>
+        </w:rPr>
+      </w:pPr>
+      <w:r>
+        <w:rPr>
+          <w:rFonts w:ascii="Times New Roman" w:hAnsi="Times New Roman" w:cs="Times New Roman"/>
+          <w:noProof/>
+          <w:kern w:val="0"/>
+        </w:rPr>
+        <w:t xml:space="preserve">[12] AXELSSON, R. et al. Analyzing Context-Free Grammars Using an Incremental SAT Solver. In </w:t>
+      </w:r>
+      <w:r>
+        <w:rPr>
+          <w:rFonts w:ascii="Times New Roman" w:hAnsi="Times New Roman" w:cs="Times New Roman"/>
+          <w:i/>
+          <w:iCs/>
+          <w:noProof/>
+          <w:kern w:val="0"/>
+        </w:rPr>
+        <w:t>Automata, Languages and Programming</w:t>
+      </w:r>
+      <w:r>
+        <w:rPr>
+          <w:rFonts w:ascii="Times New Roman" w:hAnsi="Times New Roman" w:cs="Times New Roman"/>
+          <w:noProof/>
+          <w:kern w:val="0"/>
+        </w:rPr>
+        <w:t xml:space="preserve"> . Berlin, Heidelberg: Springer Berlin Heidelbergs. 410–422. .</w:t>
+      </w:r>
+    </w:p>
+    <w:p>
+      <w:pPr>
+        <w:widowControl w:val="0"/>
+        <w:autoSpaceDE w:val="0"/>
+        <w:autoSpaceDN w:val="0"/>
+        <w:adjustRightInd w:val="0"/>
+        <w:spacing w:line="240" w:lineRule="auto"/>
+        <w:rPr>
+          <w:rFonts w:ascii="Times New Roman" w:hAnsi="Times New Roman" w:cs="Times New Roman"/>
+          <w:noProof/>
+        </w:rPr>
+      </w:pPr>
+      <w:r>
+        <w:rPr>
+          <w:rFonts w:ascii="Times New Roman" w:hAnsi="Times New Roman" w:cs="Times New Roman"/>
+          <w:noProof/>
+          <w:kern w:val="0"/>
+        </w:rPr>
+        <w:t xml:space="preserve">[13] IMADA, K. - NAKAMURA, K. Learning Context Free Grammars by Using SAT Solvers. In </w:t>
+      </w:r>
+      <w:r>
+        <w:rPr>
+          <w:rFonts w:ascii="Times New Roman" w:hAnsi="Times New Roman" w:cs="Times New Roman"/>
+          <w:i/>
+          <w:iCs/>
+          <w:noProof/>
+          <w:kern w:val="0"/>
+        </w:rPr>
+        <w:t>2009 International Conference on Machine Learning and Applications</w:t>
+      </w:r>
+      <w:r>
+        <w:rPr>
+          <w:rFonts w:ascii="Times New Roman" w:hAnsi="Times New Roman" w:cs="Times New Roman"/>
+          <w:noProof/>
+          <w:kern w:val="0"/>
+        </w:rPr>
+        <w:t xml:space="preserve"> . [s.l.]: IEEE, 2009. s. 267–272. .</w:t>
       </w:r>
     </w:p>
     <w:p>
@@ -17458,6 +18917,155 @@
     </w:lvl>
   </w:abstractNum>
   <w:abstractNum w:abstractNumId="25" w15:restartNumberingAfterBreak="0">
+    <w:nsid w:val="2FDE0EC6"/>
+    <w:multiLevelType w:val="multilevel"/>
+    <w:tmpl w:val="E6142492"/>
+    <w:lvl w:ilvl="0">
+      <w:start w:val="1"/>
+      <w:numFmt w:val="bullet"/>
+      <w:lvlText w:val=""/>
+      <w:lvlJc w:val="left"/>
+      <w:pPr>
+        <w:tabs>
+          <w:tab w:val="num" w:pos="720"/>
+        </w:tabs>
+        <w:ind w:left="720" w:hanging="360"/>
+      </w:pPr>
+      <w:rPr>
+        <w:rFonts w:ascii="Symbol" w:hAnsi="Symbol" w:hint="default"/>
+        <w:sz w:val="20"/>
+      </w:rPr>
+    </w:lvl>
+    <w:lvl w:ilvl="1" w:tentative="1">
+      <w:start w:val="1"/>
+      <w:numFmt w:val="bullet"/>
+      <w:lvlText w:val="o"/>
+      <w:lvlJc w:val="left"/>
+      <w:pPr>
+        <w:tabs>
+          <w:tab w:val="num" w:pos="1440"/>
+        </w:tabs>
+        <w:ind w:left="1440" w:hanging="360"/>
+      </w:pPr>
+      <w:rPr>
+        <w:rFonts w:ascii="Courier New" w:hAnsi="Courier New" w:hint="default"/>
+        <w:sz w:val="20"/>
+      </w:rPr>
+    </w:lvl>
+    <w:lvl w:ilvl="2" w:tentative="1">
+      <w:start w:val="1"/>
+      <w:numFmt w:val="bullet"/>
+      <w:lvlText w:val=""/>
+      <w:lvlJc w:val="left"/>
+      <w:pPr>
+        <w:tabs>
+          <w:tab w:val="num" w:pos="2160"/>
+        </w:tabs>
+        <w:ind w:left="2160" w:hanging="360"/>
+      </w:pPr>
+      <w:rPr>
+        <w:rFonts w:ascii="Wingdings" w:hAnsi="Wingdings" w:hint="default"/>
+        <w:sz w:val="20"/>
+      </w:rPr>
+    </w:lvl>
+    <w:lvl w:ilvl="3" w:tentative="1">
+      <w:start w:val="1"/>
+      <w:numFmt w:val="bullet"/>
+      <w:lvlText w:val=""/>
+      <w:lvlJc w:val="left"/>
+      <w:pPr>
+        <w:tabs>
+          <w:tab w:val="num" w:pos="2880"/>
+        </w:tabs>
+        <w:ind w:left="2880" w:hanging="360"/>
+      </w:pPr>
+      <w:rPr>
+        <w:rFonts w:ascii="Wingdings" w:hAnsi="Wingdings" w:hint="default"/>
+        <w:sz w:val="20"/>
+      </w:rPr>
+    </w:lvl>
+    <w:lvl w:ilvl="4" w:tentative="1">
+      <w:start w:val="1"/>
+      <w:numFmt w:val="bullet"/>
+      <w:lvlText w:val=""/>
+      <w:lvlJc w:val="left"/>
+      <w:pPr>
+        <w:tabs>
+          <w:tab w:val="num" w:pos="3600"/>
+        </w:tabs>
+        <w:ind w:left="3600" w:hanging="360"/>
+      </w:pPr>
+      <w:rPr>
+        <w:rFonts w:ascii="Wingdings" w:hAnsi="Wingdings" w:hint="default"/>
+        <w:sz w:val="20"/>
+      </w:rPr>
+    </w:lvl>
+    <w:lvl w:ilvl="5" w:tentative="1">
+      <w:start w:val="1"/>
+      <w:numFmt w:val="bullet"/>
+      <w:lvlText w:val=""/>
+      <w:lvlJc w:val="left"/>
+      <w:pPr>
+        <w:tabs>
+          <w:tab w:val="num" w:pos="4320"/>
+        </w:tabs>
+        <w:ind w:left="4320" w:hanging="360"/>
+      </w:pPr>
+      <w:rPr>
+        <w:rFonts w:ascii="Wingdings" w:hAnsi="Wingdings" w:hint="default"/>
+        <w:sz w:val="20"/>
+      </w:rPr>
+    </w:lvl>
+    <w:lvl w:ilvl="6" w:tentative="1">
+      <w:start w:val="1"/>
+      <w:numFmt w:val="bullet"/>
+      <w:lvlText w:val=""/>
+      <w:lvlJc w:val="left"/>
+      <w:pPr>
+        <w:tabs>
+          <w:tab w:val="num" w:pos="5040"/>
+        </w:tabs>
+        <w:ind w:left="5040" w:hanging="360"/>
+      </w:pPr>
+      <w:rPr>
+        <w:rFonts w:ascii="Wingdings" w:hAnsi="Wingdings" w:hint="default"/>
+        <w:sz w:val="20"/>
+      </w:rPr>
+    </w:lvl>
+    <w:lvl w:ilvl="7" w:tentative="1">
+      <w:start w:val="1"/>
+      <w:numFmt w:val="bullet"/>
+      <w:lvlText w:val=""/>
+      <w:lvlJc w:val="left"/>
+      <w:pPr>
+        <w:tabs>
+          <w:tab w:val="num" w:pos="5760"/>
+        </w:tabs>
+        <w:ind w:left="5760" w:hanging="360"/>
+      </w:pPr>
+      <w:rPr>
+        <w:rFonts w:ascii="Wingdings" w:hAnsi="Wingdings" w:hint="default"/>
+        <w:sz w:val="20"/>
+      </w:rPr>
+    </w:lvl>
+    <w:lvl w:ilvl="8" w:tentative="1">
+      <w:start w:val="1"/>
+      <w:numFmt w:val="bullet"/>
+      <w:lvlText w:val=""/>
+      <w:lvlJc w:val="left"/>
+      <w:pPr>
+        <w:tabs>
+          <w:tab w:val="num" w:pos="6480"/>
+        </w:tabs>
+        <w:ind w:left="6480" w:hanging="360"/>
+      </w:pPr>
+      <w:rPr>
+        <w:rFonts w:ascii="Wingdings" w:hAnsi="Wingdings" w:hint="default"/>
+        <w:sz w:val="20"/>
+      </w:rPr>
+    </w:lvl>
+  </w:abstractNum>
+  <w:abstractNum w:abstractNumId="26" w15:restartNumberingAfterBreak="0">
     <w:nsid w:val="337414E9"/>
     <w:multiLevelType w:val="multilevel"/>
     <w:tmpl w:val="80EC471A"/>
@@ -17570,7 +19178,7 @@
       </w:rPr>
     </w:lvl>
   </w:abstractNum>
-  <w:abstractNum w:abstractNumId="26" w15:restartNumberingAfterBreak="0">
+  <w:abstractNum w:abstractNumId="27" w15:restartNumberingAfterBreak="0">
     <w:nsid w:val="34A258B7"/>
     <w:multiLevelType w:val="multilevel"/>
     <w:tmpl w:val="7D06DC68"/>
@@ -17719,7 +19327,156 @@
       </w:rPr>
     </w:lvl>
   </w:abstractNum>
-  <w:abstractNum w:abstractNumId="27" w15:restartNumberingAfterBreak="0">
+  <w:abstractNum w:abstractNumId="28" w15:restartNumberingAfterBreak="0">
+    <w:nsid w:val="3B1C655E"/>
+    <w:multiLevelType w:val="multilevel"/>
+    <w:tmpl w:val="375A0394"/>
+    <w:lvl w:ilvl="0">
+      <w:start w:val="1"/>
+      <w:numFmt w:val="bullet"/>
+      <w:lvlText w:val=""/>
+      <w:lvlJc w:val="left"/>
+      <w:pPr>
+        <w:tabs>
+          <w:tab w:val="num" w:pos="720"/>
+        </w:tabs>
+        <w:ind w:left="720" w:hanging="360"/>
+      </w:pPr>
+      <w:rPr>
+        <w:rFonts w:ascii="Symbol" w:hAnsi="Symbol" w:hint="default"/>
+        <w:sz w:val="20"/>
+      </w:rPr>
+    </w:lvl>
+    <w:lvl w:ilvl="1" w:tentative="1">
+      <w:start w:val="1"/>
+      <w:numFmt w:val="bullet"/>
+      <w:lvlText w:val="o"/>
+      <w:lvlJc w:val="left"/>
+      <w:pPr>
+        <w:tabs>
+          <w:tab w:val="num" w:pos="1440"/>
+        </w:tabs>
+        <w:ind w:left="1440" w:hanging="360"/>
+      </w:pPr>
+      <w:rPr>
+        <w:rFonts w:ascii="Courier New" w:hAnsi="Courier New" w:hint="default"/>
+        <w:sz w:val="20"/>
+      </w:rPr>
+    </w:lvl>
+    <w:lvl w:ilvl="2" w:tentative="1">
+      <w:start w:val="1"/>
+      <w:numFmt w:val="bullet"/>
+      <w:lvlText w:val=""/>
+      <w:lvlJc w:val="left"/>
+      <w:pPr>
+        <w:tabs>
+          <w:tab w:val="num" w:pos="2160"/>
+        </w:tabs>
+        <w:ind w:left="2160" w:hanging="360"/>
+      </w:pPr>
+      <w:rPr>
+        <w:rFonts w:ascii="Wingdings" w:hAnsi="Wingdings" w:hint="default"/>
+        <w:sz w:val="20"/>
+      </w:rPr>
+    </w:lvl>
+    <w:lvl w:ilvl="3" w:tentative="1">
+      <w:start w:val="1"/>
+      <w:numFmt w:val="bullet"/>
+      <w:lvlText w:val=""/>
+      <w:lvlJc w:val="left"/>
+      <w:pPr>
+        <w:tabs>
+          <w:tab w:val="num" w:pos="2880"/>
+        </w:tabs>
+        <w:ind w:left="2880" w:hanging="360"/>
+      </w:pPr>
+      <w:rPr>
+        <w:rFonts w:ascii="Wingdings" w:hAnsi="Wingdings" w:hint="default"/>
+        <w:sz w:val="20"/>
+      </w:rPr>
+    </w:lvl>
+    <w:lvl w:ilvl="4" w:tentative="1">
+      <w:start w:val="1"/>
+      <w:numFmt w:val="bullet"/>
+      <w:lvlText w:val=""/>
+      <w:lvlJc w:val="left"/>
+      <w:pPr>
+        <w:tabs>
+          <w:tab w:val="num" w:pos="3600"/>
+        </w:tabs>
+        <w:ind w:left="3600" w:hanging="360"/>
+      </w:pPr>
+      <w:rPr>
+        <w:rFonts w:ascii="Wingdings" w:hAnsi="Wingdings" w:hint="default"/>
+        <w:sz w:val="20"/>
+      </w:rPr>
+    </w:lvl>
+    <w:lvl w:ilvl="5" w:tentative="1">
+      <w:start w:val="1"/>
+      <w:numFmt w:val="bullet"/>
+      <w:lvlText w:val=""/>
+      <w:lvlJc w:val="left"/>
+      <w:pPr>
+        <w:tabs>
+          <w:tab w:val="num" w:pos="4320"/>
+        </w:tabs>
+        <w:ind w:left="4320" w:hanging="360"/>
+      </w:pPr>
+      <w:rPr>
+        <w:rFonts w:ascii="Wingdings" w:hAnsi="Wingdings" w:hint="default"/>
+        <w:sz w:val="20"/>
+      </w:rPr>
+    </w:lvl>
+    <w:lvl w:ilvl="6" w:tentative="1">
+      <w:start w:val="1"/>
+      <w:numFmt w:val="bullet"/>
+      <w:lvlText w:val=""/>
+      <w:lvlJc w:val="left"/>
+      <w:pPr>
+        <w:tabs>
+          <w:tab w:val="num" w:pos="5040"/>
+        </w:tabs>
+        <w:ind w:left="5040" w:hanging="360"/>
+      </w:pPr>
+      <w:rPr>
+        <w:rFonts w:ascii="Wingdings" w:hAnsi="Wingdings" w:hint="default"/>
+        <w:sz w:val="20"/>
+      </w:rPr>
+    </w:lvl>
+    <w:lvl w:ilvl="7" w:tentative="1">
+      <w:start w:val="1"/>
+      <w:numFmt w:val="bullet"/>
+      <w:lvlText w:val=""/>
+      <w:lvlJc w:val="left"/>
+      <w:pPr>
+        <w:tabs>
+          <w:tab w:val="num" w:pos="5760"/>
+        </w:tabs>
+        <w:ind w:left="5760" w:hanging="360"/>
+      </w:pPr>
+      <w:rPr>
+        <w:rFonts w:ascii="Wingdings" w:hAnsi="Wingdings" w:hint="default"/>
+        <w:sz w:val="20"/>
+      </w:rPr>
+    </w:lvl>
+    <w:lvl w:ilvl="8" w:tentative="1">
+      <w:start w:val="1"/>
+      <w:numFmt w:val="bullet"/>
+      <w:lvlText w:val=""/>
+      <w:lvlJc w:val="left"/>
+      <w:pPr>
+        <w:tabs>
+          <w:tab w:val="num" w:pos="6480"/>
+        </w:tabs>
+        <w:ind w:left="6480" w:hanging="360"/>
+      </w:pPr>
+      <w:rPr>
+        <w:rFonts w:ascii="Wingdings" w:hAnsi="Wingdings" w:hint="default"/>
+        <w:sz w:val="20"/>
+      </w:rPr>
+    </w:lvl>
+  </w:abstractNum>
+  <w:abstractNum w:abstractNumId="29" w15:restartNumberingAfterBreak="0">
     <w:nsid w:val="41AC2004"/>
     <w:multiLevelType w:val="multilevel"/>
     <w:tmpl w:val="041B001D"/>
@@ -17805,7 +19562,7 @@
       </w:pPr>
     </w:lvl>
   </w:abstractNum>
-  <w:abstractNum w:abstractNumId="28" w15:restartNumberingAfterBreak="0">
+  <w:abstractNum w:abstractNumId="30" w15:restartNumberingAfterBreak="0">
     <w:nsid w:val="4242221A"/>
     <w:multiLevelType w:val="hybridMultilevel"/>
     <w:tmpl w:val="03F8988A"/>
@@ -17894,7 +19651,7 @@
       </w:pPr>
     </w:lvl>
   </w:abstractNum>
-  <w:abstractNum w:abstractNumId="29" w15:restartNumberingAfterBreak="0">
+  <w:abstractNum w:abstractNumId="31" w15:restartNumberingAfterBreak="0">
     <w:nsid w:val="42475C47"/>
     <w:multiLevelType w:val="multilevel"/>
     <w:tmpl w:val="041B001D"/>
@@ -17981,7 +19738,7 @@
       </w:pPr>
     </w:lvl>
   </w:abstractNum>
-  <w:abstractNum w:abstractNumId="30" w15:restartNumberingAfterBreak="0">
+  <w:abstractNum w:abstractNumId="32" w15:restartNumberingAfterBreak="0">
     <w:nsid w:val="44301E82"/>
     <w:multiLevelType w:val="hybridMultilevel"/>
     <w:tmpl w:val="29E4577E"/>
@@ -18067,7 +19824,7 @@
       </w:pPr>
     </w:lvl>
   </w:abstractNum>
-  <w:abstractNum w:abstractNumId="31" w15:restartNumberingAfterBreak="0">
+  <w:abstractNum w:abstractNumId="33" w15:restartNumberingAfterBreak="0">
     <w:nsid w:val="44C571BD"/>
     <w:multiLevelType w:val="hybridMultilevel"/>
     <w:tmpl w:val="5052E7F2"/>
@@ -18180,7 +19937,7 @@
       </w:rPr>
     </w:lvl>
   </w:abstractNum>
-  <w:abstractNum w:abstractNumId="32" w15:restartNumberingAfterBreak="0">
+  <w:abstractNum w:abstractNumId="34" w15:restartNumberingAfterBreak="0">
     <w:nsid w:val="4AF27299"/>
     <w:multiLevelType w:val="hybridMultilevel"/>
     <w:tmpl w:val="CE087EBA"/>
@@ -18293,7 +20050,156 @@
       </w:rPr>
     </w:lvl>
   </w:abstractNum>
-  <w:abstractNum w:abstractNumId="33" w15:restartNumberingAfterBreak="0">
+  <w:abstractNum w:abstractNumId="35" w15:restartNumberingAfterBreak="0">
+    <w:nsid w:val="545F0553"/>
+    <w:multiLevelType w:val="multilevel"/>
+    <w:tmpl w:val="EB629918"/>
+    <w:lvl w:ilvl="0">
+      <w:start w:val="1"/>
+      <w:numFmt w:val="bullet"/>
+      <w:lvlText w:val=""/>
+      <w:lvlJc w:val="left"/>
+      <w:pPr>
+        <w:tabs>
+          <w:tab w:val="num" w:pos="720"/>
+        </w:tabs>
+        <w:ind w:left="720" w:hanging="360"/>
+      </w:pPr>
+      <w:rPr>
+        <w:rFonts w:ascii="Symbol" w:hAnsi="Symbol" w:hint="default"/>
+        <w:sz w:val="20"/>
+      </w:rPr>
+    </w:lvl>
+    <w:lvl w:ilvl="1" w:tentative="1">
+      <w:start w:val="1"/>
+      <w:numFmt w:val="bullet"/>
+      <w:lvlText w:val="o"/>
+      <w:lvlJc w:val="left"/>
+      <w:pPr>
+        <w:tabs>
+          <w:tab w:val="num" w:pos="1440"/>
+        </w:tabs>
+        <w:ind w:left="1440" w:hanging="360"/>
+      </w:pPr>
+      <w:rPr>
+        <w:rFonts w:ascii="Courier New" w:hAnsi="Courier New" w:hint="default"/>
+        <w:sz w:val="20"/>
+      </w:rPr>
+    </w:lvl>
+    <w:lvl w:ilvl="2" w:tentative="1">
+      <w:start w:val="1"/>
+      <w:numFmt w:val="bullet"/>
+      <w:lvlText w:val=""/>
+      <w:lvlJc w:val="left"/>
+      <w:pPr>
+        <w:tabs>
+          <w:tab w:val="num" w:pos="2160"/>
+        </w:tabs>
+        <w:ind w:left="2160" w:hanging="360"/>
+      </w:pPr>
+      <w:rPr>
+        <w:rFonts w:ascii="Wingdings" w:hAnsi="Wingdings" w:hint="default"/>
+        <w:sz w:val="20"/>
+      </w:rPr>
+    </w:lvl>
+    <w:lvl w:ilvl="3" w:tentative="1">
+      <w:start w:val="1"/>
+      <w:numFmt w:val="bullet"/>
+      <w:lvlText w:val=""/>
+      <w:lvlJc w:val="left"/>
+      <w:pPr>
+        <w:tabs>
+          <w:tab w:val="num" w:pos="2880"/>
+        </w:tabs>
+        <w:ind w:left="2880" w:hanging="360"/>
+      </w:pPr>
+      <w:rPr>
+        <w:rFonts w:ascii="Wingdings" w:hAnsi="Wingdings" w:hint="default"/>
+        <w:sz w:val="20"/>
+      </w:rPr>
+    </w:lvl>
+    <w:lvl w:ilvl="4" w:tentative="1">
+      <w:start w:val="1"/>
+      <w:numFmt w:val="bullet"/>
+      <w:lvlText w:val=""/>
+      <w:lvlJc w:val="left"/>
+      <w:pPr>
+        <w:tabs>
+          <w:tab w:val="num" w:pos="3600"/>
+        </w:tabs>
+        <w:ind w:left="3600" w:hanging="360"/>
+      </w:pPr>
+      <w:rPr>
+        <w:rFonts w:ascii="Wingdings" w:hAnsi="Wingdings" w:hint="default"/>
+        <w:sz w:val="20"/>
+      </w:rPr>
+    </w:lvl>
+    <w:lvl w:ilvl="5" w:tentative="1">
+      <w:start w:val="1"/>
+      <w:numFmt w:val="bullet"/>
+      <w:lvlText w:val=""/>
+      <w:lvlJc w:val="left"/>
+      <w:pPr>
+        <w:tabs>
+          <w:tab w:val="num" w:pos="4320"/>
+        </w:tabs>
+        <w:ind w:left="4320" w:hanging="360"/>
+      </w:pPr>
+      <w:rPr>
+        <w:rFonts w:ascii="Wingdings" w:hAnsi="Wingdings" w:hint="default"/>
+        <w:sz w:val="20"/>
+      </w:rPr>
+    </w:lvl>
+    <w:lvl w:ilvl="6" w:tentative="1">
+      <w:start w:val="1"/>
+      <w:numFmt w:val="bullet"/>
+      <w:lvlText w:val=""/>
+      <w:lvlJc w:val="left"/>
+      <w:pPr>
+        <w:tabs>
+          <w:tab w:val="num" w:pos="5040"/>
+        </w:tabs>
+        <w:ind w:left="5040" w:hanging="360"/>
+      </w:pPr>
+      <w:rPr>
+        <w:rFonts w:ascii="Wingdings" w:hAnsi="Wingdings" w:hint="default"/>
+        <w:sz w:val="20"/>
+      </w:rPr>
+    </w:lvl>
+    <w:lvl w:ilvl="7" w:tentative="1">
+      <w:start w:val="1"/>
+      <w:numFmt w:val="bullet"/>
+      <w:lvlText w:val=""/>
+      <w:lvlJc w:val="left"/>
+      <w:pPr>
+        <w:tabs>
+          <w:tab w:val="num" w:pos="5760"/>
+        </w:tabs>
+        <w:ind w:left="5760" w:hanging="360"/>
+      </w:pPr>
+      <w:rPr>
+        <w:rFonts w:ascii="Wingdings" w:hAnsi="Wingdings" w:hint="default"/>
+        <w:sz w:val="20"/>
+      </w:rPr>
+    </w:lvl>
+    <w:lvl w:ilvl="8" w:tentative="1">
+      <w:start w:val="1"/>
+      <w:numFmt w:val="bullet"/>
+      <w:lvlText w:val=""/>
+      <w:lvlJc w:val="left"/>
+      <w:pPr>
+        <w:tabs>
+          <w:tab w:val="num" w:pos="6480"/>
+        </w:tabs>
+        <w:ind w:left="6480" w:hanging="360"/>
+      </w:pPr>
+      <w:rPr>
+        <w:rFonts w:ascii="Wingdings" w:hAnsi="Wingdings" w:hint="default"/>
+        <w:sz w:val="20"/>
+      </w:rPr>
+    </w:lvl>
+  </w:abstractNum>
+  <w:abstractNum w:abstractNumId="36" w15:restartNumberingAfterBreak="0">
     <w:nsid w:val="560C4C81"/>
     <w:multiLevelType w:val="multilevel"/>
     <w:tmpl w:val="B70E42AA"/>
@@ -18411,7 +20317,7 @@
       </w:rPr>
     </w:lvl>
   </w:abstractNum>
-  <w:abstractNum w:abstractNumId="34" w15:restartNumberingAfterBreak="0">
+  <w:abstractNum w:abstractNumId="37" w15:restartNumberingAfterBreak="0">
     <w:nsid w:val="5CF1586A"/>
     <w:multiLevelType w:val="multilevel"/>
     <w:tmpl w:val="2722A28E"/>
@@ -18560,7 +20466,7 @@
       </w:rPr>
     </w:lvl>
   </w:abstractNum>
-  <w:abstractNum w:abstractNumId="35" w15:restartNumberingAfterBreak="0">
+  <w:abstractNum w:abstractNumId="38" w15:restartNumberingAfterBreak="0">
     <w:nsid w:val="611F40A2"/>
     <w:multiLevelType w:val="multilevel"/>
     <w:tmpl w:val="041B001D"/>
@@ -18646,7 +20552,7 @@
       </w:pPr>
     </w:lvl>
   </w:abstractNum>
-  <w:abstractNum w:abstractNumId="36" w15:restartNumberingAfterBreak="0">
+  <w:abstractNum w:abstractNumId="39" w15:restartNumberingAfterBreak="0">
     <w:nsid w:val="62593EFE"/>
     <w:multiLevelType w:val="hybridMultilevel"/>
     <w:tmpl w:val="B7AE2BDE"/>
@@ -18732,7 +20638,120 @@
       </w:pPr>
     </w:lvl>
   </w:abstractNum>
-  <w:abstractNum w:abstractNumId="37" w15:restartNumberingAfterBreak="0">
+  <w:abstractNum w:abstractNumId="40" w15:restartNumberingAfterBreak="0">
+    <w:nsid w:val="63283CAD"/>
+    <w:multiLevelType w:val="hybridMultilevel"/>
+    <w:tmpl w:val="D0304134"/>
+    <w:lvl w:ilvl="0" w:tplc="041B0001">
+      <w:start w:val="1"/>
+      <w:numFmt w:val="bullet"/>
+      <w:lvlText w:val=""/>
+      <w:lvlJc w:val="left"/>
+      <w:pPr>
+        <w:ind w:left="360" w:hanging="360"/>
+      </w:pPr>
+      <w:rPr>
+        <w:rFonts w:ascii="Symbol" w:hAnsi="Symbol" w:hint="default"/>
+      </w:rPr>
+    </w:lvl>
+    <w:lvl w:ilvl="1" w:tplc="041B0003">
+      <w:start w:val="1"/>
+      <w:numFmt w:val="bullet"/>
+      <w:lvlText w:val="o"/>
+      <w:lvlJc w:val="left"/>
+      <w:pPr>
+        <w:ind w:left="1080" w:hanging="360"/>
+      </w:pPr>
+      <w:rPr>
+        <w:rFonts w:ascii="Courier New" w:hAnsi="Courier New" w:cs="Courier New" w:hint="default"/>
+      </w:rPr>
+    </w:lvl>
+    <w:lvl w:ilvl="2" w:tplc="041B0005" w:tentative="1">
+      <w:start w:val="1"/>
+      <w:numFmt w:val="bullet"/>
+      <w:lvlText w:val=""/>
+      <w:lvlJc w:val="left"/>
+      <w:pPr>
+        <w:ind w:left="1800" w:hanging="360"/>
+      </w:pPr>
+      <w:rPr>
+        <w:rFonts w:ascii="Wingdings" w:hAnsi="Wingdings" w:hint="default"/>
+      </w:rPr>
+    </w:lvl>
+    <w:lvl w:ilvl="3" w:tplc="041B0001" w:tentative="1">
+      <w:start w:val="1"/>
+      <w:numFmt w:val="bullet"/>
+      <w:lvlText w:val=""/>
+      <w:lvlJc w:val="left"/>
+      <w:pPr>
+        <w:ind w:left="2520" w:hanging="360"/>
+      </w:pPr>
+      <w:rPr>
+        <w:rFonts w:ascii="Symbol" w:hAnsi="Symbol" w:hint="default"/>
+      </w:rPr>
+    </w:lvl>
+    <w:lvl w:ilvl="4" w:tplc="041B0003" w:tentative="1">
+      <w:start w:val="1"/>
+      <w:numFmt w:val="bullet"/>
+      <w:lvlText w:val="o"/>
+      <w:lvlJc w:val="left"/>
+      <w:pPr>
+        <w:ind w:left="3240" w:hanging="360"/>
+      </w:pPr>
+      <w:rPr>
+        <w:rFonts w:ascii="Courier New" w:hAnsi="Courier New" w:cs="Courier New" w:hint="default"/>
+      </w:rPr>
+    </w:lvl>
+    <w:lvl w:ilvl="5" w:tplc="041B0005" w:tentative="1">
+      <w:start w:val="1"/>
+      <w:numFmt w:val="bullet"/>
+      <w:lvlText w:val=""/>
+      <w:lvlJc w:val="left"/>
+      <w:pPr>
+        <w:ind w:left="3960" w:hanging="360"/>
+      </w:pPr>
+      <w:rPr>
+        <w:rFonts w:ascii="Wingdings" w:hAnsi="Wingdings" w:hint="default"/>
+      </w:rPr>
+    </w:lvl>
+    <w:lvl w:ilvl="6" w:tplc="041B0001" w:tentative="1">
+      <w:start w:val="1"/>
+      <w:numFmt w:val="bullet"/>
+      <w:lvlText w:val=""/>
+      <w:lvlJc w:val="left"/>
+      <w:pPr>
+        <w:ind w:left="4680" w:hanging="360"/>
+      </w:pPr>
+      <w:rPr>
+        <w:rFonts w:ascii="Symbol" w:hAnsi="Symbol" w:hint="default"/>
+      </w:rPr>
+    </w:lvl>
+    <w:lvl w:ilvl="7" w:tplc="041B0003" w:tentative="1">
+      <w:start w:val="1"/>
+      <w:numFmt w:val="bullet"/>
+      <w:lvlText w:val="o"/>
+      <w:lvlJc w:val="left"/>
+      <w:pPr>
+        <w:ind w:left="5400" w:hanging="360"/>
+      </w:pPr>
+      <w:rPr>
+        <w:rFonts w:ascii="Courier New" w:hAnsi="Courier New" w:cs="Courier New" w:hint="default"/>
+      </w:rPr>
+    </w:lvl>
+    <w:lvl w:ilvl="8" w:tplc="041B0005" w:tentative="1">
+      <w:start w:val="1"/>
+      <w:numFmt w:val="bullet"/>
+      <w:lvlText w:val=""/>
+      <w:lvlJc w:val="left"/>
+      <w:pPr>
+        <w:ind w:left="6120" w:hanging="360"/>
+      </w:pPr>
+      <w:rPr>
+        <w:rFonts w:ascii="Wingdings" w:hAnsi="Wingdings" w:hint="default"/>
+      </w:rPr>
+    </w:lvl>
+  </w:abstractNum>
+  <w:abstractNum w:abstractNumId="41" w15:restartNumberingAfterBreak="0">
     <w:nsid w:val="633D6C51"/>
     <w:multiLevelType w:val="hybridMultilevel"/>
     <w:tmpl w:val="807472A4"/>
@@ -18818,7 +20837,7 @@
       </w:pPr>
     </w:lvl>
   </w:abstractNum>
-  <w:abstractNum w:abstractNumId="38" w15:restartNumberingAfterBreak="0">
+  <w:abstractNum w:abstractNumId="42" w15:restartNumberingAfterBreak="0">
     <w:nsid w:val="6416608A"/>
     <w:multiLevelType w:val="hybridMultilevel"/>
     <w:tmpl w:val="BFC45DC8"/>
@@ -18931,7 +20950,119 @@
       </w:rPr>
     </w:lvl>
   </w:abstractNum>
-  <w:abstractNum w:abstractNumId="39" w15:restartNumberingAfterBreak="0">
+  <w:abstractNum w:abstractNumId="43" w15:restartNumberingAfterBreak="0">
+    <w:nsid w:val="66CE3E0C"/>
+    <w:multiLevelType w:val="hybridMultilevel"/>
+    <w:tmpl w:val="5554F472"/>
+    <w:lvl w:ilvl="0" w:tplc="2EA03A20">
+      <w:numFmt w:val="bullet"/>
+      <w:lvlText w:val="-"/>
+      <w:lvlJc w:val="left"/>
+      <w:pPr>
+        <w:ind w:left="720" w:hanging="360"/>
+      </w:pPr>
+      <w:rPr>
+        <w:rFonts w:ascii="Times New Roman" w:eastAsiaTheme="minorHAnsi" w:hAnsi="Times New Roman" w:cs="Times New Roman" w:hint="default"/>
+      </w:rPr>
+    </w:lvl>
+    <w:lvl w:ilvl="1" w:tplc="041B0003" w:tentative="1">
+      <w:start w:val="1"/>
+      <w:numFmt w:val="bullet"/>
+      <w:lvlText w:val="o"/>
+      <w:lvlJc w:val="left"/>
+      <w:pPr>
+        <w:ind w:left="1440" w:hanging="360"/>
+      </w:pPr>
+      <w:rPr>
+        <w:rFonts w:ascii="Courier New" w:hAnsi="Courier New" w:cs="Courier New" w:hint="default"/>
+      </w:rPr>
+    </w:lvl>
+    <w:lvl w:ilvl="2" w:tplc="041B0005" w:tentative="1">
+      <w:start w:val="1"/>
+      <w:numFmt w:val="bullet"/>
+      <w:lvlText w:val=""/>
+      <w:lvlJc w:val="left"/>
+      <w:pPr>
+        <w:ind w:left="2160" w:hanging="360"/>
+      </w:pPr>
+      <w:rPr>
+        <w:rFonts w:ascii="Wingdings" w:hAnsi="Wingdings" w:hint="default"/>
+      </w:rPr>
+    </w:lvl>
+    <w:lvl w:ilvl="3" w:tplc="041B0001" w:tentative="1">
+      <w:start w:val="1"/>
+      <w:numFmt w:val="bullet"/>
+      <w:lvlText w:val=""/>
+      <w:lvlJc w:val="left"/>
+      <w:pPr>
+        <w:ind w:left="2880" w:hanging="360"/>
+      </w:pPr>
+      <w:rPr>
+        <w:rFonts w:ascii="Symbol" w:hAnsi="Symbol" w:hint="default"/>
+      </w:rPr>
+    </w:lvl>
+    <w:lvl w:ilvl="4" w:tplc="041B0003" w:tentative="1">
+      <w:start w:val="1"/>
+      <w:numFmt w:val="bullet"/>
+      <w:lvlText w:val="o"/>
+      <w:lvlJc w:val="left"/>
+      <w:pPr>
+        <w:ind w:left="3600" w:hanging="360"/>
+      </w:pPr>
+      <w:rPr>
+        <w:rFonts w:ascii="Courier New" w:hAnsi="Courier New" w:cs="Courier New" w:hint="default"/>
+      </w:rPr>
+    </w:lvl>
+    <w:lvl w:ilvl="5" w:tplc="041B0005" w:tentative="1">
+      <w:start w:val="1"/>
+      <w:numFmt w:val="bullet"/>
+      <w:lvlText w:val=""/>
+      <w:lvlJc w:val="left"/>
+      <w:pPr>
+        <w:ind w:left="4320" w:hanging="360"/>
+      </w:pPr>
+      <w:rPr>
+        <w:rFonts w:ascii="Wingdings" w:hAnsi="Wingdings" w:hint="default"/>
+      </w:rPr>
+    </w:lvl>
+    <w:lvl w:ilvl="6" w:tplc="041B0001" w:tentative="1">
+      <w:start w:val="1"/>
+      <w:numFmt w:val="bullet"/>
+      <w:lvlText w:val=""/>
+      <w:lvlJc w:val="left"/>
+      <w:pPr>
+        <w:ind w:left="5040" w:hanging="360"/>
+      </w:pPr>
+      <w:rPr>
+        <w:rFonts w:ascii="Symbol" w:hAnsi="Symbol" w:hint="default"/>
+      </w:rPr>
+    </w:lvl>
+    <w:lvl w:ilvl="7" w:tplc="041B0003" w:tentative="1">
+      <w:start w:val="1"/>
+      <w:numFmt w:val="bullet"/>
+      <w:lvlText w:val="o"/>
+      <w:lvlJc w:val="left"/>
+      <w:pPr>
+        <w:ind w:left="5760" w:hanging="360"/>
+      </w:pPr>
+      <w:rPr>
+        <w:rFonts w:ascii="Courier New" w:hAnsi="Courier New" w:cs="Courier New" w:hint="default"/>
+      </w:rPr>
+    </w:lvl>
+    <w:lvl w:ilvl="8" w:tplc="041B0005" w:tentative="1">
+      <w:start w:val="1"/>
+      <w:numFmt w:val="bullet"/>
+      <w:lvlText w:val=""/>
+      <w:lvlJc w:val="left"/>
+      <w:pPr>
+        <w:ind w:left="6480" w:hanging="360"/>
+      </w:pPr>
+      <w:rPr>
+        <w:rFonts w:ascii="Wingdings" w:hAnsi="Wingdings" w:hint="default"/>
+      </w:rPr>
+    </w:lvl>
+  </w:abstractNum>
+  <w:abstractNum w:abstractNumId="44" w15:restartNumberingAfterBreak="0">
     <w:nsid w:val="680D043E"/>
     <w:multiLevelType w:val="multilevel"/>
     <w:tmpl w:val="041B001D"/>
@@ -19017,7 +21148,7 @@
       </w:pPr>
     </w:lvl>
   </w:abstractNum>
-  <w:abstractNum w:abstractNumId="40" w15:restartNumberingAfterBreak="0">
+  <w:abstractNum w:abstractNumId="45" w15:restartNumberingAfterBreak="0">
     <w:nsid w:val="68584894"/>
     <w:multiLevelType w:val="hybridMultilevel"/>
     <w:tmpl w:val="2FCE7350"/>
@@ -19229,7 +21360,156 @@
       </w:rPr>
     </w:lvl>
   </w:abstractNum>
-  <w:abstractNum w:abstractNumId="41" w15:restartNumberingAfterBreak="0">
+  <w:abstractNum w:abstractNumId="46" w15:restartNumberingAfterBreak="0">
+    <w:nsid w:val="6B8777C7"/>
+    <w:multiLevelType w:val="multilevel"/>
+    <w:tmpl w:val="AC605E90"/>
+    <w:lvl w:ilvl="0">
+      <w:start w:val="1"/>
+      <w:numFmt w:val="bullet"/>
+      <w:lvlText w:val=""/>
+      <w:lvlJc w:val="left"/>
+      <w:pPr>
+        <w:tabs>
+          <w:tab w:val="num" w:pos="720"/>
+        </w:tabs>
+        <w:ind w:left="720" w:hanging="360"/>
+      </w:pPr>
+      <w:rPr>
+        <w:rFonts w:ascii="Symbol" w:hAnsi="Symbol" w:hint="default"/>
+        <w:sz w:val="20"/>
+      </w:rPr>
+    </w:lvl>
+    <w:lvl w:ilvl="1" w:tentative="1">
+      <w:start w:val="1"/>
+      <w:numFmt w:val="bullet"/>
+      <w:lvlText w:val="o"/>
+      <w:lvlJc w:val="left"/>
+      <w:pPr>
+        <w:tabs>
+          <w:tab w:val="num" w:pos="1440"/>
+        </w:tabs>
+        <w:ind w:left="1440" w:hanging="360"/>
+      </w:pPr>
+      <w:rPr>
+        <w:rFonts w:ascii="Courier New" w:hAnsi="Courier New" w:hint="default"/>
+        <w:sz w:val="20"/>
+      </w:rPr>
+    </w:lvl>
+    <w:lvl w:ilvl="2" w:tentative="1">
+      <w:start w:val="1"/>
+      <w:numFmt w:val="bullet"/>
+      <w:lvlText w:val=""/>
+      <w:lvlJc w:val="left"/>
+      <w:pPr>
+        <w:tabs>
+          <w:tab w:val="num" w:pos="2160"/>
+        </w:tabs>
+        <w:ind w:left="2160" w:hanging="360"/>
+      </w:pPr>
+      <w:rPr>
+        <w:rFonts w:ascii="Wingdings" w:hAnsi="Wingdings" w:hint="default"/>
+        <w:sz w:val="20"/>
+      </w:rPr>
+    </w:lvl>
+    <w:lvl w:ilvl="3" w:tentative="1">
+      <w:start w:val="1"/>
+      <w:numFmt w:val="bullet"/>
+      <w:lvlText w:val=""/>
+      <w:lvlJc w:val="left"/>
+      <w:pPr>
+        <w:tabs>
+          <w:tab w:val="num" w:pos="2880"/>
+        </w:tabs>
+        <w:ind w:left="2880" w:hanging="360"/>
+      </w:pPr>
+      <w:rPr>
+        <w:rFonts w:ascii="Wingdings" w:hAnsi="Wingdings" w:hint="default"/>
+        <w:sz w:val="20"/>
+      </w:rPr>
+    </w:lvl>
+    <w:lvl w:ilvl="4" w:tentative="1">
+      <w:start w:val="1"/>
+      <w:numFmt w:val="bullet"/>
+      <w:lvlText w:val=""/>
+      <w:lvlJc w:val="left"/>
+      <w:pPr>
+        <w:tabs>
+          <w:tab w:val="num" w:pos="3600"/>
+        </w:tabs>
+        <w:ind w:left="3600" w:hanging="360"/>
+      </w:pPr>
+      <w:rPr>
+        <w:rFonts w:ascii="Wingdings" w:hAnsi="Wingdings" w:hint="default"/>
+        <w:sz w:val="20"/>
+      </w:rPr>
+    </w:lvl>
+    <w:lvl w:ilvl="5" w:tentative="1">
+      <w:start w:val="1"/>
+      <w:numFmt w:val="bullet"/>
+      <w:lvlText w:val=""/>
+      <w:lvlJc w:val="left"/>
+      <w:pPr>
+        <w:tabs>
+          <w:tab w:val="num" w:pos="4320"/>
+        </w:tabs>
+        <w:ind w:left="4320" w:hanging="360"/>
+      </w:pPr>
+      <w:rPr>
+        <w:rFonts w:ascii="Wingdings" w:hAnsi="Wingdings" w:hint="default"/>
+        <w:sz w:val="20"/>
+      </w:rPr>
+    </w:lvl>
+    <w:lvl w:ilvl="6" w:tentative="1">
+      <w:start w:val="1"/>
+      <w:numFmt w:val="bullet"/>
+      <w:lvlText w:val=""/>
+      <w:lvlJc w:val="left"/>
+      <w:pPr>
+        <w:tabs>
+          <w:tab w:val="num" w:pos="5040"/>
+        </w:tabs>
+        <w:ind w:left="5040" w:hanging="360"/>
+      </w:pPr>
+      <w:rPr>
+        <w:rFonts w:ascii="Wingdings" w:hAnsi="Wingdings" w:hint="default"/>
+        <w:sz w:val="20"/>
+      </w:rPr>
+    </w:lvl>
+    <w:lvl w:ilvl="7" w:tentative="1">
+      <w:start w:val="1"/>
+      <w:numFmt w:val="bullet"/>
+      <w:lvlText w:val=""/>
+      <w:lvlJc w:val="left"/>
+      <w:pPr>
+        <w:tabs>
+          <w:tab w:val="num" w:pos="5760"/>
+        </w:tabs>
+        <w:ind w:left="5760" w:hanging="360"/>
+      </w:pPr>
+      <w:rPr>
+        <w:rFonts w:ascii="Wingdings" w:hAnsi="Wingdings" w:hint="default"/>
+        <w:sz w:val="20"/>
+      </w:rPr>
+    </w:lvl>
+    <w:lvl w:ilvl="8" w:tentative="1">
+      <w:start w:val="1"/>
+      <w:numFmt w:val="bullet"/>
+      <w:lvlText w:val=""/>
+      <w:lvlJc w:val="left"/>
+      <w:pPr>
+        <w:tabs>
+          <w:tab w:val="num" w:pos="6480"/>
+        </w:tabs>
+        <w:ind w:left="6480" w:hanging="360"/>
+      </w:pPr>
+      <w:rPr>
+        <w:rFonts w:ascii="Wingdings" w:hAnsi="Wingdings" w:hint="default"/>
+        <w:sz w:val="20"/>
+      </w:rPr>
+    </w:lvl>
+  </w:abstractNum>
+  <w:abstractNum w:abstractNumId="47" w15:restartNumberingAfterBreak="0">
     <w:nsid w:val="72784605"/>
     <w:multiLevelType w:val="hybridMultilevel"/>
     <w:tmpl w:val="E0885FF6"/>
@@ -19342,7 +21622,7 @@
       </w:rPr>
     </w:lvl>
   </w:abstractNum>
-  <w:abstractNum w:abstractNumId="42" w15:restartNumberingAfterBreak="0">
+  <w:abstractNum w:abstractNumId="48" w15:restartNumberingAfterBreak="0">
     <w:nsid w:val="769E5696"/>
     <w:multiLevelType w:val="multilevel"/>
     <w:tmpl w:val="0798A534"/>
@@ -19491,7 +21771,7 @@
       </w:rPr>
     </w:lvl>
   </w:abstractNum>
-  <w:abstractNum w:abstractNumId="43" w15:restartNumberingAfterBreak="0">
+  <w:abstractNum w:abstractNumId="49" w15:restartNumberingAfterBreak="0">
     <w:nsid w:val="78604AE5"/>
     <w:multiLevelType w:val="multilevel"/>
     <w:tmpl w:val="11B49478"/>
@@ -19640,7 +21920,7 @@
       </w:rPr>
     </w:lvl>
   </w:abstractNum>
-  <w:abstractNum w:abstractNumId="44" w15:restartNumberingAfterBreak="0">
+  <w:abstractNum w:abstractNumId="50" w15:restartNumberingAfterBreak="0">
     <w:nsid w:val="7ACD5055"/>
     <w:multiLevelType w:val="multilevel"/>
     <w:tmpl w:val="0652F72C"/>
@@ -19790,7 +22070,7 @@
     </w:lvl>
   </w:abstractNum>
   <w:num w:numId="1" w16cid:durableId="1860385118">
-    <w:abstractNumId w:val="27"/>
+    <w:abstractNumId w:val="29"/>
   </w:num>
   <w:num w:numId="2" w16cid:durableId="975182117">
     <w:abstractNumId w:val="8"/>
@@ -19820,13 +22100,13 @@
     <w:abstractNumId w:val="24"/>
   </w:num>
   <w:num w:numId="11" w16cid:durableId="1508253165">
-    <w:abstractNumId w:val="31"/>
+    <w:abstractNumId w:val="33"/>
   </w:num>
   <w:num w:numId="12" w16cid:durableId="84309800">
     <w:abstractNumId w:val="19"/>
   </w:num>
   <w:num w:numId="13" w16cid:durableId="907962592">
-    <w:abstractNumId w:val="25"/>
+    <w:abstractNumId w:val="26"/>
   </w:num>
   <w:num w:numId="14" w16cid:durableId="229269774">
     <w:abstractNumId w:val="9"/>
@@ -19844,22 +22124,22 @@
     <w:abstractNumId w:val="4"/>
   </w:num>
   <w:num w:numId="19" w16cid:durableId="274409904">
-    <w:abstractNumId w:val="35"/>
+    <w:abstractNumId w:val="38"/>
   </w:num>
   <w:num w:numId="20" w16cid:durableId="1500344169">
-    <w:abstractNumId w:val="36"/>
+    <w:abstractNumId w:val="39"/>
   </w:num>
   <w:num w:numId="21" w16cid:durableId="1720779952">
-    <w:abstractNumId w:val="28"/>
+    <w:abstractNumId w:val="30"/>
   </w:num>
   <w:num w:numId="22" w16cid:durableId="1078484431">
     <w:abstractNumId w:val="22"/>
   </w:num>
   <w:num w:numId="23" w16cid:durableId="895315454">
-    <w:abstractNumId w:val="41"/>
+    <w:abstractNumId w:val="47"/>
   </w:num>
   <w:num w:numId="24" w16cid:durableId="1409618063">
-    <w:abstractNumId w:val="38"/>
+    <w:abstractNumId w:val="42"/>
   </w:num>
   <w:num w:numId="25" w16cid:durableId="218982357">
     <w:abstractNumId w:val="18"/>
@@ -19868,22 +22148,22 @@
     <w:abstractNumId w:val="13"/>
   </w:num>
   <w:num w:numId="27" w16cid:durableId="2126731831">
-    <w:abstractNumId w:val="40"/>
+    <w:abstractNumId w:val="45"/>
   </w:num>
   <w:num w:numId="28" w16cid:durableId="1675649892">
-    <w:abstractNumId w:val="32"/>
+    <w:abstractNumId w:val="34"/>
   </w:num>
   <w:num w:numId="29" w16cid:durableId="1897810147">
     <w:abstractNumId w:val="21"/>
   </w:num>
   <w:num w:numId="30" w16cid:durableId="555551063">
-    <w:abstractNumId w:val="29"/>
+    <w:abstractNumId w:val="31"/>
   </w:num>
   <w:num w:numId="31" w16cid:durableId="2013141442">
-    <w:abstractNumId w:val="33"/>
+    <w:abstractNumId w:val="36"/>
   </w:num>
   <w:num w:numId="32" w16cid:durableId="1551988771">
-    <w:abstractNumId w:val="39"/>
+    <w:abstractNumId w:val="44"/>
   </w:num>
   <w:num w:numId="33" w16cid:durableId="442264679">
     <w:abstractNumId w:val="10"/>
@@ -19916,7 +22196,7 @@
     </w:lvlOverride>
   </w:num>
   <w:num w:numId="34" w16cid:durableId="1016922554">
-    <w:abstractNumId w:val="37"/>
+    <w:abstractNumId w:val="41"/>
   </w:num>
   <w:num w:numId="35" w16cid:durableId="1543983013">
     <w:abstractNumId w:val="23"/>
@@ -19958,10 +22238,10 @@
     <w:abstractNumId w:val="20"/>
   </w:num>
   <w:num w:numId="39" w16cid:durableId="730737031">
-    <w:abstractNumId w:val="43"/>
+    <w:abstractNumId w:val="49"/>
   </w:num>
   <w:num w:numId="40" w16cid:durableId="1760172934">
-    <w:abstractNumId w:val="34"/>
+    <w:abstractNumId w:val="37"/>
   </w:num>
   <w:num w:numId="41" w16cid:durableId="173306764">
     <w:abstractNumId w:val="16"/>
@@ -19973,16 +22253,16 @@
     <w:abstractNumId w:val="17"/>
   </w:num>
   <w:num w:numId="44" w16cid:durableId="556862107">
-    <w:abstractNumId w:val="26"/>
+    <w:abstractNumId w:val="27"/>
   </w:num>
   <w:num w:numId="45" w16cid:durableId="1987124752">
-    <w:abstractNumId w:val="44"/>
+    <w:abstractNumId w:val="50"/>
   </w:num>
   <w:num w:numId="46" w16cid:durableId="682360857">
-    <w:abstractNumId w:val="42"/>
+    <w:abstractNumId w:val="48"/>
   </w:num>
   <w:num w:numId="47" w16cid:durableId="1779138436">
-    <w:abstractNumId w:val="30"/>
+    <w:abstractNumId w:val="32"/>
   </w:num>
   <w:num w:numId="48" w16cid:durableId="88890322">
     <w:abstractNumId w:val="10"/>
@@ -20013,6 +22293,24 @@
     <w:lvlOverride w:ilvl="8">
       <w:startOverride w:val="1"/>
     </w:lvlOverride>
+  </w:num>
+  <w:num w:numId="49" w16cid:durableId="1783331803">
+    <w:abstractNumId w:val="35"/>
+  </w:num>
+  <w:num w:numId="50" w16cid:durableId="1530295287">
+    <w:abstractNumId w:val="43"/>
+  </w:num>
+  <w:num w:numId="51" w16cid:durableId="408619706">
+    <w:abstractNumId w:val="40"/>
+  </w:num>
+  <w:num w:numId="52" w16cid:durableId="304746191">
+    <w:abstractNumId w:val="46"/>
+  </w:num>
+  <w:num w:numId="53" w16cid:durableId="1682584430">
+    <w:abstractNumId w:val="28"/>
+  </w:num>
+  <w:num w:numId="54" w16cid:durableId="510336347">
+    <w:abstractNumId w:val="25"/>
   </w:num>
 </w:numbering>
 </file>
@@ -20612,7 +22910,6 @@
   <w:style w:type="character" w:default="1" w:styleId="Predvolenpsmoodseku">
     <w:name w:val="Default Paragraph Font"/>
     <w:uiPriority w:val="1"/>
-    <w:semiHidden/>
     <w:unhideWhenUsed/>
   </w:style>
   <w:style w:type="table" w:default="1" w:styleId="Normlnatabuka">

</xml_diff>